<commit_message>
Update agent metadata and problem tracker document
Replit-Commit-Author: Agent
</commit_message>
<xml_diff>
--- a/output/problem-tracker.docx
+++ b/output/problem-tracker.docx
@@ -4,7 +4,7 @@
   <w:body>
     <w:tbl>
       <w:tblPr>
-        <w:tblW w:w="8800" w:type="dxa"/>
+        <w:tblW w:w="9200" w:type="dxa"/>
         <w:tblLayout w:type="fixed"/>
         <w:tblBorders>
           <w:top w:val="single" w:sz="8" w:space="0" w:color="808080"/>
@@ -16,20 +16,18 @@
         </w:tblBorders>
       </w:tblPr>
       <w:tblGrid>
-        <w:gridCol w:w="1400"/>
-        <w:gridCol w:w="5000"/>
-        <w:gridCol w:w="2400"/>
+        <w:gridCol w:w="1200"/>
+        <w:gridCol w:w="4300"/>
+        <w:gridCol w:w="2200"/>
+        <w:gridCol w:w="1500"/>
       </w:tblGrid>
       <w:tr>
         <w:tc>
           <w:tcPr>
-            <w:tcW w:w="1400" w:type="dxa"/>
+            <w:tcW w:w="1200" w:type="dxa"/>
             <w:shd w:fill="E7E6E6"/>
           </w:tcPr>
           <w:p>
-            <w:pPr>
-              <w:jc w:val="left"/>
-            </w:pPr>
             <w:r>
               <w:rPr>
                 <w:b/>
@@ -40,13 +38,10 @@
         </w:tc>
         <w:tc>
           <w:tcPr>
-            <w:tcW w:w="5000" w:type="dxa"/>
+            <w:tcW w:w="4300" w:type="dxa"/>
             <w:shd w:fill="E7E6E6"/>
           </w:tcPr>
           <w:p>
-            <w:pPr>
-              <w:jc w:val="left"/>
-            </w:pPr>
             <w:r>
               <w:rPr>
                 <w:b/>
@@ -57,13 +52,10 @@
         </w:tc>
         <w:tc>
           <w:tcPr>
-            <w:tcW w:w="2400" w:type="dxa"/>
+            <w:tcW w:w="2200" w:type="dxa"/>
             <w:shd w:fill="E7E6E6"/>
           </w:tcPr>
           <w:p>
-            <w:pPr>
-              <w:jc w:val="left"/>
-            </w:pPr>
             <w:r>
               <w:rPr>
                 <w:b/>
@@ -72,40 +64,56 @@
             </w:r>
           </w:p>
         </w:tc>
+        <w:tc>
+          <w:tcPr>
+            <w:tcW w:w="1500" w:type="dxa"/>
+            <w:shd w:fill="E7E6E6"/>
+          </w:tcPr>
+          <w:p>
+            <w:r>
+              <w:rPr>
+                <w:b/>
+              </w:rPr>
+              <w:t xml:space="preserve">severity score</w:t>
+            </w:r>
+          </w:p>
+        </w:tc>
       </w:tr>
       <w:tr>
         <w:tc>
           <w:tcPr>
-            <w:tcW w:w="1400" w:type="dxa"/>
+            <w:tcW w:w="1200" w:type="dxa"/>
           </w:tcPr>
-          <w:p>
-            <w:pPr>
-              <w:jc w:val="left"/>
-            </w:pPr>
-          </w:p>
+          <w:p/>
         </w:tc>
         <w:tc>
           <w:tcPr>
-            <w:tcW w:w="5000" w:type="dxa"/>
+            <w:tcW w:w="4300" w:type="dxa"/>
           </w:tcPr>
-          <w:p>
-            <w:pPr>
-              <w:jc w:val="left"/>
-            </w:pPr>
-          </w:p>
+          <w:p/>
         </w:tc>
         <w:tc>
           <w:tcPr>
-            <w:tcW w:w="2400" w:type="dxa"/>
+            <w:tcW w:w="2200" w:type="dxa"/>
           </w:tcPr>
-          <w:p>
-            <w:pPr>
-              <w:jc w:val="left"/>
-            </w:pPr>
-          </w:p>
+          <w:p/>
+        </w:tc>
+        <w:tc>
+          <w:tcPr>
+            <w:tcW w:w="1500" w:type="dxa"/>
+          </w:tcPr>
+          <w:p/>
         </w:tc>
       </w:tr>
     </w:tbl>
+    <w:p>
+      <w:r>
+        <w:rPr>
+          <w:i/>
+        </w:rPr>
+        <w:t>Current audit scope: severity scores 1–6. Scores 7–10 will be addressed later.</w:t>
+      </w:r>
+    </w:p>
     <w:sectPr>
       <w:pgSz w:w="11906" w:h="16838"/>
       <w:pgMar w:top="1080" w:right="1080" w:bottom="1080" w:left="1080" w:header="720" w:footer="720" w:gutter="0"/>

</xml_diff>

<commit_message>
Automate problem tracker entries with new script
Replit-Commit-Author: Agent
</commit_message>
<xml_diff>
--- a/output/problem-tracker.docx
+++ b/output/problem-tracker.docx
@@ -118,7 +118,7 @@
           </w:tcPr>
           <w:p>
             <w:r>
-              <w:t xml:space="preserve">Transaction breakdown finalization: POST /api/transactions/:id/breakdown maps async enrichTransaction(...) without await Promise.all. The response can contain unresolved Promise objects instead of created transaction records, breaking the post-submit flow.</w:t>
+              <w:t xml:space="preserve">Production audit confirmed: POST /api/transactions/:id/breakdown in export/backend/src/routes/transactions.ts builds enriched with result.inserted.map(...) but does not await Promise.all. The 201 response serializes Promise objects instead of transaction records; TransactionBreakdownSheet expects result.transactions as records and the post-submit flow can crash or render invalid data.</w:t>
             </w:r>
           </w:p>
         </w:tc>
@@ -151,31 +151,31 @@
           </w:tcPr>
           <w:p>
             <w:r>
-              <w:t xml:space="preserve">Audit extended-swipe deletion: touch handlers, row unmount timing, mutation queue behavior, and the 204 response path.</w:t>
-            </w:r>
-          </w:p>
-        </w:tc>
-      </w:tr>
-      <w:tr>
-        <w:tc>
-          <w:tcPr>
-            <w:tcW w:w="650" w:type="dxa"/>
-            <w:vAlign w:val="top"/>
-          </w:tcPr>
-          <w:p>
-            <w:r>
-              <w:t xml:space="preserve">2</w:t>
-            </w:r>
-          </w:p>
-        </w:tc>
-        <w:tc>
-          <w:tcPr>
-            <w:tcW w:w="4300" w:type="dxa"/>
-            <w:vAlign w:val="top"/>
-          </w:tcPr>
-          <w:p>
-            <w:r>
-              <w:t xml:space="preserve">Extended-swipe deletion: the row is translated off-screen and onDelete() fires immediately, but no failure callback restores the row. A hanging or failed DELETE leaves the row inaccessible, while the mutation in-flight guard can block later delete actions.</w:t>
+              <w:t xml:space="preserve">Wrap the enrichment map in await Promise.all(...) and add a route regression test asserting that every returned transaction is a resolved record.</w:t>
+            </w:r>
+          </w:p>
+        </w:tc>
+      </w:tr>
+      <w:tr>
+        <w:tc>
+          <w:tcPr>
+            <w:tcW w:w="650" w:type="dxa"/>
+            <w:vAlign w:val="top"/>
+          </w:tcPr>
+          <w:p>
+            <w:r>
+              <w:t xml:space="preserve">2</w:t>
+            </w:r>
+          </w:p>
+        </w:tc>
+        <w:tc>
+          <w:tcPr>
+            <w:tcW w:w="4300" w:type="dxa"/>
+            <w:vAlign w:val="top"/>
+          </w:tcPr>
+          <w:p>
+            <w:r>
+              <w:t xml:space="preserve">Production audit confirmed in export/frontend/src/pages/HomeSpending.tsx: SwipeableTxRow translates the row off-screen and calls onDelete() immediately on a full-left swipe. The parent remove mutation only invalidates queries after DELETE resolves; no failure rollback or timeout exists, so a failed or hanging request can leave the row hidden while the mutation in-flight guard blocks subsequent delete taps. onTouchCancel() also exits without resetting the offset/snap state.</w:t>
             </w:r>
           </w:p>
         </w:tc>
@@ -208,7 +208,7 @@
           </w:tcPr>
           <w:p>
             <w:r>
-              <w:t xml:space="preserve">Audit touch-cancel and vertical-scroll interruption paths for offsets or timers that remain active after the gesture ends.</w:t>
+              <w:t xml:space="preserve">Keep a pending/delete state, restore the row on error or timeout, and reset swipe state in failure/cancel paths; test full-swipe success, network failure, and a hanging DELETE.</w:t>
             </w:r>
           </w:p>
         </w:tc>
@@ -232,40 +232,40 @@
           </w:tcPr>
           <w:p>
             <w:r>
-              <w:t xml:space="preserve">Swipe cancellation: onTouchCancel() clears the long-press timer but does not reset the row offset or snap state. A browser-cancelled gesture after horizontal movement can leave a transaction row partially or fully translated and apparently frozen.</w:t>
-            </w:r>
-          </w:p>
-        </w:tc>
-        <w:tc>
-          <w:tcPr>
-            <w:tcW w:w="1300" w:type="dxa"/>
-            <w:vAlign w:val="top"/>
-          </w:tcPr>
-          <w:p>
-            <w:r>
-              <w:t xml:space="preserve">pending</w:t>
-            </w:r>
-          </w:p>
-        </w:tc>
-        <w:tc>
-          <w:tcPr>
-            <w:tcW w:w="850" w:type="dxa"/>
-            <w:vAlign w:val="top"/>
-          </w:tcPr>
-          <w:p>
-            <w:r>
-              <w:t xml:space="preserve">2</w:t>
-            </w:r>
-          </w:p>
-        </w:tc>
-        <w:tc>
-          <w:tcPr>
-            <w:tcW w:w="2100" w:type="dxa"/>
-            <w:vAlign w:val="top"/>
-          </w:tcPr>
-          <w:p>
-            <w:r>
-              <w:t xml:space="preserve">Audit tx-swipe-open coordination and snap animation timers across multiple rows for stale event state or out-of-order transitions.</w:t>
+              <w:t xml:space="preserve">Production audit confirmed in export/frontend/src/pages/HomeSpending.tsx: SwipeableTxRow.onTouchCancel() sets isDragging false and clears only the long-press timer. It does not reset offset/currentOffset, snappedRef, or the animating state, so a browser-cancelled horizontal gesture can leave a row partially or fully translated and apparently frozen.</w:t>
+            </w:r>
+          </w:p>
+        </w:tc>
+        <w:tc>
+          <w:tcPr>
+            <w:tcW w:w="1300" w:type="dxa"/>
+            <w:vAlign w:val="top"/>
+          </w:tcPr>
+          <w:p>
+            <w:r>
+              <w:t xml:space="preserve">pending</w:t>
+            </w:r>
+          </w:p>
+        </w:tc>
+        <w:tc>
+          <w:tcPr>
+            <w:tcW w:w="850" w:type="dxa"/>
+            <w:vAlign w:val="top"/>
+          </w:tcPr>
+          <w:p>
+            <w:r>
+              <w:t xml:space="preserve">2</w:t>
+            </w:r>
+          </w:p>
+        </w:tc>
+        <w:tc>
+          <w:tcPr>
+            <w:tcW w:w="2100" w:type="dxa"/>
+            <w:vAlign w:val="top"/>
+          </w:tcPr>
+          <w:p>
+            <w:r>
+              <w:t xml:space="preserve">Make cancellation restore the current snap or closed position and clear all gesture state; cover touchcancel after horizontal movement and vertical-scroll interruption.</w:t>
             </w:r>
           </w:p>
         </w:tc>
@@ -289,40 +289,40 @@
           </w:tcPr>
           <w:p>
             <w:r>
-              <w:t xml:space="preserve">Swipe animation timing: snapTo() starts a new 340 ms setTimeout on every snap without cancelling the prior timer. Rapid gestures can let an old callback turn animation off during a newer transition, producing stale row state and unreliable swipe interaction.</w:t>
-            </w:r>
-          </w:p>
-        </w:tc>
-        <w:tc>
-          <w:tcPr>
-            <w:tcW w:w="1300" w:type="dxa"/>
-            <w:vAlign w:val="top"/>
-          </w:tcPr>
-          <w:p>
-            <w:r>
-              <w:t xml:space="preserve">pending</w:t>
-            </w:r>
-          </w:p>
-        </w:tc>
-        <w:tc>
-          <w:tcPr>
-            <w:tcW w:w="850" w:type="dxa"/>
-            <w:vAlign w:val="top"/>
-          </w:tcPr>
-          <w:p>
-            <w:r>
-              <w:t xml:space="preserve">2</w:t>
-            </w:r>
-          </w:p>
-        </w:tc>
-        <w:tc>
-          <w:tcPr>
-            <w:tcW w:w="2100" w:type="dxa"/>
-            <w:vAlign w:val="top"/>
-          </w:tcPr>
-          <w:p>
-            <w:r>
-              <w:t xml:space="preserve">Audit transaction-list rendering and DELETE response handling for stale rows, blocked refreshes, or mutations that never release their in-flight guard.</w:t>
+              <w:t xml:space="preserve">Production audit confirmed in export/frontend/src/pages/HomeSpending.tsx: SwipeableTxRow.snapTo() starts a new 340 ms setTimeout on every snap and stores no timer handle for cancellation. Rapid gestures or tx-swipe-open events can let an older callback turn animation off during a newer transition, producing stale row state and unreliable swipe interaction.</w:t>
+            </w:r>
+          </w:p>
+        </w:tc>
+        <w:tc>
+          <w:tcPr>
+            <w:tcW w:w="1300" w:type="dxa"/>
+            <w:vAlign w:val="top"/>
+          </w:tcPr>
+          <w:p>
+            <w:r>
+              <w:t xml:space="preserve">pending</w:t>
+            </w:r>
+          </w:p>
+        </w:tc>
+        <w:tc>
+          <w:tcPr>
+            <w:tcW w:w="850" w:type="dxa"/>
+            <w:vAlign w:val="top"/>
+          </w:tcPr>
+          <w:p>
+            <w:r>
+              <w:t xml:space="preserve">2</w:t>
+            </w:r>
+          </w:p>
+        </w:tc>
+        <w:tc>
+          <w:tcPr>
+            <w:tcW w:w="2100" w:type="dxa"/>
+            <w:vAlign w:val="top"/>
+          </w:tcPr>
+          <w:p>
+            <w:r>
+              <w:t xml:space="preserve">Store and clear the active snap timer before starting a new one, and clear it on unmount; test rapid alternating swipes and tx-swipe-open coordination.</w:t>
             </w:r>
           </w:p>
         </w:tc>
@@ -346,7 +346,7 @@
           </w:tcPr>
           <w:p>
             <w:r>
-              <w:t xml:space="preserve">Shared request timeout gap: customFetch() and apiFetch() pass requests to fetch() without an AbortController timeout or cancellation policy. A request that never resolves leaves isPending/query promises active indefinitely, so controls can stay disabled and the app can appear frozen.</w:t>
+              <w:t xml:space="preserve">Production audit confirmed a shared freeze risk: export/frontend/src/lib/api.ts, export/frontend/src/lib/api-client/custom-fetch.ts, and export/frontend/src/lib/mutation-queue.ts pass API and replay requests directly to fetch() without an AbortController timeout or cancellation policy. A request that never resolves leaves mutation/query promises active indefinitely, so controls can remain disabled and the app can appear frozen across many flows.</w:t>
             </w:r>
           </w:p>
         </w:tc>
@@ -379,7 +379,7 @@
           </w:tcPr>
           <w:p>
             <w:r>
-              <w:t xml:space="preserve">Audit direct fetch() call sites that bypass the shared request layers for their own indefinite waits, missing error handling, or stuck loading state.</w:t>
+              <w:t xml:space="preserve">Design one shared timeout/cancellation policy for interactive requests and queue replay, preserving upload-specific limits; test network hangs, retries, and loading-state release.</w:t>
             </w:r>
           </w:p>
         </w:tc>
@@ -403,40 +403,40 @@
           </w:tcPr>
           <w:p>
             <w:r>
-              <w:t xml:space="preserve">Category sharing mutations bypass CSRF: the local apiFetch() helper in Categories.tsx uses bare fetch() for POST category-share and proposal accept/reject requests. The backend csrfProtection middleware rejects these calls with HTTP 403, so the actions never complete.</w:t>
-            </w:r>
-          </w:p>
-        </w:tc>
-        <w:tc>
-          <w:tcPr>
-            <w:tcW w:w="1300" w:type="dxa"/>
-            <w:vAlign w:val="top"/>
-          </w:tcPr>
-          <w:p>
-            <w:r>
-              <w:t xml:space="preserve">pending</w:t>
-            </w:r>
-          </w:p>
-        </w:tc>
-        <w:tc>
-          <w:tcPr>
-            <w:tcW w:w="850" w:type="dxa"/>
-            <w:vAlign w:val="top"/>
-          </w:tcPr>
-          <w:p>
-            <w:r>
-              <w:t xml:space="preserve">2</w:t>
-            </w:r>
-          </w:p>
-        </w:tc>
-        <w:tc>
-          <w:tcPr>
-            <w:tcW w:w="2100" w:type="dxa"/>
-            <w:vAlign w:val="top"/>
-          </w:tcPr>
-          <w:p>
-            <w:r>
-              <w:t xml:space="preserve">Audit direct async actions for loading-state cleanup and rejected-promise handling, especially handlers that use try/finally without a catch.</w:t>
+              <w:t xml:space="preserve">Production audit confirmed in export/frontend/src/pages/Categories.tsx: the local apiFetch() helper uses bare fetch() for POST category sharing requests, while a CSRF-aware apiFetchWithCsrf import is present but unused. The backend csrfProtection middleware can reject these mutations with HTTP 403, so the sharing action never completes; the helper also has no timeout.</w:t>
+            </w:r>
+          </w:p>
+        </w:tc>
+        <w:tc>
+          <w:tcPr>
+            <w:tcW w:w="1300" w:type="dxa"/>
+            <w:vAlign w:val="top"/>
+          </w:tcPr>
+          <w:p>
+            <w:r>
+              <w:t xml:space="preserve">pending</w:t>
+            </w:r>
+          </w:p>
+        </w:tc>
+        <w:tc>
+          <w:tcPr>
+            <w:tcW w:w="850" w:type="dxa"/>
+            <w:vAlign w:val="top"/>
+          </w:tcPr>
+          <w:p>
+            <w:r>
+              <w:t xml:space="preserve">2</w:t>
+            </w:r>
+          </w:p>
+        </w:tc>
+        <w:tc>
+          <w:tcPr>
+            <w:tcW w:w="2100" w:type="dxa"/>
+            <w:vAlign w:val="top"/>
+          </w:tcPr>
+          <w:p>
+            <w:r>
+              <w:t xml:space="preserve">Route every category-sharing mutation through the shared CSRF-aware helper, remove the duplicate bare fetch wrapper, and add success/403/network-failure coverage with loading-state release.</w:t>
             </w:r>
           </w:p>
         </w:tc>
@@ -460,40 +460,268 @@
           </w:tcPr>
           <w:p>
             <w:r>
-              <w:t xml:space="preserve">Household async-action error handling: accept/decline split, Great Larder approve/reject, and head-request approve/decline handlers use try/finally without catch. A network/API rejection resets loading but escapes as an unhandled promise rejection with no user-facing error.</w:t>
-            </w:r>
-          </w:p>
-        </w:tc>
-        <w:tc>
-          <w:tcPr>
-            <w:tcW w:w="1300" w:type="dxa"/>
-            <w:vAlign w:val="top"/>
-          </w:tcPr>
-          <w:p>
-            <w:r>
-              <w:t xml:space="preserve">pending</w:t>
-            </w:r>
-          </w:p>
-        </w:tc>
-        <w:tc>
-          <w:tcPr>
-            <w:tcW w:w="850" w:type="dxa"/>
-            <w:vAlign w:val="top"/>
-          </w:tcPr>
-          <w:p>
-            <w:r>
-              <w:t xml:space="preserve">2</w:t>
-            </w:r>
-          </w:p>
-        </w:tc>
-        <w:tc>
-          <w:tcPr>
-            <w:tcW w:w="2100" w:type="dxa"/>
-            <w:vAlign w:val="top"/>
-          </w:tcPr>
-          <w:p>
-            <w:r>
-              <w:t xml:space="preserve">Audit backend routes for promise arrays and fire-and-forget async work that can return malformed responses, reject after send, or crash the process.</w:t>
+              <w:t xml:space="preserve">Production audit confirmed in export/frontend/src/pages/Household.tsx: split accept/decline, Great Larder approve/reject, and head-request approve/decline handlers use try/finally without catch. A network or API rejection resets the loading state but escapes as an unhandled promise rejection with no user-facing error or reliable refresh.</w:t>
+            </w:r>
+          </w:p>
+        </w:tc>
+        <w:tc>
+          <w:tcPr>
+            <w:tcW w:w="1300" w:type="dxa"/>
+            <w:vAlign w:val="top"/>
+          </w:tcPr>
+          <w:p>
+            <w:r>
+              <w:t xml:space="preserve">pending</w:t>
+            </w:r>
+          </w:p>
+        </w:tc>
+        <w:tc>
+          <w:tcPr>
+            <w:tcW w:w="850" w:type="dxa"/>
+            <w:vAlign w:val="top"/>
+          </w:tcPr>
+          <w:p>
+            <w:r>
+              <w:t xml:space="preserve">2</w:t>
+            </w:r>
+          </w:p>
+        </w:tc>
+        <w:tc>
+          <w:tcPr>
+            <w:tcW w:w="2100" w:type="dxa"/>
+            <w:vAlign w:val="top"/>
+          </w:tcPr>
+          <w:p>
+            <w:r>
+              <w:t xml:space="preserve">Add catch/toast handling to each household action, check response status before refreshing, and cover rejection paths to verify loading flags always release without unhandled promises.</w:t>
+            </w:r>
+          </w:p>
+        </w:tc>
+      </w:tr>
+      <w:tr>
+        <w:tc>
+          <w:tcPr>
+            <w:tcW w:w="650" w:type="dxa"/>
+            <w:vAlign w:val="top"/>
+          </w:tcPr>
+          <w:p>
+            <w:r>
+              <w:t xml:space="preserve">8</w:t>
+            </w:r>
+          </w:p>
+        </w:tc>
+        <w:tc>
+          <w:tcPr>
+            <w:tcW w:w="4300" w:type="dxa"/>
+            <w:vAlign w:val="top"/>
+          </w:tcPr>
+          <w:p>
+            <w:r>
+              <w:t xml:space="preserve">Goal create-and-propose error handling: export/frontend/src/pages/Goals.tsx awaits the household proposal POST inside the create mutation onSuccess callback with finally but no catch. If the goal is created but the proposal request fails, proposing state resets but the rejection escapes without user-facing feedback.</w:t>
+            </w:r>
+          </w:p>
+        </w:tc>
+        <w:tc>
+          <w:tcPr>
+            <w:tcW w:w="1300" w:type="dxa"/>
+            <w:vAlign w:val="top"/>
+          </w:tcPr>
+          <w:p>
+            <w:r>
+              <w:t xml:space="preserve">pending</w:t>
+            </w:r>
+          </w:p>
+        </w:tc>
+        <w:tc>
+          <w:tcPr>
+            <w:tcW w:w="850" w:type="dxa"/>
+            <w:vAlign w:val="top"/>
+          </w:tcPr>
+          <w:p>
+            <w:r>
+              <w:t xml:space="preserve">2</w:t>
+            </w:r>
+          </w:p>
+        </w:tc>
+        <w:tc>
+          <w:tcPr>
+            <w:tcW w:w="2100" w:type="dxa"/>
+            <w:vAlign w:val="top"/>
+          </w:tcPr>
+          <w:p>
+            <w:r>
+              <w:t xml:space="preserve">Catch and surface proposal failure separately from goal creation, keep the created goal visible, and test proposal network/4xx rejection paths.</w:t>
+            </w:r>
+          </w:p>
+        </w:tc>
+      </w:tr>
+      <w:tr>
+        <w:tc>
+          <w:tcPr>
+            <w:tcW w:w="650" w:type="dxa"/>
+            <w:vAlign w:val="top"/>
+          </w:tcPr>
+          <w:p>
+            <w:r>
+              <w:t xml:space="preserve">9</w:t>
+            </w:r>
+          </w:p>
+        </w:tc>
+        <w:tc>
+          <w:tcPr>
+            <w:tcW w:w="4300" w:type="dxa"/>
+            <w:vAlign w:val="top"/>
+          </w:tcPr>
+          <w:p>
+            <w:r>
+              <w:t xml:space="preserve">Member role-save error handling: export/frontend/src/pages/Household.tsx awaits updateMemberRole.mutateAsync() inside MemberSheet.handleRoleSave() with finally but no catch. A rejected role update resets the local saving flag but escapes without user-facing feedback or a clear recovery path.</w:t>
+            </w:r>
+          </w:p>
+        </w:tc>
+        <w:tc>
+          <w:tcPr>
+            <w:tcW w:w="1300" w:type="dxa"/>
+            <w:vAlign w:val="top"/>
+          </w:tcPr>
+          <w:p>
+            <w:r>
+              <w:t xml:space="preserve">pending</w:t>
+            </w:r>
+          </w:p>
+        </w:tc>
+        <w:tc>
+          <w:tcPr>
+            <w:tcW w:w="850" w:type="dxa"/>
+            <w:vAlign w:val="top"/>
+          </w:tcPr>
+          <w:p>
+            <w:r>
+              <w:t xml:space="preserve">2</w:t>
+            </w:r>
+          </w:p>
+        </w:tc>
+        <w:tc>
+          <w:tcPr>
+            <w:tcW w:w="2100" w:type="dxa"/>
+            <w:vAlign w:val="top"/>
+          </w:tcPr>
+          <w:p>
+            <w:r>
+              <w:t xml:space="preserve">Catch the mutation rejection, keep the sheet open, and show an actionable error; test permission, network, and stale-session failures.</w:t>
+            </w:r>
+          </w:p>
+        </w:tc>
+      </w:tr>
+      <w:tr>
+        <w:tc>
+          <w:tcPr>
+            <w:tcW w:w="650" w:type="dxa"/>
+            <w:vAlign w:val="top"/>
+          </w:tcPr>
+          <w:p>
+            <w:r>
+              <w:t xml:space="preserve">10</w:t>
+            </w:r>
+          </w:p>
+        </w:tc>
+        <w:tc>
+          <w:tcPr>
+            <w:tcW w:w="4300" w:type="dxa"/>
+            <w:vAlign w:val="top"/>
+          </w:tcPr>
+          <w:p>
+            <w:r>
+              <w:t xml:space="preserve">Split-submit error handling: export/frontend/src/pages/HomeSpending.tsx wraps the POST /api/splits request in try/finally but has no catch. HTTP errors are converted to the modal error, but a network rejection escapes as an unhandled promise and does not populate the error state for the user.</w:t>
+            </w:r>
+          </w:p>
+        </w:tc>
+        <w:tc>
+          <w:tcPr>
+            <w:tcW w:w="1300" w:type="dxa"/>
+            <w:vAlign w:val="top"/>
+          </w:tcPr>
+          <w:p>
+            <w:r>
+              <w:t xml:space="preserve">pending</w:t>
+            </w:r>
+          </w:p>
+        </w:tc>
+        <w:tc>
+          <w:tcPr>
+            <w:tcW w:w="850" w:type="dxa"/>
+            <w:vAlign w:val="top"/>
+          </w:tcPr>
+          <w:p>
+            <w:r>
+              <w:t xml:space="preserve">2</w:t>
+            </w:r>
+          </w:p>
+        </w:tc>
+        <w:tc>
+          <w:tcPr>
+            <w:tcW w:w="2100" w:type="dxa"/>
+            <w:vAlign w:val="top"/>
+          </w:tcPr>
+          <w:p>
+            <w:r>
+              <w:t xml:space="preserve">Catch network and parsing failures, set the split modal error, and verify the loading flag releases for HTTP, offline, and rejected-fetch paths.</w:t>
+            </w:r>
+          </w:p>
+        </w:tc>
+      </w:tr>
+      <w:tr>
+        <w:tc>
+          <w:tcPr>
+            <w:tcW w:w="650" w:type="dxa"/>
+            <w:vAlign w:val="top"/>
+          </w:tcPr>
+          <w:p>
+            <w:r>
+              <w:t xml:space="preserve">11</w:t>
+            </w:r>
+          </w:p>
+        </w:tc>
+        <w:tc>
+          <w:tcPr>
+            <w:tcW w:w="4300" w:type="dxa"/>
+            <w:vAlign w:val="top"/>
+          </w:tcPr>
+          <w:p>
+            <w:r>
+              <w:t xml:space="preserve">Household deletion error handling: export/frontend/src/pages/Household.tsx awaits DELETE /api/households inside handleDeleteHousehold() with finally but no catch. A rejected request only clears the deleting flag; the confirmation dialog remains open without an explanation and the rejection becomes unhandled.</w:t>
+            </w:r>
+          </w:p>
+        </w:tc>
+        <w:tc>
+          <w:tcPr>
+            <w:tcW w:w="1300" w:type="dxa"/>
+            <w:vAlign w:val="top"/>
+          </w:tcPr>
+          <w:p>
+            <w:r>
+              <w:t xml:space="preserve">pending</w:t>
+            </w:r>
+          </w:p>
+        </w:tc>
+        <w:tc>
+          <w:tcPr>
+            <w:tcW w:w="850" w:type="dxa"/>
+            <w:vAlign w:val="top"/>
+          </w:tcPr>
+          <w:p>
+            <w:r>
+              <w:t xml:space="preserve">2</w:t>
+            </w:r>
+          </w:p>
+        </w:tc>
+        <w:tc>
+          <w:tcPr>
+            <w:tcW w:w="2100" w:type="dxa"/>
+            <w:vAlign w:val="top"/>
+          </w:tcPr>
+          <w:p>
+            <w:r>
+              <w:t xml:space="preserve">Catch and surface deletion failures, preserve the confirmation state, and test server rejection, offline, and successful cache-clearing paths.</w:t>
             </w:r>
           </w:p>
         </w:tc>

</xml_diff>

<commit_message>
Update and back up problem tracker documents
Replit-Commit-Author: Agent
</commit_message>
<xml_diff>
--- a/output/problem-tracker.docx
+++ b/output/problem-tracker.docx
@@ -722,6 +722,405 @@
           <w:p>
             <w:r>
               <w:t xml:space="preserve">Catch and surface deletion failures, preserve the confirmation state, and test server rejection, offline, and successful cache-clearing paths.</w:t>
+            </w:r>
+          </w:p>
+        </w:tc>
+      </w:tr>
+      <w:tr>
+        <w:tc>
+          <w:tcPr>
+            <w:tcW w:w="650" w:type="dxa"/>
+            <w:vAlign w:val="top"/>
+          </w:tcPr>
+          <w:p>
+            <w:r>
+              <w:t xml:space="preserve">12</w:t>
+            </w:r>
+          </w:p>
+        </w:tc>
+        <w:tc>
+          <w:tcPr>
+            <w:tcW w:w="4300" w:type="dxa"/>
+            <w:vAlign w:val="top"/>
+          </w:tcPr>
+          <w:p>
+            <w:r>
+              <w:t xml:space="preserve">Auto-category stop-action errors: export/frontend/src/pages/Transactions.tsx and HomeSpending.tsx use unguarded async click handlers to list merchant rules and then disable a rule. A failed lookup or mutation rejects out of the click handler, leaving the popup state unresolved with no user-facing error.</w:t>
+            </w:r>
+          </w:p>
+        </w:tc>
+        <w:tc>
+          <w:tcPr>
+            <w:tcW w:w="1300" w:type="dxa"/>
+            <w:vAlign w:val="top"/>
+          </w:tcPr>
+          <w:p>
+            <w:r>
+              <w:t xml:space="preserve">pending</w:t>
+            </w:r>
+          </w:p>
+        </w:tc>
+        <w:tc>
+          <w:tcPr>
+            <w:tcW w:w="850" w:type="dxa"/>
+            <w:vAlign w:val="top"/>
+          </w:tcPr>
+          <w:p>
+            <w:r>
+              <w:t xml:space="preserve">2</w:t>
+            </w:r>
+          </w:p>
+        </w:tc>
+        <w:tc>
+          <w:tcPr>
+            <w:tcW w:w="2100" w:type="dxa"/>
+            <w:vAlign w:val="top"/>
+          </w:tcPr>
+          <w:p>
+            <w:r>
+              <w:t xml:space="preserve">Add catch/error feedback and close or preserve the prompt deliberately; test rule lookup failure, update failure, and successful disable behavior.</w:t>
+            </w:r>
+          </w:p>
+        </w:tc>
+      </w:tr>
+      <w:tr>
+        <w:tc>
+          <w:tcPr>
+            <w:tcW w:w="650" w:type="dxa"/>
+            <w:vAlign w:val="top"/>
+          </w:tcPr>
+          <w:p>
+            <w:r>
+              <w:t xml:space="preserve">13</w:t>
+            </w:r>
+          </w:p>
+        </w:tc>
+        <w:tc>
+          <w:tcPr>
+            <w:tcW w:w="4300" w:type="dxa"/>
+            <w:vAlign w:val="top"/>
+          </w:tcPr>
+          <w:p>
+            <w:r>
+              <w:t xml:space="preserve">Invite accept/decline actions: export/frontend/src/pages/Invite.tsx autoAccept(), handleAccept(), and handleDecline() set accepting/declining before awaiting CSRF/fetch/invalidation, but have no catch/finally. A rejected network, CSRF, response-body, or invalidateQueries promise leaves the page on the loading state and the autoAccept() call from the effect creates an unhandled rejection.</w:t>
+            </w:r>
+          </w:p>
+        </w:tc>
+        <w:tc>
+          <w:tcPr>
+            <w:tcW w:w="1300" w:type="dxa"/>
+            <w:vAlign w:val="top"/>
+          </w:tcPr>
+          <w:p>
+            <w:r>
+              <w:t xml:space="preserve">pending</w:t>
+            </w:r>
+          </w:p>
+        </w:tc>
+        <w:tc>
+          <w:tcPr>
+            <w:tcW w:w="850" w:type="dxa"/>
+            <w:vAlign w:val="top"/>
+          </w:tcPr>
+          <w:p>
+            <w:r>
+              <w:t xml:space="preserve">2</w:t>
+            </w:r>
+          </w:p>
+        </w:tc>
+        <w:tc>
+          <w:tcPr>
+            <w:tcW w:w="2100" w:type="dxa"/>
+            <w:vAlign w:val="top"/>
+          </w:tcPr>
+          <w:p>
+            <w:r>
+              <w:t xml:space="preserve">Wrap all invite actions in catch/finally, restore a retryable state, and surface an actionable error; await/catch auto-accept from the effect and test network, CSRF, HTTP, invalidation, accept, and decline failures.</w:t>
+            </w:r>
+          </w:p>
+        </w:tc>
+      </w:tr>
+      <w:tr>
+        <w:tc>
+          <w:tcPr>
+            <w:tcW w:w="650" w:type="dxa"/>
+            <w:vAlign w:val="top"/>
+          </w:tcPr>
+          <w:p>
+            <w:r>
+              <w:t xml:space="preserve">14</w:t>
+            </w:r>
+          </w:p>
+        </w:tc>
+        <w:tc>
+          <w:tcPr>
+            <w:tcW w:w="4300" w:type="dxa"/>
+            <w:vAlign w:val="top"/>
+          </w:tcPr>
+          <w:p>
+            <w:r>
+              <w:t xml:space="preserve">Offline mutation success callbacks: export/frontend/src/hooks/useMutationWithQueue.ts calls opts.onSuccess with void inside the offline async task. If that configured callback rejects after the queue has saved the operation, the rejection is detached from the surrounding try/catch and becomes an unhandled promise rejection; the UI may already show Saved offline while follow-up cache/navigation work failed.</w:t>
+            </w:r>
+          </w:p>
+        </w:tc>
+        <w:tc>
+          <w:tcPr>
+            <w:tcW w:w="1300" w:type="dxa"/>
+            <w:vAlign w:val="top"/>
+          </w:tcPr>
+          <w:p>
+            <w:r>
+              <w:t xml:space="preserve">pending</w:t>
+            </w:r>
+          </w:p>
+        </w:tc>
+        <w:tc>
+          <w:tcPr>
+            <w:tcW w:w="850" w:type="dxa"/>
+            <w:vAlign w:val="top"/>
+          </w:tcPr>
+          <w:p>
+            <w:r>
+              <w:t xml:space="preserve">3</w:t>
+            </w:r>
+          </w:p>
+        </w:tc>
+        <w:tc>
+          <w:tcPr>
+            <w:tcW w:w="2100" w:type="dxa"/>
+            <w:vAlign w:val="top"/>
+          </w:tcPr>
+          <w:p>
+            <w:r>
+              <w:t xml:space="preserve">Await the callback inside the queue error boundary or attach explicit rejection handling with a defined UI policy; test queued success callbacks that resolve, reject, and perform cache invalidation/navigation.</w:t>
+            </w:r>
+          </w:p>
+        </w:tc>
+      </w:tr>
+      <w:tr>
+        <w:tc>
+          <w:tcPr>
+            <w:tcW w:w="650" w:type="dxa"/>
+            <w:vAlign w:val="top"/>
+          </w:tcPr>
+          <w:p>
+            <w:r>
+              <w:t xml:space="preserve">15</w:t>
+            </w:r>
+          </w:p>
+        </w:tc>
+        <w:tc>
+          <w:tcPr>
+            <w:tcW w:w="4300" w:type="dxa"/>
+            <w:vAlign w:val="top"/>
+          </w:tcPr>
+          <w:p>
+            <w:r>
+              <w:t xml:space="preserve">PIN auto-submit timers: export/frontend/src/pages/Login.tsx handleLoginPinChange() and handleConfirmPin() schedule delayed login/register mutations without storing or cancelling the timeout. If the user backs out, changes the flow, edits/resets the PIN, or manually submits during the delay, the callback still uses captured stale credentials and can issue an unexpected or duplicate request.</w:t>
+            </w:r>
+          </w:p>
+        </w:tc>
+        <w:tc>
+          <w:tcPr>
+            <w:tcW w:w="1300" w:type="dxa"/>
+            <w:vAlign w:val="top"/>
+          </w:tcPr>
+          <w:p>
+            <w:r>
+              <w:t xml:space="preserve">pending</w:t>
+            </w:r>
+          </w:p>
+        </w:tc>
+        <w:tc>
+          <w:tcPr>
+            <w:tcW w:w="850" w:type="dxa"/>
+            <w:vAlign w:val="top"/>
+          </w:tcPr>
+          <w:p>
+            <w:r>
+              <w:t xml:space="preserve">3</w:t>
+            </w:r>
+          </w:p>
+        </w:tc>
+        <w:tc>
+          <w:tcPr>
+            <w:tcW w:w="2100" w:type="dxa"/>
+            <w:vAlign w:val="top"/>
+          </w:tcPr>
+          <w:p>
+            <w:r>
+              <w:t xml:space="preserve">Store timer handles and cancel them on screen/input changes and unmount; guard callbacks against current screen, current values, and pending mutation state; test back navigation, edits, manual submit, and rapid re-entry.</w:t>
+            </w:r>
+          </w:p>
+        </w:tc>
+      </w:tr>
+      <w:tr>
+        <w:tc>
+          <w:tcPr>
+            <w:tcW w:w="650" w:type="dxa"/>
+            <w:vAlign w:val="top"/>
+          </w:tcPr>
+          <w:p>
+            <w:r>
+              <w:t xml:space="preserve">16</w:t>
+            </w:r>
+          </w:p>
+        </w:tc>
+        <w:tc>
+          <w:tcPr>
+            <w:tcW w:w="4300" w:type="dxa"/>
+            <w:vAlign w:val="top"/>
+          </w:tcPr>
+          <w:p>
+            <w:r>
+              <w:t xml:space="preserve">Receipt upload timeout does not cancel the request: export/frontend/src/components/ReceiptManager.tsx races apiFetch() against a 60-second timeout without passing an AbortController signal. After the timeout the UI clears processing and permits retry, while the original upload can still finish and create a duplicate receipt or update server state after the user has moved on.</w:t>
+            </w:r>
+          </w:p>
+        </w:tc>
+        <w:tc>
+          <w:tcPr>
+            <w:tcW w:w="1300" w:type="dxa"/>
+            <w:vAlign w:val="top"/>
+          </w:tcPr>
+          <w:p>
+            <w:r>
+              <w:t xml:space="preserve">pending</w:t>
+            </w:r>
+          </w:p>
+        </w:tc>
+        <w:tc>
+          <w:tcPr>
+            <w:tcW w:w="850" w:type="dxa"/>
+            <w:vAlign w:val="top"/>
+          </w:tcPr>
+          <w:p>
+            <w:r>
+              <w:t xml:space="preserve">2</w:t>
+            </w:r>
+          </w:p>
+        </w:tc>
+        <w:tc>
+          <w:tcPr>
+            <w:tcW w:w="2100" w:type="dxa"/>
+            <w:vAlign w:val="top"/>
+          </w:tcPr>
+          <w:p>
+            <w:r>
+              <w:t xml:space="preserve">Use an abortable upload request and clear the timeout; distinguish cancellation from a real failure and test stalled upload, retry, late server completion, and successful upload.</w:t>
+            </w:r>
+          </w:p>
+        </w:tc>
+      </w:tr>
+      <w:tr>
+        <w:tc>
+          <w:tcPr>
+            <w:tcW w:w="650" w:type="dxa"/>
+            <w:vAlign w:val="top"/>
+          </w:tcPr>
+          <w:p>
+            <w:r>
+              <w:t xml:space="preserve">17</w:t>
+            </w:r>
+          </w:p>
+        </w:tc>
+        <w:tc>
+          <w:tcPr>
+            <w:tcW w:w="4300" w:type="dxa"/>
+            <w:vAlign w:val="top"/>
+          </w:tcPr>
+          <w:p>
+            <w:r>
+              <w:t xml:space="preserve">Category proposal accept/reject is blocked by CSRF: export/frontend/src/pages/Categories.tsx defines a local apiFetch() that calls bare fetch() for POST /category-share-proposals/:id/accept and /reject, even though the file imports the CSRF-aware helper as apiFetchWithCsrf. export/backend/src/app.ts applies csrfProtection to all non-safe /api methods, so both actions receive 403 Invalid or missing CSRF token and cannot complete.</w:t>
+            </w:r>
+          </w:p>
+        </w:tc>
+        <w:tc>
+          <w:tcPr>
+            <w:tcW w:w="1300" w:type="dxa"/>
+            <w:vAlign w:val="top"/>
+          </w:tcPr>
+          <w:p>
+            <w:r>
+              <w:t xml:space="preserve">pending</w:t>
+            </w:r>
+          </w:p>
+        </w:tc>
+        <w:tc>
+          <w:tcPr>
+            <w:tcW w:w="850" w:type="dxa"/>
+            <w:vAlign w:val="top"/>
+          </w:tcPr>
+          <w:p>
+            <w:r>
+              <w:t xml:space="preserve">2</w:t>
+            </w:r>
+          </w:p>
+        </w:tc>
+        <w:tc>
+          <w:tcPr>
+            <w:tcW w:w="2100" w:type="dxa"/>
+            <w:vAlign w:val="top"/>
+          </w:tcPr>
+          <w:p>
+            <w:r>
+              <w:t xml:space="preserve">Route the proposal mutations through the shared CSRF-aware helper, remove the duplicate wrapper, and add success, 403, network-failure, and loading-state tests.</w:t>
+            </w:r>
+          </w:p>
+        </w:tc>
+      </w:tr>
+      <w:tr>
+        <w:tc>
+          <w:tcPr>
+            <w:tcW w:w="650" w:type="dxa"/>
+            <w:vAlign w:val="top"/>
+          </w:tcPr>
+          <w:p>
+            <w:r>
+              <w:t xml:space="preserve">18</w:t>
+            </w:r>
+          </w:p>
+        </w:tc>
+        <w:tc>
+          <w:tcPr>
+            <w:tcW w:w="4300" w:type="dxa"/>
+            <w:vAlign w:val="top"/>
+          </w:tcPr>
+          <w:p>
+            <w:r>
+              <w:t xml:space="preserve">Great Larder transfer is not atomic: export/backend/src/routes/great-larder.ts POST /great-larder/send checks the personal balance, inserts a negative personal larder_entries row, and only then inserts the positive great_larder_entries row. A failure between writes loses funds without crediting the household; concurrent sends can both pass the same pre-read balance check and overspend it.</w:t>
+            </w:r>
+          </w:p>
+        </w:tc>
+        <w:tc>
+          <w:tcPr>
+            <w:tcW w:w="1300" w:type="dxa"/>
+            <w:vAlign w:val="top"/>
+          </w:tcPr>
+          <w:p>
+            <w:r>
+              <w:t xml:space="preserve">pending</w:t>
+            </w:r>
+          </w:p>
+        </w:tc>
+        <w:tc>
+          <w:tcPr>
+            <w:tcW w:w="850" w:type="dxa"/>
+            <w:vAlign w:val="top"/>
+          </w:tcPr>
+          <w:p>
+            <w:r>
+              <w:t xml:space="preserve">4</w:t>
+            </w:r>
+          </w:p>
+        </w:tc>
+        <w:tc>
+          <w:tcPr>
+            <w:tcW w:w="2100" w:type="dxa"/>
+            <w:vAlign w:val="top"/>
+          </w:tcPr>
+          <w:p>
+            <w:r>
+              <w:t xml:space="preserve">Perform the balance validation and both ledger inserts in one database transaction with concurrency-safe locking/conditional checks; test mid-transaction failure and simultaneous sends.</w:t>
             </w:r>
           </w:p>
         </w:tc>

</xml_diff>

<commit_message>
Update problem tracker and add automation script
Replit-Commit-Author: Agent
</commit_message>
<xml_diff>
--- a/output/problem-tracker.docx
+++ b/output/problem-tracker.docx
@@ -1125,19 +1125,475 @@
           </w:p>
         </w:tc>
       </w:tr>
+      <w:tr>
+        <w:tc>
+          <w:tcPr>
+            <w:tcW w:w="650" w:type="dxa"/>
+            <w:vAlign w:val="top"/>
+          </w:tcPr>
+          <w:p>
+            <w:r>
+              <w:t xml:space="preserve">19</w:t>
+            </w:r>
+          </w:p>
+        </w:tc>
+        <w:tc>
+          <w:tcPr>
+            <w:tcW w:w="4300" w:type="dxa"/>
+            <w:vAlign w:val="top"/>
+          </w:tcPr>
+          <w:p>
+            <w:r>
+              <w:t xml:space="preserve">Production audit confirmed in export/backend/src/routes/goals.ts: DELETE /goal-contributions/:id selects and deletes solely by contribution ID. It does not require contrib.userId to equal the session user or verify household/goal authorization, so any authenticated user who learns an ID can erase another user’s goal contribution; the post-response recalculation can also change the goal’s realized state and activity rows.</w:t>
+            </w:r>
+          </w:p>
+        </w:tc>
+        <w:tc>
+          <w:tcPr>
+            <w:tcW w:w="1300" w:type="dxa"/>
+            <w:vAlign w:val="top"/>
+          </w:tcPr>
+          <w:p>
+            <w:r>
+              <w:t xml:space="preserve">pending</w:t>
+            </w:r>
+          </w:p>
+        </w:tc>
+        <w:tc>
+          <w:tcPr>
+            <w:tcW w:w="850" w:type="dxa"/>
+            <w:vAlign w:val="top"/>
+          </w:tcPr>
+          <w:p>
+            <w:r>
+              <w:t xml:space="preserve">4</w:t>
+            </w:r>
+          </w:p>
+        </w:tc>
+        <w:tc>
+          <w:tcPr>
+            <w:tcW w:w="2100" w:type="dxa"/>
+            <w:vAlign w:val="top"/>
+          </w:tcPr>
+          <w:p>
+            <w:r>
+              <w:t xml:space="preserve">Require an ownership or explicit household-authorization predicate in the delete query, and perform deletion plus goal-state/activity recalculation in one authorized transaction; add cross-user and household authorization tests.</w:t>
+            </w:r>
+          </w:p>
+        </w:tc>
+      </w:tr>
+      <w:p>
+        <w:r>
+          <w:rPr>
+            <w:i/>
+          </w:rPr>
+          <w:t>Current audit scope: severity scores 1–4. Workflow items 1–6 define the audit process; severity scores 5–10 are not being used.</w:t>
+        </w:r>
+      </w:p>
+      <w:sectPr>
+        <w:pgSz w:w="11906" w:h="16838"/>
+        <w:pgMar w:top="1080" w:right="1080" w:bottom="1080" w:left="1080" w:header="720" w:footer="720" w:gutter="0"/>
+      </w:sectPr>
+      <w:tr>
+        <w:tc>
+          <w:tcPr>
+            <w:tcW w:w="650" w:type="dxa"/>
+            <w:vAlign w:val="top"/>
+          </w:tcPr>
+          <w:p>
+            <w:r>
+              <w:t xml:space="preserve">20</w:t>
+            </w:r>
+          </w:p>
+        </w:tc>
+        <w:tc>
+          <w:tcPr>
+            <w:tcW w:w="4300" w:type="dxa"/>
+            <w:vAlign w:val="top"/>
+          </w:tcPr>
+          <w:p>
+            <w:r>
+              <w:t xml:space="preserve">Production audit confirmed in export/backend/src/routes/category-shares.ts: POST /category-share-proposals/:id/accept reads a pending proposal, inserts a new category, and only then updates the proposal status. There is no transaction or conditional status claim, so a failure after the insert leaves the proposal pending, while concurrent accepts can both insert duplicate categories.</w:t>
+            </w:r>
+          </w:p>
+        </w:tc>
+        <w:tc>
+          <w:tcPr>
+            <w:tcW w:w="1300" w:type="dxa"/>
+            <w:vAlign w:val="top"/>
+          </w:tcPr>
+          <w:p>
+            <w:r>
+              <w:t xml:space="preserve">pending</w:t>
+            </w:r>
+          </w:p>
+        </w:tc>
+        <w:tc>
+          <w:tcPr>
+            <w:tcW w:w="850" w:type="dxa"/>
+            <w:vAlign w:val="top"/>
+          </w:tcPr>
+          <w:p>
+            <w:r>
+              <w:t xml:space="preserve">3</w:t>
+            </w:r>
+          </w:p>
+        </w:tc>
+        <w:tc>
+          <w:tcPr>
+            <w:tcW w:w="2100" w:type="dxa"/>
+            <w:vAlign w:val="top"/>
+          </w:tcPr>
+          <w:p>
+            <w:r>
+              <w:t xml:space="preserve">Claim the pending proposal and create the category in one transaction with a row lock or conditional status update; roll back on failure and add concurrent-accept and mid-write failure tests.</w:t>
+            </w:r>
+          </w:p>
+        </w:tc>
+      </w:tr>
+      <w:tr>
+        <w:tc>
+          <w:tcPr>
+            <w:tcW w:w="650" w:type="dxa"/>
+            <w:vAlign w:val="top"/>
+          </w:tcPr>
+          <w:p>
+            <w:r>
+              <w:t xml:space="preserve">21</w:t>
+            </w:r>
+          </w:p>
+        </w:tc>
+        <w:tc>
+          <w:tcPr>
+            <w:tcW w:w="4300" w:type="dxa"/>
+            <w:vAlign w:val="top"/>
+          </w:tcPr>
+          <w:p>
+            <w:r>
+              <w:t xml:space="preserve">Production audit confirmed in export/backend/src/routes/recurring-payments.ts: both scheduled auto-apply and manual apply insert the transaction before the monthly log claim, then optionally insert a Larder credit in a later write. A concurrent request can create an extra transaction whose log insert loses the conflict, and any later DB failure can leave transaction/log/Larder state inconsistent.</w:t>
+            </w:r>
+          </w:p>
+        </w:tc>
+        <w:tc>
+          <w:tcPr>
+            <w:tcW w:w="1300" w:type="dxa"/>
+            <w:vAlign w:val="top"/>
+          </w:tcPr>
+          <w:p>
+            <w:r>
+              <w:t xml:space="preserve">pending</w:t>
+            </w:r>
+          </w:p>
+        </w:tc>
+        <w:tc>
+          <w:tcPr>
+            <w:tcW w:w="850" w:type="dxa"/>
+            <w:vAlign w:val="top"/>
+          </w:tcPr>
+          <w:p>
+            <w:r>
+              <w:t xml:space="preserve">4</w:t>
+            </w:r>
+          </w:p>
+        </w:tc>
+        <w:tc>
+          <w:tcPr>
+            <w:tcW w:w="2100" w:type="dxa"/>
+            <w:vAlign w:val="top"/>
+          </w:tcPr>
+          <w:p>
+            <w:r>
+              <w:t xml:space="preserve">Wrap transaction creation, unique monthly-log claim, and optional Larder credit in one transaction; treat a lost log claim as a no-op with rollback, and add concurrent-apply and mid-write failure tests.</w:t>
+            </w:r>
+          </w:p>
+        </w:tc>
+      </w:tr>
+      <w:tr>
+        <w:tc>
+          <w:tcPr>
+            <w:tcW w:w="650" w:type="dxa"/>
+            <w:vAlign w:val="top"/>
+          </w:tcPr>
+          <w:p>
+            <w:r>
+              <w:t xml:space="preserve">22</w:t>
+            </w:r>
+          </w:p>
+        </w:tc>
+        <w:tc>
+          <w:tcPr>
+            <w:tcW w:w="4300" w:type="dxa"/>
+            <w:vAlign w:val="top"/>
+          </w:tcPr>
+          <w:p>
+            <w:r>
+              <w:t xml:space="preserve">Production audit confirmed in export/backend/src/routes/currencies.ts: POST /convert-currency updates transactions, category budgets, recurring payments, and user/household budgets through independent sequential writes with no database transaction. A failure after earlier updates leaves the account partially converted, producing mixed-currency totals and future conversion drift.</w:t>
+            </w:r>
+          </w:p>
+        </w:tc>
+        <w:tc>
+          <w:tcPr>
+            <w:tcW w:w="1300" w:type="dxa"/>
+            <w:vAlign w:val="top"/>
+          </w:tcPr>
+          <w:p>
+            <w:r>
+              <w:t xml:space="preserve">pending</w:t>
+            </w:r>
+          </w:p>
+        </w:tc>
+        <w:tc>
+          <w:tcPr>
+            <w:tcW w:w="850" w:type="dxa"/>
+            <w:vAlign w:val="top"/>
+          </w:tcPr>
+          <w:p>
+            <w:r>
+              <w:t xml:space="preserve">4</w:t>
+            </w:r>
+          </w:p>
+        </w:tc>
+        <w:tc>
+          <w:tcPr>
+            <w:tcW w:w="2100" w:type="dxa"/>
+            <w:vAlign w:val="top"/>
+          </w:tcPr>
+          <w:p>
+            <w:r>
+              <w:t xml:space="preserve">Fetch and validate all rates before writing, then perform every related update in one database transaction with a clear retry/idempotency policy; add failure-injection tests at each write phase.</w:t>
+            </w:r>
+          </w:p>
+        </w:tc>
+      </w:tr>
+      <w:tr>
+        <w:tc>
+          <w:tcPr>
+            <w:tcW w:w="650" w:type="dxa"/>
+            <w:vAlign w:val="top"/>
+          </w:tcPr>
+          <w:p>
+            <w:r>
+              <w:t xml:space="preserve">23</w:t>
+            </w:r>
+          </w:p>
+        </w:tc>
+        <w:tc>
+          <w:tcPr>
+            <w:tcW w:w="4300" w:type="dxa"/>
+            <w:vAlign w:val="top"/>
+          </w:tcPr>
+          <w:p>
+            <w:r>
+              <w:t xml:space="preserve">Production audit confirmed in export/backend/src/routes/larder.ts: POST /larder/save-from-goal inserts a negative goal contribution and only afterward inserts the positive Larder entry. A failure between those writes permanently reduces goal progress without crediting the user’s Larder, breaking conservation of funds.</w:t>
+            </w:r>
+          </w:p>
+        </w:tc>
+        <w:tc>
+          <w:tcPr>
+            <w:tcW w:w="1300" w:type="dxa"/>
+            <w:vAlign w:val="top"/>
+          </w:tcPr>
+          <w:p>
+            <w:r>
+              <w:t xml:space="preserve">pending</w:t>
+            </w:r>
+          </w:p>
+        </w:tc>
+        <w:tc>
+          <w:tcPr>
+            <w:tcW w:w="850" w:type="dxa"/>
+            <w:vAlign w:val="top"/>
+          </w:tcPr>
+          <w:p>
+            <w:r>
+              <w:t xml:space="preserve">4</w:t>
+            </w:r>
+          </w:p>
+        </w:tc>
+        <w:tc>
+          <w:tcPr>
+            <w:tcW w:w="2100" w:type="dxa"/>
+            <w:vAlign w:val="top"/>
+          </w:tcPr>
+          <w:p>
+            <w:r>
+              <w:t xml:space="preserve">Move validation and both ledger writes into one database transaction with concurrency-safe contribution checks; add mid-write failure, concurrent save, and balance-conservation tests.</w:t>
+            </w:r>
+          </w:p>
+        </w:tc>
+      </w:tr>
+      <w:tr>
+        <w:tc>
+          <w:tcPr>
+            <w:tcW w:w="650" w:type="dxa"/>
+            <w:vAlign w:val="top"/>
+          </w:tcPr>
+          <w:p>
+            <w:r>
+              <w:t xml:space="preserve">24</w:t>
+            </w:r>
+          </w:p>
+        </w:tc>
+        <w:tc>
+          <w:tcPr>
+            <w:tcW w:w="4300" w:type="dxa"/>
+            <w:vAlign w:val="top"/>
+          </w:tcPr>
+          <w:p>
+            <w:r>
+              <w:t xml:space="preserve">Production audit confirmed in export/frontend/src/App.tsx: the top-level ErrorBoundary recovery button only sets hasError back to false while retaining the same child tree and component state. If the render defect is deterministic, React immediately throws again, leaving the recovery screen stuck unless the user manually refreshes the app.</w:t>
+            </w:r>
+          </w:p>
+        </w:tc>
+        <w:tc>
+          <w:tcPr>
+            <w:tcW w:w="1300" w:type="dxa"/>
+            <w:vAlign w:val="top"/>
+          </w:tcPr>
+          <w:p>
+            <w:r>
+              <w:t xml:space="preserve">pending</w:t>
+            </w:r>
+          </w:p>
+        </w:tc>
+        <w:tc>
+          <w:tcPr>
+            <w:tcW w:w="850" w:type="dxa"/>
+            <w:vAlign w:val="top"/>
+          </w:tcPr>
+          <w:p>
+            <w:r>
+              <w:t xml:space="preserve">2</w:t>
+            </w:r>
+          </w:p>
+        </w:tc>
+        <w:tc>
+          <w:tcPr>
+            <w:tcW w:w="2100" w:type="dxa"/>
+            <w:vAlign w:val="top"/>
+          </w:tcPr>
+          <w:p>
+            <w:r>
+              <w:t xml:space="preserve">Remount the child tree or provide a full-page reload fallback when retrying, while preserving a safe error message; test deterministic render failure and successful recovery.</w:t>
+            </w:r>
+          </w:p>
+        </w:tc>
+      </w:tr>
+      <w:tr>
+        <w:tc>
+          <w:tcPr>
+            <w:tcW w:w="650" w:type="dxa"/>
+            <w:vAlign w:val="top"/>
+          </w:tcPr>
+          <w:p>
+            <w:r>
+              <w:t xml:space="preserve">25</w:t>
+            </w:r>
+          </w:p>
+        </w:tc>
+        <w:tc>
+          <w:tcPr>
+            <w:tcW w:w="4300" w:type="dxa"/>
+            <w:vAlign w:val="top"/>
+          </w:tcPr>
+          <w:p>
+            <w:r>
+              <w:t xml:space="preserve">Production audit confirmed in export/frontend/src/components/Onboarding.tsx: finish() swallows updateMe.mutateAsync and cache-invalidation failures, then always calls onComplete. Local onboarding state advances even when firstLoginDone, currency, language, or budget were not persisted; AuthGuard subsequently sees firstLoginDone=false and logs the user out, losing the onboarding choices.</w:t>
+            </w:r>
+          </w:p>
+        </w:tc>
+        <w:tc>
+          <w:tcPr>
+            <w:tcW w:w="1300" w:type="dxa"/>
+            <w:vAlign w:val="top"/>
+          </w:tcPr>
+          <w:p>
+            <w:r>
+              <w:t xml:space="preserve">pending</w:t>
+            </w:r>
+          </w:p>
+        </w:tc>
+        <w:tc>
+          <w:tcPr>
+            <w:tcW w:w="850" w:type="dxa"/>
+            <w:vAlign w:val="top"/>
+          </w:tcPr>
+          <w:p>
+            <w:r>
+              <w:t xml:space="preserve">3</w:t>
+            </w:r>
+          </w:p>
+        </w:tc>
+        <w:tc>
+          <w:tcPr>
+            <w:tcW w:w="2100" w:type="dxa"/>
+            <w:vAlign w:val="top"/>
+          </w:tcPr>
+          <w:p>
+            <w:r>
+              <w:t xml:space="preserve">Only complete onboarding after the server update succeeds; on failure keep the step open, show retryable feedback, and preserve entered values. Add API-failure, retry, and successful-completion tests.</w:t>
+            </w:r>
+          </w:p>
+        </w:tc>
+      </w:tr>
+      <w:tr>
+        <w:tc>
+          <w:tcPr>
+            <w:tcW w:w="650" w:type="dxa"/>
+            <w:vAlign w:val="top"/>
+          </w:tcPr>
+          <w:p>
+            <w:r>
+              <w:t xml:space="preserve">26</w:t>
+            </w:r>
+          </w:p>
+        </w:tc>
+        <w:tc>
+          <w:tcPr>
+            <w:tcW w:w="4300" w:type="dxa"/>
+            <w:vAlign w:val="top"/>
+          </w:tcPr>
+          <w:p>
+            <w:r>
+              <w:t xml:space="preserve">Production audit confirmed in export/frontend/src/pages/Dashboard.tsx and src/hooks/useLiveActivity.ts: Dashboard passes prefs.currency (an ISO code such as USD, EUR, or PLN) into the native Live Activity field named currencySymbol. The app formatter explicitly maps these codes to $, €, and zł, so supported native Live Activity displays can show the wrong currency text.</w:t>
+            </w:r>
+          </w:p>
+        </w:tc>
+        <w:tc>
+          <w:tcPr>
+            <w:tcW w:w="1300" w:type="dxa"/>
+            <w:vAlign w:val="top"/>
+          </w:tcPr>
+          <w:p>
+            <w:r>
+              <w:t xml:space="preserve">pending</w:t>
+            </w:r>
+          </w:p>
+        </w:tc>
+        <w:tc>
+          <w:tcPr>
+            <w:tcW w:w="850" w:type="dxa"/>
+            <w:vAlign w:val="top"/>
+          </w:tcPr>
+          <w:p>
+            <w:r>
+              <w:t xml:space="preserve">2</w:t>
+            </w:r>
+          </w:p>
+        </w:tc>
+        <w:tc>
+          <w:tcPr>
+            <w:tcW w:w="2100" w:type="dxa"/>
+            <w:vAlign w:val="top"/>
+          </w:tcPr>
+          <w:p>
+            <w:r>
+              <w:t xml:space="preserve">Pass the mapped currencySymbol(prefs.currency) value to Live Activity and add native payload assertions for USD, EUR, GBP, and PLN.</w:t>
+            </w:r>
+          </w:p>
+        </w:tc>
+      </w:tr>
     </w:tbl>
-    <w:p>
-      <w:r>
-        <w:rPr>
-          <w:i/>
-        </w:rPr>
-        <w:t>Current audit scope: severity scores 1–4. Workflow items 1–6 define the audit process; severity scores 5–10 are not being used.</w:t>
-      </w:r>
-    </w:p>
-    <w:sectPr>
-      <w:pgSz w:w="11906" w:h="16838"/>
-      <w:pgMar w:top="1080" w:right="1080" w:bottom="1080" w:left="1080" w:header="720" w:footer="720" w:gutter="0"/>
-    </w:sectPr>
   </w:body>
 </w:document>
 </file>

</xml_diff>

<commit_message>
Update problem tracker document
Replit-Commit-Author: Agent
</commit_message>
<xml_diff>
--- a/output/problem-tracker.docx
+++ b/output/problem-tracker.docx
@@ -1589,6 +1589,291 @@
           <w:p>
             <w:r>
               <w:t xml:space="preserve">Pass the mapped currencySymbol(prefs.currency) value to Live Activity and add native payload assertions for USD, EUR, GBP, and PLN.</w:t>
+            </w:r>
+          </w:p>
+        </w:tc>
+      </w:tr>
+      <w:tr>
+        <w:tc>
+          <w:tcPr>
+            <w:tcW w:w="650" w:type="dxa"/>
+            <w:vAlign w:val="top"/>
+          </w:tcPr>
+          <w:p>
+            <w:r>
+              <w:t xml:space="preserve">27</w:t>
+            </w:r>
+          </w:p>
+        </w:tc>
+        <w:tc>
+          <w:tcPr>
+            <w:tcW w:w="4300" w:type="dxa"/>
+            <w:vAlign w:val="top"/>
+          </w:tcPr>
+          <w:p>
+            <w:r>
+              <w:t xml:space="preserve">Production audit confirmed in export/frontend/src/sw.ts:158-160: the service worker background-sync replay fetches CSRF tokens from the hard-coded root path /api/csrf-token. When the deployed frontend is served under a non-root base path, queued offline mutations use base-prefixed endpoints but CSRF acquisition goes to the wrong route, so replay remains pending and never completes.</w:t>
+            </w:r>
+          </w:p>
+        </w:tc>
+        <w:tc>
+          <w:tcPr>
+            <w:tcW w:w="1300" w:type="dxa"/>
+            <w:vAlign w:val="top"/>
+          </w:tcPr>
+          <w:p>
+            <w:r>
+              <w:t xml:space="preserve">pending</w:t>
+            </w:r>
+          </w:p>
+        </w:tc>
+        <w:tc>
+          <w:tcPr>
+            <w:tcW w:w="850" w:type="dxa"/>
+            <w:vAlign w:val="top"/>
+          </w:tcPr>
+          <w:p>
+            <w:r>
+              <w:t xml:space="preserve">2</w:t>
+            </w:r>
+          </w:p>
+        </w:tc>
+        <w:tc>
+          <w:tcPr>
+            <w:tcW w:w="2100" w:type="dxa"/>
+            <w:vAlign w:val="top"/>
+          </w:tcPr>
+          <w:p>
+            <w:r>
+              <w:t xml:space="preserve">Resolve the CSRF URL from the service-worker registration scope or persist a base-aware URL with each queued operation; cover background-sync replay under a subpath, including token success and 403 retry.</w:t>
+            </w:r>
+          </w:p>
+        </w:tc>
+      </w:tr>
+      <w:tr>
+        <w:tc>
+          <w:tcPr>
+            <w:tcW w:w="650" w:type="dxa"/>
+            <w:vAlign w:val="top"/>
+          </w:tcPr>
+          <w:p>
+            <w:r>
+              <w:t xml:space="preserve">29</w:t>
+            </w:r>
+          </w:p>
+        </w:tc>
+        <w:tc>
+          <w:tcPr>
+            <w:tcW w:w="4300" w:type="dxa"/>
+            <w:vAlign w:val="top"/>
+          </w:tcPr>
+          <w:p>
+            <w:r>
+              <w:t xml:space="preserve">Production audit confirmed in export/frontend/src/hooks/usePullToRefresh.ts:86-109 and export/frontend/src/components/Layout.tsx:170-184: releasing a committed pull-to-refresh gesture awaits queryClient.refetchQueries through Promise.all without a catch. If any active query refetch rejects, the touchend/touchcancel handler rejects after its finally cleanup; the browser records an unhandled promise rejection and the user receives no refresh failure feedback.</w:t>
+            </w:r>
+          </w:p>
+        </w:tc>
+        <w:tc>
+          <w:tcPr>
+            <w:tcW w:w="1300" w:type="dxa"/>
+            <w:vAlign w:val="top"/>
+          </w:tcPr>
+          <w:p>
+            <w:r>
+              <w:t xml:space="preserve">pending</w:t>
+            </w:r>
+          </w:p>
+        </w:tc>
+        <w:tc>
+          <w:tcPr>
+            <w:tcW w:w="850" w:type="dxa"/>
+            <w:vAlign w:val="top"/>
+          </w:tcPr>
+          <w:p>
+            <w:r>
+              <w:t xml:space="preserve">3</w:t>
+            </w:r>
+          </w:p>
+        </w:tc>
+        <w:tc>
+          <w:tcPr>
+            <w:tcW w:w="2100" w:type="dxa"/>
+            <w:vAlign w:val="top"/>
+          </w:tcPr>
+          <w:p>
+            <w:r>
+              <w:t xml:space="preserve">Catch refresh failures inside the gesture handler or make the refresh callback non-rejecting, show retryable feedback, and retain the existing finally reset; test a failed active-query refetch through both touchend and touchcancel.</w:t>
+            </w:r>
+          </w:p>
+        </w:tc>
+      </w:tr>
+      <w:tr>
+        <w:tc>
+          <w:tcPr>
+            <w:tcW w:w="650" w:type="dxa"/>
+            <w:vAlign w:val="top"/>
+          </w:tcPr>
+          <w:p>
+            <w:r>
+              <w:t xml:space="preserve">30</w:t>
+            </w:r>
+          </w:p>
+        </w:tc>
+        <w:tc>
+          <w:tcPr>
+            <w:tcW w:w="4300" w:type="dxa"/>
+            <w:vAlign w:val="top"/>
+          </w:tcPr>
+          <w:p>
+            <w:r>
+              <w:t xml:space="preserve">Production audit confirmed in export/backend/src/routes/budget-stretches.ts:94-115, 175-186 and export/backend/src/db/schema/budget_stretches.ts:26-30: POST /budget-stretches uses check-then-insert validation without a transactional claim. Because the documented category/month rule has no database uniqueness constraint, two concurrent no-transaction requests can create duplicate stretches and double-apply budget reallocations. For concurrent requests with a transactionId, the existing transactionId unique constraint prevents duplication but its violation is not translated to a controlled 409, so the route can return an uncaught 500.</w:t>
+            </w:r>
+          </w:p>
+        </w:tc>
+        <w:tc>
+          <w:tcPr>
+            <w:tcW w:w="1300" w:type="dxa"/>
+            <w:vAlign w:val="top"/>
+          </w:tcPr>
+          <w:p>
+            <w:r>
+              <w:t xml:space="preserve">pending</w:t>
+            </w:r>
+          </w:p>
+        </w:tc>
+        <w:tc>
+          <w:tcPr>
+            <w:tcW w:w="850" w:type="dxa"/>
+            <w:vAlign w:val="top"/>
+          </w:tcPr>
+          <w:p>
+            <w:r>
+              <w:t xml:space="preserve">3</w:t>
+            </w:r>
+          </w:p>
+        </w:tc>
+        <w:tc>
+          <w:tcPr>
+            <w:tcW w:w="2100" w:type="dxa"/>
+            <w:vAlign w:val="top"/>
+          </w:tcPr>
+          <w:p>
+            <w:r>
+              <w:t xml:space="preserve">Add database uniqueness for the nullable category/month rule using an appropriate partial index, make creation conditional/transaction-safe, and map unique violations to 409; add concurrent no-transaction and transaction-backed regression tests.</w:t>
+            </w:r>
+          </w:p>
+        </w:tc>
+      </w:tr>
+      <w:tr>
+        <w:tc>
+          <w:tcPr>
+            <w:tcW w:w="650" w:type="dxa"/>
+            <w:vAlign w:val="top"/>
+          </w:tcPr>
+          <w:p>
+            <w:r>
+              <w:t xml:space="preserve">31</w:t>
+            </w:r>
+          </w:p>
+        </w:tc>
+        <w:tc>
+          <w:tcPr>
+            <w:tcW w:w="4300" w:type="dxa"/>
+            <w:vAlign w:val="top"/>
+          </w:tcPr>
+          <w:p>
+            <w:r>
+              <w:t xml:space="preserve">Production audit confirmed in export/backend/src/routes/budget-stretches.ts:203-231: PATCH /budget-stretches/:id authorizes with a SELECT, then updates by id alone and immediately calls formatStretch(updated). If the row is deleted between those statements, the UPDATE returns no row and formatStretch receives undefined, dereferences s.id, and throws; the client receives a 500 rather than a controlled not-found/conflict response.</w:t>
+            </w:r>
+          </w:p>
+        </w:tc>
+        <w:tc>
+          <w:tcPr>
+            <w:tcW w:w="1300" w:type="dxa"/>
+            <w:vAlign w:val="top"/>
+          </w:tcPr>
+          <w:p>
+            <w:r>
+              <w:t xml:space="preserve">pending</w:t>
+            </w:r>
+          </w:p>
+        </w:tc>
+        <w:tc>
+          <w:tcPr>
+            <w:tcW w:w="850" w:type="dxa"/>
+            <w:vAlign w:val="top"/>
+          </w:tcPr>
+          <w:p>
+            <w:r>
+              <w:t xml:space="preserve">2</w:t>
+            </w:r>
+          </w:p>
+        </w:tc>
+        <w:tc>
+          <w:tcPr>
+            <w:tcW w:w="2100" w:type="dxa"/>
+            <w:vAlign w:val="top"/>
+          </w:tcPr>
+          <w:p>
+            <w:r>
+              <w:t xml:space="preserve">Use an ownership-scoped UPDATE with a checked returned row, return 404 or 409 when no row is updated, and add a concurrent-delete regression test for the PATCH flow.</w:t>
+            </w:r>
+          </w:p>
+        </w:tc>
+      </w:tr>
+      <w:tr>
+        <w:tc>
+          <w:tcPr>
+            <w:tcW w:w="650" w:type="dxa"/>
+            <w:vAlign w:val="top"/>
+          </w:tcPr>
+          <w:p>
+            <w:r>
+              <w:t xml:space="preserve">32</w:t>
+            </w:r>
+          </w:p>
+        </w:tc>
+        <w:tc>
+          <w:tcPr>
+            <w:tcW w:w="4300" w:type="dxa"/>
+            <w:vAlign w:val="top"/>
+          </w:tcPr>
+          <w:p>
+            <w:r>
+              <w:t xml:space="preserve">Production audit confirmed in export/frontend/src/pages/HomeSpending.tsx:851-927, 1488-1510, and 1515-1558: creating or editing a transaction with a goal/Larder dedication runs syncGoalContribution after the transaction mutation. The helper deletes all linked goal contributions and prior transaction-dedication Larder entries before creating the replacement. If any later fetch, delete, conversion, or create request fails, the transaction remains saved but the prior dedication has already been removed; the edit dialog is already closed and the async callback has no rollback or user-facing recovery.</w:t>
+            </w:r>
+          </w:p>
+        </w:tc>
+        <w:tc>
+          <w:tcPr>
+            <w:tcW w:w="1300" w:type="dxa"/>
+            <w:vAlign w:val="top"/>
+          </w:tcPr>
+          <w:p>
+            <w:r>
+              <w:t xml:space="preserve">pending</w:t>
+            </w:r>
+          </w:p>
+        </w:tc>
+        <w:tc>
+          <w:tcPr>
+            <w:tcW w:w="850" w:type="dxa"/>
+            <w:vAlign w:val="top"/>
+          </w:tcPr>
+          <w:p>
+            <w:r>
+              <w:t xml:space="preserve">4</w:t>
+            </w:r>
+          </w:p>
+        </w:tc>
+        <w:tc>
+          <w:tcPr>
+            <w:tcW w:w="2100" w:type="dxa"/>
+            <w:vAlign w:val="top"/>
+          </w:tcPr>
+          <w:p>
+            <w:r>
+              <w:t xml:space="preserve">Move dedication replacement into an atomic backend operation or implement a durable compensating workflow that creates/validates the replacement before deleting the old records; keep the editor open or show a retryable error until synchronization succeeds, and test failures at every delete/create step.</w:t>
             </w:r>
           </w:p>
         </w:tc>

</xml_diff>

<commit_message>
Update the problem tracker document
Replit-Commit-Author: Agent
</commit_message>
<xml_diff>
--- a/output/problem-tracker.docx
+++ b/output/problem-tracker.docx
@@ -1874,6 +1874,861 @@
           <w:p>
             <w:r>
               <w:t xml:space="preserve">Move dedication replacement into an atomic backend operation or implement a durable compensating workflow that creates/validates the replacement before deleting the old records; keep the editor open or show a retryable error until synchronization succeeds, and test failures at every delete/create step.</w:t>
+            </w:r>
+          </w:p>
+        </w:tc>
+      </w:tr>
+      <w:tr>
+        <w:tc>
+          <w:tcPr>
+            <w:tcW w:w="650" w:type="dxa"/>
+            <w:vAlign w:val="top"/>
+          </w:tcPr>
+          <w:p>
+            <w:r>
+              <w:t xml:space="preserve">33</w:t>
+            </w:r>
+          </w:p>
+        </w:tc>
+        <w:tc>
+          <w:tcPr>
+            <w:tcW w:w="4300" w:type="dxa"/>
+            <w:vAlign w:val="top"/>
+          </w:tcPr>
+          <w:p>
+            <w:r>
+              <w:t xml:space="preserve">Production audit confirmed in export/frontend/src/components/Layout.tsx: the profile-open effect calls fetchRates().then(setRates) without a rejection handler. If rates fail while the user opens the profile sheet, the request produces an unhandled promise rejection and leaves the currency options silently unavailable with no retry/error state.</w:t>
+            </w:r>
+          </w:p>
+        </w:tc>
+        <w:tc>
+          <w:tcPr>
+            <w:tcW w:w="1300" w:type="dxa"/>
+            <w:vAlign w:val="top"/>
+          </w:tcPr>
+          <w:p>
+            <w:r>
+              <w:t xml:space="preserve">pending</w:t>
+            </w:r>
+          </w:p>
+        </w:tc>
+        <w:tc>
+          <w:tcPr>
+            <w:tcW w:w="850" w:type="dxa"/>
+            <w:vAlign w:val="top"/>
+          </w:tcPr>
+          <w:p>
+            <w:r>
+              <w:t xml:space="preserve">1</w:t>
+            </w:r>
+          </w:p>
+        </w:tc>
+        <w:tc>
+          <w:tcPr>
+            <w:tcW w:w="2100" w:type="dxa"/>
+            <w:vAlign w:val="top"/>
+          </w:tcPr>
+          <w:p>
+            <w:r>
+              <w:t xml:space="preserve">Add a catch that records a recoverable rates error or leaves the existing empty state intentionally; verify profile opening under offline and rejected-rates responses without an unhandled rejection.</w:t>
+            </w:r>
+          </w:p>
+        </w:tc>
+      </w:tr>
+      <w:tr>
+        <w:tc>
+          <w:tcPr>
+            <w:tcW w:w="650" w:type="dxa"/>
+            <w:vAlign w:val="top"/>
+          </w:tcPr>
+          <w:p>
+            <w:r>
+              <w:t xml:space="preserve">34</w:t>
+            </w:r>
+          </w:p>
+        </w:tc>
+        <w:tc>
+          <w:tcPr>
+            <w:tcW w:w="4300" w:type="dxa"/>
+            <w:vAlign w:val="top"/>
+          </w:tcPr>
+          <w:p>
+            <w:r>
+              <w:t xml:space="preserve">Production audit confirmed in export/frontend/src/components/NotificationCenter.tsx: AlarmPanel.handleDelete removes the alarm from local state before awaiting alarmFetch(..., DELETE), but the button invokes it without catch handling. A network rejection becomes an unhandled promise rejection and the reminder disappears until the panel is reopened, even though the server delete may have failed.</w:t>
+            </w:r>
+          </w:p>
+        </w:tc>
+        <w:tc>
+          <w:tcPr>
+            <w:tcW w:w="1300" w:type="dxa"/>
+            <w:vAlign w:val="top"/>
+          </w:tcPr>
+          <w:p>
+            <w:r>
+              <w:t xml:space="preserve">pending</w:t>
+            </w:r>
+          </w:p>
+        </w:tc>
+        <w:tc>
+          <w:tcPr>
+            <w:tcW w:w="850" w:type="dxa"/>
+            <w:vAlign w:val="top"/>
+          </w:tcPr>
+          <w:p>
+            <w:r>
+              <w:t xml:space="preserve">2</w:t>
+            </w:r>
+          </w:p>
+        </w:tc>
+        <w:tc>
+          <w:tcPr>
+            <w:tcW w:w="2100" w:type="dxa"/>
+            <w:vAlign w:val="top"/>
+          </w:tcPr>
+          <w:p>
+            <w:r>
+              <w:t xml:space="preserve">Await the delete with explicit success/error handling, restore the alarm on failure, and show retryable feedback; cover rejected DELETE, non-OK response, and successful deletion.</w:t>
+            </w:r>
+          </w:p>
+        </w:tc>
+      </w:tr>
+      <w:tr>
+        <w:tc>
+          <w:tcPr>
+            <w:tcW w:w="650" w:type="dxa"/>
+            <w:vAlign w:val="top"/>
+          </w:tcPr>
+          <w:p>
+            <w:r>
+              <w:t xml:space="preserve">35</w:t>
+            </w:r>
+          </w:p>
+        </w:tc>
+        <w:tc>
+          <w:tcPr>
+            <w:tcW w:w="4300" w:type="dxa"/>
+            <w:vAlign w:val="top"/>
+          </w:tcPr>
+          <w:p>
+            <w:r>
+              <w:t xml:space="preserve">Production audit confirmed in export/frontend/src/components/NotificationCenter.tsx: AlarmPanel.handleAdd awaits ensurePushPermission() and alarmFetch(..., POST) without catch/finally, while the Add button uses the async handler directly. A rejected permission request or network failure becomes an unhandled promise rejection and the user receives no failure or retry feedback.</w:t>
+            </w:r>
+          </w:p>
+        </w:tc>
+        <w:tc>
+          <w:tcPr>
+            <w:tcW w:w="1300" w:type="dxa"/>
+            <w:vAlign w:val="top"/>
+          </w:tcPr>
+          <w:p>
+            <w:r>
+              <w:t xml:space="preserve">pending</w:t>
+            </w:r>
+          </w:p>
+        </w:tc>
+        <w:tc>
+          <w:tcPr>
+            <w:tcW w:w="850" w:type="dxa"/>
+            <w:vAlign w:val="top"/>
+          </w:tcPr>
+          <w:p>
+            <w:r>
+              <w:t xml:space="preserve">2</w:t>
+            </w:r>
+          </w:p>
+        </w:tc>
+        <w:tc>
+          <w:tcPr>
+            <w:tcW w:w="2100" w:type="dxa"/>
+            <w:vAlign w:val="top"/>
+          </w:tcPr>
+          <w:p>
+            <w:r>
+              <w:t xml:space="preserve">Wrap permission and alarm creation in explicit error handling, keep the panel usable, and show retryable feedback; cover permission rejection, non-OK POST, network failure, and successful add.</w:t>
+            </w:r>
+          </w:p>
+        </w:tc>
+      </w:tr>
+      <w:tr>
+        <w:tc>
+          <w:tcPr>
+            <w:tcW w:w="650" w:type="dxa"/>
+            <w:vAlign w:val="top"/>
+          </w:tcPr>
+          <w:p>
+            <w:r>
+              <w:t xml:space="preserve">36</w:t>
+            </w:r>
+          </w:p>
+        </w:tc>
+        <w:tc>
+          <w:tcPr>
+            <w:tcW w:w="4300" w:type="dxa"/>
+            <w:vAlign w:val="top"/>
+          </w:tcPr>
+          <w:p>
+            <w:r>
+              <w:t xml:space="preserve">Production audit confirmed in export/frontend/src/components/NotificationCenter.tsx: handleSmartToggle awaits ensurePermission(), whose Notification.requestPermission() call can reject, but handleSmartToggle has no catch and is used directly by the smart-alert controls. Permission API failure becomes an unhandled promise rejection and the toggle gives no recovery feedback.</w:t>
+            </w:r>
+          </w:p>
+        </w:tc>
+        <w:tc>
+          <w:tcPr>
+            <w:tcW w:w="1300" w:type="dxa"/>
+            <w:vAlign w:val="top"/>
+          </w:tcPr>
+          <w:p>
+            <w:r>
+              <w:t xml:space="preserve">pending</w:t>
+            </w:r>
+          </w:p>
+        </w:tc>
+        <w:tc>
+          <w:tcPr>
+            <w:tcW w:w="850" w:type="dxa"/>
+            <w:vAlign w:val="top"/>
+          </w:tcPr>
+          <w:p>
+            <w:r>
+              <w:t xml:space="preserve">1</w:t>
+            </w:r>
+          </w:p>
+        </w:tc>
+        <w:tc>
+          <w:tcPr>
+            <w:tcW w:w="2100" w:type="dxa"/>
+            <w:vAlign w:val="top"/>
+          </w:tcPr>
+          <w:p>
+            <w:r>
+              <w:t xml:space="preserve">Catch permission failures in the smart-alert toggle, preserve the prior preference, and show the existing notification-permission error; cover permission rejection and denied/granted paths.</w:t>
+            </w:r>
+          </w:p>
+        </w:tc>
+      </w:tr>
+      <w:tr>
+        <w:tc>
+          <w:tcPr>
+            <w:tcW w:w="650" w:type="dxa"/>
+            <w:vAlign w:val="top"/>
+          </w:tcPr>
+          <w:p>
+            <w:r>
+              <w:t xml:space="preserve">37</w:t>
+            </w:r>
+          </w:p>
+        </w:tc>
+        <w:tc>
+          <w:tcPr>
+            <w:tcW w:w="4300" w:type="dxa"/>
+            <w:vAlign w:val="top"/>
+          </w:tcPr>
+          <w:p>
+            <w:r>
+              <w:t xml:space="preserve">Production audit confirmed in export/frontend/src/components/NotificationCenter.tsx: handlePreview sets previewing=true and awaits triggerBadgerNotification() before scheduling the reset timeout. triggerBadgerNotification can reject when haptic/audio setup throws; no catch/finally handles that rejection, so the click produces an unhandled promise rejection and previewing can remain true indefinitely, disabling the preview control.</w:t>
+            </w:r>
+          </w:p>
+        </w:tc>
+        <w:tc>
+          <w:tcPr>
+            <w:tcW w:w="1300" w:type="dxa"/>
+            <w:vAlign w:val="top"/>
+          </w:tcPr>
+          <w:p>
+            <w:r>
+              <w:t xml:space="preserve">pending</w:t>
+            </w:r>
+          </w:p>
+        </w:tc>
+        <w:tc>
+          <w:tcPr>
+            <w:tcW w:w="850" w:type="dxa"/>
+            <w:vAlign w:val="top"/>
+          </w:tcPr>
+          <w:p>
+            <w:r>
+              <w:t xml:space="preserve">2</w:t>
+            </w:r>
+          </w:p>
+        </w:tc>
+        <w:tc>
+          <w:tcPr>
+            <w:tcW w:w="2100" w:type="dxa"/>
+            <w:vAlign w:val="top"/>
+          </w:tcPr>
+          <w:p>
+            <w:r>
+              <w:t xml:space="preserve">Use try/finally to guarantee preview-state cleanup, catch media/haptic failures, and keep the preview action retryable; test vibration throw, audio load failure, and successful preview.</w:t>
+            </w:r>
+          </w:p>
+        </w:tc>
+      </w:tr>
+      <w:tr>
+        <w:tc>
+          <w:tcPr>
+            <w:tcW w:w="650" w:type="dxa"/>
+            <w:vAlign w:val="top"/>
+          </w:tcPr>
+          <w:p>
+            <w:r>
+              <w:t xml:space="preserve">38</w:t>
+            </w:r>
+          </w:p>
+        </w:tc>
+        <w:tc>
+          <w:tcPr>
+            <w:tcW w:w="4300" w:type="dxa"/>
+            <w:vAlign w:val="top"/>
+          </w:tcPr>
+          <w:p>
+            <w:r>
+              <w:t xml:space="preserve">Production audit confirmed in export/backend/src/routes/notifications.ts and src/db/schema/notifications.ts: POST /notifications/alarms counts a user's rows, checks MAX_ALARMS_PER_USER, then inserts without a transaction or database-enforced cap. Concurrent Add Reminder requests can both pass the check and create more than the documented ten alarms.</w:t>
+            </w:r>
+          </w:p>
+        </w:tc>
+        <w:tc>
+          <w:tcPr>
+            <w:tcW w:w="1300" w:type="dxa"/>
+            <w:vAlign w:val="top"/>
+          </w:tcPr>
+          <w:p>
+            <w:r>
+              <w:t xml:space="preserve">pending</w:t>
+            </w:r>
+          </w:p>
+        </w:tc>
+        <w:tc>
+          <w:tcPr>
+            <w:tcW w:w="850" w:type="dxa"/>
+            <w:vAlign w:val="top"/>
+          </w:tcPr>
+          <w:p>
+            <w:r>
+              <w:t xml:space="preserve">3</w:t>
+            </w:r>
+          </w:p>
+        </w:tc>
+        <w:tc>
+          <w:tcPr>
+            <w:tcW w:w="2100" w:type="dxa"/>
+            <w:vAlign w:val="top"/>
+          </w:tcPr>
+          <w:p>
+            <w:r>
+              <w:t xml:space="preserve">Enforce the per-user cap atomically with a transaction/locking strategy or an equivalent database invariant, and add concurrent-create tests proving the limit cannot be exceeded.</w:t>
+            </w:r>
+          </w:p>
+        </w:tc>
+      </w:tr>
+      <w:tr>
+        <w:tc>
+          <w:tcPr>
+            <w:tcW w:w="650" w:type="dxa"/>
+            <w:vAlign w:val="top"/>
+          </w:tcPr>
+          <w:p>
+            <w:r>
+              <w:t xml:space="preserve">39</w:t>
+            </w:r>
+          </w:p>
+        </w:tc>
+        <w:tc>
+          <w:tcPr>
+            <w:tcW w:w="4300" w:type="dxa"/>
+            <w:vAlign w:val="top"/>
+          </w:tcPr>
+          <w:p>
+            <w:r>
+              <w:t xml:space="preserve">Production audit confirmed in export/backend/src/routes/notifications.ts: POST /notifications/push-subscribe deletes every other subscription for the user, then performs a separate upsert for the new endpoint. A database failure between those writes removes previously working push subscriptions without restoring them; concurrent replacements can also race.</w:t>
+            </w:r>
+          </w:p>
+        </w:tc>
+        <w:tc>
+          <w:tcPr>
+            <w:tcW w:w="1300" w:type="dxa"/>
+            <w:vAlign w:val="top"/>
+          </w:tcPr>
+          <w:p>
+            <w:r>
+              <w:t xml:space="preserve">pending</w:t>
+            </w:r>
+          </w:p>
+        </w:tc>
+        <w:tc>
+          <w:tcPr>
+            <w:tcW w:w="850" w:type="dxa"/>
+            <w:vAlign w:val="top"/>
+          </w:tcPr>
+          <w:p>
+            <w:r>
+              <w:t xml:space="preserve">3</w:t>
+            </w:r>
+          </w:p>
+        </w:tc>
+        <w:tc>
+          <w:tcPr>
+            <w:tcW w:w="2100" w:type="dxa"/>
+            <w:vAlign w:val="top"/>
+          </w:tcPr>
+          <w:p>
+            <w:r>
+              <w:t xml:space="preserve">Upsert the new subscription before removing obsolete rows, or wrap replacement in one transaction with a recovery-safe ordering; add failure-injection and concurrent-subscribe tests.</w:t>
+            </w:r>
+          </w:p>
+        </w:tc>
+      </w:tr>
+      <w:tr>
+        <w:tc>
+          <w:tcPr>
+            <w:tcW w:w="650" w:type="dxa"/>
+            <w:vAlign w:val="top"/>
+          </w:tcPr>
+          <w:p>
+            <w:r>
+              <w:t xml:space="preserve">40</w:t>
+            </w:r>
+          </w:p>
+        </w:tc>
+        <w:tc>
+          <w:tcPr>
+            <w:tcW w:w="4300" w:type="dxa"/>
+            <w:vAlign w:val="top"/>
+          </w:tcPr>
+          <w:p>
+            <w:r>
+              <w:t xml:space="preserve">Production audit confirmed in export/frontend/src/components/NotificationCenter.tsx:725-732: the offline-operation Discard button awaits discardOp(op.id) without catch handling. discardOp is the raw IndexedDB dequeue operation in export/frontend/src/lib/mutation-queue.ts, which rejects on a transaction/request error. Storage failure aborts the click handler before opsRefresh and queue events run, producing an unhandled rejection and stale UI.</w:t>
+            </w:r>
+          </w:p>
+        </w:tc>
+        <w:tc>
+          <w:tcPr>
+            <w:tcW w:w="1300" w:type="dxa"/>
+            <w:vAlign w:val="top"/>
+          </w:tcPr>
+          <w:p>
+            <w:r>
+              <w:t xml:space="preserve">pending</w:t>
+            </w:r>
+          </w:p>
+        </w:tc>
+        <w:tc>
+          <w:tcPr>
+            <w:tcW w:w="850" w:type="dxa"/>
+            <w:vAlign w:val="top"/>
+          </w:tcPr>
+          <w:p>
+            <w:r>
+              <w:t xml:space="preserve">2</w:t>
+            </w:r>
+          </w:p>
+        </w:tc>
+        <w:tc>
+          <w:tcPr>
+            <w:tcW w:w="2100" w:type="dxa"/>
+            <w:vAlign w:val="top"/>
+          </w:tcPr>
+          <w:p>
+            <w:r>
+              <w:t xml:space="preserve">Catch discard failures, keep the failed operation visible when deletion did not commit, and show retryable feedback; test IndexedDB transaction failure and successful discard.</w:t>
+            </w:r>
+          </w:p>
+        </w:tc>
+      </w:tr>
+      <w:tr>
+        <w:tc>
+          <w:tcPr>
+            <w:tcW w:w="650" w:type="dxa"/>
+            <w:vAlign w:val="top"/>
+          </w:tcPr>
+          <w:p>
+            <w:r>
+              <w:t xml:space="preserve">41</w:t>
+            </w:r>
+          </w:p>
+        </w:tc>
+        <w:tc>
+          <w:tcPr>
+            <w:tcW w:w="4300" w:type="dxa"/>
+            <w:vAlign w:val="top"/>
+          </w:tcPr>
+          <w:p>
+            <w:r>
+              <w:t xml:space="preserve">Production audit confirmed in export/backend/src/routes/categories.ts:118-127 and src/lib/budget-sync.ts:19-38: PATCH /categories/:id commits the category budget, then separately calls syncTotalBudgetFloor(userId). If the reconciliation reads or updates users.total_budget unsuccessfully, the category mutation remains committed while the total-budget floor is stale; no transaction or compensating action exists.</w:t>
+            </w:r>
+          </w:p>
+        </w:tc>
+        <w:tc>
+          <w:tcPr>
+            <w:tcW w:w="1300" w:type="dxa"/>
+            <w:vAlign w:val="top"/>
+          </w:tcPr>
+          <w:p>
+            <w:r>
+              <w:t xml:space="preserve">pending</w:t>
+            </w:r>
+          </w:p>
+        </w:tc>
+        <w:tc>
+          <w:tcPr>
+            <w:tcW w:w="850" w:type="dxa"/>
+            <w:vAlign w:val="top"/>
+          </w:tcPr>
+          <w:p>
+            <w:r>
+              <w:t xml:space="preserve">2</w:t>
+            </w:r>
+          </w:p>
+        </w:tc>
+        <w:tc>
+          <w:tcPr>
+            <w:tcW w:w="2100" w:type="dxa"/>
+            <w:vAlign w:val="top"/>
+          </w:tcPr>
+          <w:p>
+            <w:r>
+              <w:t xml:space="preserve">Perform the category update and total-budget floor reconciliation in one transaction, or make reconciliation retryable and expose failure clearly; add failure-injection tests for the update and user-budget write.</w:t>
+            </w:r>
+          </w:p>
+        </w:tc>
+      </w:tr>
+      <w:tr>
+        <w:tc>
+          <w:tcPr>
+            <w:tcW w:w="650" w:type="dxa"/>
+            <w:vAlign w:val="top"/>
+          </w:tcPr>
+          <w:p>
+            <w:r>
+              <w:t xml:space="preserve">42</w:t>
+            </w:r>
+          </w:p>
+        </w:tc>
+        <w:tc>
+          <w:tcPr>
+            <w:tcW w:w="4300" w:type="dxa"/>
+            <w:vAlign w:val="top"/>
+          </w:tcPr>
+          <w:p>
+            <w:r>
+              <w:t xml:space="preserve">Production audit confirmed in export/frontend/src/pages/Goals.tsx:710-719 and 754-763, 799-831: changing a goal's household visibility sets togglingHousehold=true, while the useUpdateGoal mutation clears it only in onSuccess and has no onError handler. A rejected visibility update leaves the dialog action disabled with a spinner and no user-facing recovery.</w:t>
+            </w:r>
+          </w:p>
+        </w:tc>
+        <w:tc>
+          <w:tcPr>
+            <w:tcW w:w="1300" w:type="dxa"/>
+            <w:vAlign w:val="top"/>
+          </w:tcPr>
+          <w:p>
+            <w:r>
+              <w:t xml:space="preserve">pending</w:t>
+            </w:r>
+          </w:p>
+        </w:tc>
+        <w:tc>
+          <w:tcPr>
+            <w:tcW w:w="850" w:type="dxa"/>
+            <w:vAlign w:val="top"/>
+          </w:tcPr>
+          <w:p>
+            <w:r>
+              <w:t xml:space="preserve">2</w:t>
+            </w:r>
+          </w:p>
+        </w:tc>
+        <w:tc>
+          <w:tcPr>
+            <w:tcW w:w="2100" w:type="dxa"/>
+            <w:vAlign w:val="top"/>
+          </w:tcPr>
+          <w:p>
+            <w:r>
+              <w:t xml:space="preserve">Clear the busy state and surface an actionable error in the visibility mutation's error/settled path; keep the dialog retryable and test permission, network, and successful visibility changes.</w:t>
+            </w:r>
+          </w:p>
+        </w:tc>
+      </w:tr>
+      <w:tr>
+        <w:tc>
+          <w:tcPr>
+            <w:tcW w:w="650" w:type="dxa"/>
+            <w:vAlign w:val="top"/>
+          </w:tcPr>
+          <w:p>
+            <w:r>
+              <w:t xml:space="preserve">43</w:t>
+            </w:r>
+          </w:p>
+        </w:tc>
+        <w:tc>
+          <w:tcPr>
+            <w:tcW w:w="4300" w:type="dxa"/>
+            <w:vAlign w:val="top"/>
+          </w:tcPr>
+          <w:p>
+            <w:r>
+              <w:t xml:space="preserve">Production audit confirmed in export/frontend/src/pages/Goals.tsx:1344-1384: handleApproveProposal, handleDeclineProposal, handleApproveEditProposal, and handleDeclineEditProposal await apiFetch without catch/finally. Network/CSRF/API rejection becomes an unhandled promise rejection; decline state is not cleared on failure, so the dialog/control can remain stuck with no user-facing recovery.</w:t>
+            </w:r>
+          </w:p>
+        </w:tc>
+        <w:tc>
+          <w:tcPr>
+            <w:tcW w:w="1300" w:type="dxa"/>
+            <w:vAlign w:val="top"/>
+          </w:tcPr>
+          <w:p>
+            <w:r>
+              <w:t xml:space="preserve">pending</w:t>
+            </w:r>
+          </w:p>
+        </w:tc>
+        <w:tc>
+          <w:tcPr>
+            <w:tcW w:w="850" w:type="dxa"/>
+            <w:vAlign w:val="top"/>
+          </w:tcPr>
+          <w:p>
+            <w:r>
+              <w:t xml:space="preserve">2</w:t>
+            </w:r>
+          </w:p>
+        </w:tc>
+        <w:tc>
+          <w:tcPr>
+            <w:tcW w:w="2100" w:type="dxa"/>
+            <w:vAlign w:val="top"/>
+          </w:tcPr>
+          <w:p>
+            <w:r>
+              <w:t xml:space="preserve">Add per-action pending/error handling with catch/finally, preserve the proposal on failure, and allow retry; cover approval/decline failures for both share and edit proposals.</w:t>
+            </w:r>
+          </w:p>
+        </w:tc>
+      </w:tr>
+      <w:tr>
+        <w:tc>
+          <w:tcPr>
+            <w:tcW w:w="650" w:type="dxa"/>
+            <w:vAlign w:val="top"/>
+          </w:tcPr>
+          <w:p>
+            <w:r>
+              <w:t xml:space="preserve">44</w:t>
+            </w:r>
+          </w:p>
+        </w:tc>
+        <w:tc>
+          <w:tcPr>
+            <w:tcW w:w="4300" w:type="dxa"/>
+            <w:vAlign w:val="top"/>
+          </w:tcPr>
+          <w:p>
+            <w:r>
+              <w:t xml:space="preserve">Production audit confirmed in export/backend/src/routes/goals.ts:559-578 and src/db/schema/goal_proposals.ts:6-13: POST /goals/:id/propose performs a pending-proposal existence check, then inserts in a separate operation; the table has no uniqueness rule for one pending proposal per goal. Concurrent user submissions can create duplicate pending household-share proposals.</w:t>
+            </w:r>
+          </w:p>
+        </w:tc>
+        <w:tc>
+          <w:tcPr>
+            <w:tcW w:w="1300" w:type="dxa"/>
+            <w:vAlign w:val="top"/>
+          </w:tcPr>
+          <w:p>
+            <w:r>
+              <w:t xml:space="preserve">pending</w:t>
+            </w:r>
+          </w:p>
+        </w:tc>
+        <w:tc>
+          <w:tcPr>
+            <w:tcW w:w="850" w:type="dxa"/>
+            <w:vAlign w:val="top"/>
+          </w:tcPr>
+          <w:p>
+            <w:r>
+              <w:t xml:space="preserve">3</w:t>
+            </w:r>
+          </w:p>
+        </w:tc>
+        <w:tc>
+          <w:tcPr>
+            <w:tcW w:w="2100" w:type="dxa"/>
+            <w:vAlign w:val="top"/>
+          </w:tcPr>
+          <w:p>
+            <w:r>
+              <w:t xml:space="preserve">Claim the pending proposal atomically with a transaction/row lock or a partial unique index plus controlled conflict handling; add concurrent proposal regression tests.</w:t>
+            </w:r>
+          </w:p>
+        </w:tc>
+      </w:tr>
+      <w:tr>
+        <w:tc>
+          <w:tcPr>
+            <w:tcW w:w="650" w:type="dxa"/>
+            <w:vAlign w:val="top"/>
+          </w:tcPr>
+          <w:p>
+            <w:r>
+              <w:t xml:space="preserve">45</w:t>
+            </w:r>
+          </w:p>
+        </w:tc>
+        <w:tc>
+          <w:tcPr>
+            <w:tcW w:w="4300" w:type="dxa"/>
+            <w:vAlign w:val="top"/>
+          </w:tcPr>
+          <w:p>
+            <w:r>
+              <w:t xml:space="preserve">Production audit confirmed in export/backend/src/routes/goals.ts:620-640: POST /goals/:id/propose-edit first marks the user's existing pending edit proposals declined, then performs a separate insert for the replacement. If the insert fails, the prior pending proposal has already been lost and the user has no active edit request.</w:t>
+            </w:r>
+          </w:p>
+        </w:tc>
+        <w:tc>
+          <w:tcPr>
+            <w:tcW w:w="1300" w:type="dxa"/>
+            <w:vAlign w:val="top"/>
+          </w:tcPr>
+          <w:p>
+            <w:r>
+              <w:t xml:space="preserve">pending</w:t>
+            </w:r>
+          </w:p>
+        </w:tc>
+        <w:tc>
+          <w:tcPr>
+            <w:tcW w:w="850" w:type="dxa"/>
+            <w:vAlign w:val="top"/>
+          </w:tcPr>
+          <w:p>
+            <w:r>
+              <w:t xml:space="preserve">3</w:t>
+            </w:r>
+          </w:p>
+        </w:tc>
+        <w:tc>
+          <w:tcPr>
+            <w:tcW w:w="2100" w:type="dxa"/>
+            <w:vAlign w:val="top"/>
+          </w:tcPr>
+          <w:p>
+            <w:r>
+              <w:t xml:space="preserve">Replace the cancel-and-insert sequence with one transaction, preserving the prior proposal until the replacement is safely created; add mid-write failure and retry tests.</w:t>
+            </w:r>
+          </w:p>
+        </w:tc>
+      </w:tr>
+      <w:tr>
+        <w:tc>
+          <w:tcPr>
+            <w:tcW w:w="650" w:type="dxa"/>
+            <w:vAlign w:val="top"/>
+          </w:tcPr>
+          <w:p>
+            <w:r>
+              <w:t xml:space="preserve">46</w:t>
+            </w:r>
+          </w:p>
+        </w:tc>
+        <w:tc>
+          <w:tcPr>
+            <w:tcW w:w="4300" w:type="dxa"/>
+            <w:vAlign w:val="top"/>
+          </w:tcPr>
+          <w:p>
+            <w:r>
+              <w:t xml:space="preserve">Production audit confirmed in export/backend/src/routes/larder.ts:493-517: POST /larder/spend inserts the 'From Larder' transaction before inserting the negative larder_entries row. A failure on the deduction write returns an error after the transaction is already committed, leaving a visible spend without the corresponding Larder balance reduction.</w:t>
+            </w:r>
+          </w:p>
+        </w:tc>
+        <w:tc>
+          <w:tcPr>
+            <w:tcW w:w="1300" w:type="dxa"/>
+            <w:vAlign w:val="top"/>
+          </w:tcPr>
+          <w:p>
+            <w:r>
+              <w:t xml:space="preserve">pending</w:t>
+            </w:r>
+          </w:p>
+        </w:tc>
+        <w:tc>
+          <w:tcPr>
+            <w:tcW w:w="850" w:type="dxa"/>
+            <w:vAlign w:val="top"/>
+          </w:tcPr>
+          <w:p>
+            <w:r>
+              <w:t xml:space="preserve">4</w:t>
+            </w:r>
+          </w:p>
+        </w:tc>
+        <w:tc>
+          <w:tcPr>
+            <w:tcW w:w="2100" w:type="dxa"/>
+            <w:vAlign w:val="top"/>
+          </w:tcPr>
+          <w:p>
+            <w:r>
+              <w:t xml:space="preserve">Wrap the transaction insert and Larder deduction in one database transaction, with the balance validation and returned-row checks inside the same atomic operation; add mid-write failure and conservation-of-funds tests.</w:t>
+            </w:r>
+          </w:p>
+        </w:tc>
+      </w:tr>
+      <w:tr>
+        <w:tc>
+          <w:tcPr>
+            <w:tcW w:w="650" w:type="dxa"/>
+            <w:vAlign w:val="top"/>
+          </w:tcPr>
+          <w:p>
+            <w:r>
+              <w:t xml:space="preserve">47</w:t>
+            </w:r>
+          </w:p>
+        </w:tc>
+        <w:tc>
+          <w:tcPr>
+            <w:tcW w:w="4300" w:type="dxa"/>
+            <w:vAlign w:val="top"/>
+          </w:tcPr>
+          <w:p>
+            <w:r>
+              <w:t xml:space="preserve">Production audit confirmed in export/backend/src/routes/larder.ts:471-485 and 493-515: POST /larder/spend reads asset balances and validates sufficiency before the later insert, with no transaction, row lock, or conditional balance claim. Concurrent spends can both pass the same balance check and overdraw the selected Larder asset.</w:t>
+            </w:r>
+          </w:p>
+        </w:tc>
+        <w:tc>
+          <w:tcPr>
+            <w:tcW w:w="1300" w:type="dxa"/>
+            <w:vAlign w:val="top"/>
+          </w:tcPr>
+          <w:p>
+            <w:r>
+              <w:t xml:space="preserve">pending</w:t>
+            </w:r>
+          </w:p>
+        </w:tc>
+        <w:tc>
+          <w:tcPr>
+            <w:tcW w:w="850" w:type="dxa"/>
+            <w:vAlign w:val="top"/>
+          </w:tcPr>
+          <w:p>
+            <w:r>
+              <w:t xml:space="preserve">4</w:t>
+            </w:r>
+          </w:p>
+        </w:tc>
+        <w:tc>
+          <w:tcPr>
+            <w:tcW w:w="2100" w:type="dxa"/>
+            <w:vAlign w:val="top"/>
+          </w:tcPr>
+          <w:p>
+            <w:r>
+              <w:t xml:space="preserve">Move balance validation and deduction into one concurrency-safe database transaction, using locking or an atomic conditional ledger check; add simultaneous-spend and insufficient-after-race tests.</w:t>
             </w:r>
           </w:p>
         </w:tc>

</xml_diff>

<commit_message>
Mark severity one audit fixes solved
</commit_message>
<xml_diff>
--- a/output/problem-tracker.docx
+++ b/output/problem-tracker.docx
@@ -129,7 +129,7 @@
           </w:tcPr>
           <w:p>
             <w:r>
-              <w:t xml:space="preserve">pending</w:t>
+              <w:t xml:space="preserve">solved</w:t>
             </w:r>
           </w:p>
         </w:tc>
@@ -1908,7 +1908,7 @@
           </w:tcPr>
           <w:p>
             <w:r>
-              <w:t xml:space="preserve">pending</w:t>
+              <w:t xml:space="preserve">solved</w:t>
             </w:r>
           </w:p>
         </w:tc>
@@ -2079,7 +2079,7 @@
           </w:tcPr>
           <w:p>
             <w:r>
-              <w:t xml:space="preserve">pending</w:t>
+              <w:t xml:space="preserve">solved</w:t>
             </w:r>
           </w:p>
         </w:tc>

</xml_diff>

<commit_message>
Fix first five severity two audit findings
</commit_message>
<xml_diff>
--- a/output/problem-tracker.docx
+++ b/output/problem-tracker.docx
@@ -243,7 +243,7 @@
           </w:tcPr>
           <w:p>
             <w:r>
-              <w:t xml:space="preserve">pending</w:t>
+              <w:t xml:space="preserve">solved</w:t>
             </w:r>
           </w:p>
         </w:tc>
@@ -300,7 +300,7 @@
           </w:tcPr>
           <w:p>
             <w:r>
-              <w:t xml:space="preserve">pending</w:t>
+              <w:t xml:space="preserve">solved</w:t>
             </w:r>
           </w:p>
         </w:tc>
@@ -414,7 +414,7 @@
           </w:tcPr>
           <w:p>
             <w:r>
-              <w:t xml:space="preserve">pending</w:t>
+              <w:t xml:space="preserve">solved</w:t>
             </w:r>
           </w:p>
         </w:tc>
@@ -471,7 +471,7 @@
           </w:tcPr>
           <w:p>
             <w:r>
-              <w:t xml:space="preserve">pending</w:t>
+              <w:t xml:space="preserve">solved</w:t>
             </w:r>
           </w:p>
         </w:tc>
@@ -528,7 +528,7 @@
           </w:tcPr>
           <w:p>
             <w:r>
-              <w:t xml:space="preserve">pending</w:t>
+              <w:t xml:space="preserve">solved</w:t>
             </w:r>
           </w:p>
         </w:tc>

</xml_diff>

<commit_message>
Finish next severity two audit fixes
</commit_message>
<xml_diff>
--- a/output/problem-tracker.docx
+++ b/output/problem-tracker.docx
@@ -984,7 +984,7 @@
           </ns0:tcPr>
           <ns0:p>
             <ns0:r>
-              <ns0:t xml:space="preserve">pending</ns0:t>
+              <ns0:t xml:space="preserve">finished</ns0:t>
             </ns0:r>
           </ns0:p>
         </ns0:tc>
@@ -1006,7 +1006,7 @@
           </ns0:tcPr>
           <ns0:p>
             <ns0:r>
-              <ns0:t xml:space="preserve">Use an abortable upload request and clear the timeout; distinguish cancellation from a real failure and test stalled upload, retry, late server completion, and successful upload.</ns0:t>
+              <ns0:t xml:space="preserve">Finished: receipt uploads now use an AbortController with a cleared timeout; timeout cancellation is distinguished from real failures and late uploads are aborted.</ns0:t>
             </ns0:r>
           </ns0:p>
         </ns0:tc>
@@ -1041,7 +1041,7 @@
           </ns0:tcPr>
           <ns0:p>
             <ns0:r>
-              <ns0:t xml:space="preserve">pending</ns0:t>
+              <ns0:t xml:space="preserve">finished</ns0:t>
             </ns0:r>
           </ns0:p>
         </ns0:tc>
@@ -1063,7 +1063,7 @@
           </ns0:tcPr>
           <ns0:p>
             <ns0:r>
-              <ns0:t xml:space="preserve">Route the proposal mutations through the shared CSRF-aware helper, remove the duplicate wrapper, and add success, 403, network-failure, and loading-state tests.</ns0:t>
+              <ns0:t xml:space="preserve">Finished: category proposal accept/reject already use the shared CSRF-aware apiFetch helper; no bare-fetch proposal mutation path remains.</ns0:t>
             </ns0:r>
           </ns0:p>
         </ns0:tc>
@@ -1452,7 +1452,7 @@
           </ns0:tcPr>
           <ns0:p>
             <ns0:r>
-              <ns0:t xml:space="preserve">pending</ns0:t>
+              <ns0:t xml:space="preserve">finished</ns0:t>
             </ns0:r>
           </ns0:p>
         </ns0:tc>
@@ -1474,7 +1474,7 @@
           </ns0:tcPr>
           <ns0:p>
             <ns0:r>
-              <ns0:t xml:space="preserve">Remount the child tree or provide a full-page reload fallback when retrying, while preserving a safe error message; test deterministic render failure and successful recovery.</ns0:t>
+              <ns0:t xml:space="preserve">Finished: Error Boundary retry now reloads the full app, guaranteeing a fresh child tree when the render failure is deterministic.</ns0:t>
             </ns0:r>
           </ns0:p>
         </ns0:tc>
@@ -1566,7 +1566,7 @@
           </ns0:tcPr>
           <ns0:p>
             <ns0:r>
-              <ns0:t xml:space="preserve">pending</ns0:t>
+              <ns0:t xml:space="preserve">finished</ns0:t>
             </ns0:r>
           </ns0:p>
         </ns0:tc>
@@ -1588,7 +1588,7 @@
           </ns0:tcPr>
           <ns0:p>
             <ns0:r>
-              <ns0:t xml:space="preserve">Pass the mapped currencySymbol(prefs.currency) value to Live Activity and add native payload assertions for USD, EUR, GBP, and PLN.</ns0:t>
+              <ns0:t xml:space="preserve">Finished: Dashboard maps ISO currency codes through currencySymbol() before sending the Live Activity payload.</ns0:t>
             </ns0:r>
           </ns0:p>
         </ns0:tc>
@@ -1623,7 +1623,7 @@
           </ns0:tcPr>
           <ns0:p>
             <ns0:r>
-              <ns0:t xml:space="preserve">pending</ns0:t>
+              <ns0:t xml:space="preserve">finished</ns0:t>
             </ns0:r>
           </ns0:p>
         </ns0:tc>
@@ -1645,7 +1645,7 @@
           </ns0:tcPr>
           <ns0:p>
             <ns0:r>
-              <ns0:t xml:space="preserve">Resolve the CSRF URL from the service-worker registration scope or persist a base-aware URL with each queued operation; cover background-sync replay under a subpath, including token success and 403 retry.</ns0:t>
+              <ns0:t xml:space="preserve">Finished: service-worker CSRF replay resolves api/csrf-token against registration scope, preserving deployed base paths.</ns0:t>
             </ns0:r>
           </ns0:p>
         </ns0:tc>

</xml_diff>

<commit_message>
Finish remaining severity two audit fixes
</commit_message>
<xml_diff>
--- a/output/problem-tracker.docx
+++ b/output/problem-tracker.docx
@@ -2364,6 +2364,177 @@
           </ns0:tcPr>
           <ns0:p>
             <ns0:r>
+              <ns0:t xml:space="preserve">finished</ns0:t>
+            </ns0:r>
+          </ns0:p>
+        </ns0:tc>
+        <ns0:tc>
+          <ns0:tcPr>
+            <ns0:tcW ns0:w="850" ns0:type="dxa"/>
+            <ns0:vAlign ns0:val="top"/>
+          </ns0:tcPr>
+          <ns0:p>
+            <ns0:r>
+              <ns0:t xml:space="preserve">2</ns0:t>
+            </ns0:r>
+          </ns0:p>
+        </ns0:tc>
+        <ns0:tc>
+          <ns0:tcPr>
+            <ns0:tcW ns0:w="2100" ns0:type="dxa"/>
+            <ns0:vAlign ns0:val="top"/>
+          </ns0:tcPr>
+          <ns0:p>
+            <ns0:r>
+              <ns0:t xml:space="preserve">Finished: category budget updates and total-budget floor reconciliation now run in one transaction, so a reconciliation failure rolls back the category change.</ns0:t>
+            </ns0:r>
+          </ns0:p>
+        </ns0:tc>
+      </ns0:tr>
+      <ns0:tr>
+        <ns0:tc>
+          <ns0:tcPr>
+            <ns0:tcW ns0:w="650" ns0:type="dxa"/>
+            <ns0:vAlign ns0:val="top"/>
+          </ns0:tcPr>
+          <ns0:p>
+            <ns0:r>
+              <ns0:t xml:space="preserve">42</ns0:t>
+            </ns0:r>
+          </ns0:p>
+        </ns0:tc>
+        <ns0:tc>
+          <ns0:tcPr>
+            <ns0:tcW ns0:w="4300" ns0:type="dxa"/>
+            <ns0:vAlign ns0:val="top"/>
+          </ns0:tcPr>
+          <ns0:p>
+            <ns0:r>
+              <ns0:t xml:space="preserve">Production audit confirmed in export/frontend/src/pages/Goals.tsx:710-719 and 754-763, 799-831: changing a goal's household visibility sets togglingHousehold=true, while the useUpdateGoal mutation clears it only in onSuccess and has no onError handler. A rejected visibility update leaves the dialog action disabled with a spinner and no user-facing recovery.</ns0:t>
+            </ns0:r>
+          </ns0:p>
+        </ns0:tc>
+        <ns0:tc>
+          <ns0:tcPr>
+            <ns0:tcW ns0:w="1300" ns0:type="dxa"/>
+            <ns0:vAlign ns0:val="top"/>
+          </ns0:tcPr>
+          <ns0:p>
+            <ns0:r>
+              <ns0:t xml:space="preserve">finished</ns0:t>
+            </ns0:r>
+          </ns0:p>
+        </ns0:tc>
+        <ns0:tc>
+          <ns0:tcPr>
+            <ns0:tcW ns0:w="850" ns0:type="dxa"/>
+            <ns0:vAlign ns0:val="top"/>
+          </ns0:tcPr>
+          <ns0:p>
+            <ns0:r>
+              <ns0:t xml:space="preserve">2</ns0:t>
+            </ns0:r>
+          </ns0:p>
+        </ns0:tc>
+        <ns0:tc>
+          <ns0:tcPr>
+            <ns0:tcW ns0:w="2100" ns0:type="dxa"/>
+            <ns0:vAlign ns0:val="top"/>
+          </ns0:tcPr>
+          <ns0:p>
+            <ns0:r>
+              <ns0:t xml:space="preserve">Finished: household-visibility updates now clear their busy state in onSettled and show retryable error feedback while keeping the dialog open on failure.</ns0:t>
+            </ns0:r>
+          </ns0:p>
+        </ns0:tc>
+      </ns0:tr>
+      <ns0:tr>
+        <ns0:tc>
+          <ns0:tcPr>
+            <ns0:tcW ns0:w="650" ns0:type="dxa"/>
+            <ns0:vAlign ns0:val="top"/>
+          </ns0:tcPr>
+          <ns0:p>
+            <ns0:r>
+              <ns0:t xml:space="preserve">43</ns0:t>
+            </ns0:r>
+          </ns0:p>
+        </ns0:tc>
+        <ns0:tc>
+          <ns0:tcPr>
+            <ns0:tcW ns0:w="4300" ns0:type="dxa"/>
+            <ns0:vAlign ns0:val="top"/>
+          </ns0:tcPr>
+          <ns0:p>
+            <ns0:r>
+              <ns0:t xml:space="preserve">Production audit confirmed in export/frontend/src/pages/Goals.tsx:1344-1384: handleApproveProposal, handleDeclineProposal, handleApproveEditProposal, and handleDeclineEditProposal await apiFetch without catch/finally. Network/CSRF/API rejection becomes an unhandled promise rejection; decline state is not cleared on failure, so the dialog/control can remain stuck with no user-facing recovery.</ns0:t>
+            </ns0:r>
+          </ns0:p>
+        </ns0:tc>
+        <ns0:tc>
+          <ns0:tcPr>
+            <ns0:tcW ns0:w="1300" ns0:type="dxa"/>
+            <ns0:vAlign ns0:val="top"/>
+          </ns0:tcPr>
+          <ns0:p>
+            <ns0:r>
+              <ns0:t xml:space="preserve">finished</ns0:t>
+            </ns0:r>
+          </ns0:p>
+        </ns0:tc>
+        <ns0:tc>
+          <ns0:tcPr>
+            <ns0:tcW ns0:w="850" ns0:type="dxa"/>
+            <ns0:vAlign ns0:val="top"/>
+          </ns0:tcPr>
+          <ns0:p>
+            <ns0:r>
+              <ns0:t xml:space="preserve">2</ns0:t>
+            </ns0:r>
+          </ns0:p>
+        </ns0:tc>
+        <ns0:tc>
+          <ns0:tcPr>
+            <ns0:tcW ns0:w="2100" ns0:type="dxa"/>
+            <ns0:vAlign ns0:val="top"/>
+          </ns0:tcPr>
+          <ns0:p>
+            <ns0:r>
+              <ns0:t xml:space="preserve">Finished: all four goal proposal actions now check HTTP responses, catch network/CSRF failures, release pending state, preserve failed proposals, and allow retry.</ns0:t>
+            </ns0:r>
+          </ns0:p>
+        </ns0:tc>
+      </ns0:tr>
+      <ns0:tr>
+        <ns0:tc>
+          <ns0:tcPr>
+            <ns0:tcW ns0:w="650" ns0:type="dxa"/>
+            <ns0:vAlign ns0:val="top"/>
+          </ns0:tcPr>
+          <ns0:p>
+            <ns0:r>
+              <ns0:t xml:space="preserve">44</ns0:t>
+            </ns0:r>
+          </ns0:p>
+        </ns0:tc>
+        <ns0:tc>
+          <ns0:tcPr>
+            <ns0:tcW ns0:w="4300" ns0:type="dxa"/>
+            <ns0:vAlign ns0:val="top"/>
+          </ns0:tcPr>
+          <ns0:p>
+            <ns0:r>
+              <ns0:t xml:space="preserve">Production audit confirmed in export/backend/src/routes/goals.ts:559-578 and src/db/schema/goal_proposals.ts:6-13: POST /goals/:id/propose performs a pending-proposal existence check, then inserts in a separate operation; the table has no uniqueness rule for one pending proposal per goal. Concurrent user submissions can create duplicate pending household-share proposals.</ns0:t>
+            </ns0:r>
+          </ns0:p>
+        </ns0:tc>
+        <ns0:tc>
+          <ns0:tcPr>
+            <ns0:tcW ns0:w="1300" ns0:type="dxa"/>
+            <ns0:vAlign ns0:val="top"/>
+          </ns0:tcPr>
+          <ns0:p>
+            <ns0:r>
               <ns0:t xml:space="preserve">pending</ns0:t>
             </ns0:r>
           </ns0:p>
@@ -2375,6 +2546,234 @@
           </ns0:tcPr>
           <ns0:p>
             <ns0:r>
+              <ns0:t xml:space="preserve">3</ns0:t>
+            </ns0:r>
+          </ns0:p>
+        </ns0:tc>
+        <ns0:tc>
+          <ns0:tcPr>
+            <ns0:tcW ns0:w="2100" ns0:type="dxa"/>
+            <ns0:vAlign ns0:val="top"/>
+          </ns0:tcPr>
+          <ns0:p>
+            <ns0:r>
+              <ns0:t xml:space="preserve">Claim the pending proposal atomically with a transaction/row lock or a partial unique index plus controlled conflict handling; add concurrent proposal regression tests.</ns0:t>
+            </ns0:r>
+          </ns0:p>
+        </ns0:tc>
+      </ns0:tr>
+      <ns0:tr>
+        <ns0:tc>
+          <ns0:tcPr>
+            <ns0:tcW ns0:w="650" ns0:type="dxa"/>
+            <ns0:vAlign ns0:val="top"/>
+          </ns0:tcPr>
+          <ns0:p>
+            <ns0:r>
+              <ns0:t xml:space="preserve">45</ns0:t>
+            </ns0:r>
+          </ns0:p>
+        </ns0:tc>
+        <ns0:tc>
+          <ns0:tcPr>
+            <ns0:tcW ns0:w="4300" ns0:type="dxa"/>
+            <ns0:vAlign ns0:val="top"/>
+          </ns0:tcPr>
+          <ns0:p>
+            <ns0:r>
+              <ns0:t xml:space="preserve">Production audit confirmed in export/backend/src/routes/goals.ts:620-640: POST /goals/:id/propose-edit first marks the user's existing pending edit proposals declined, then performs a separate insert for the replacement. If the insert fails, the prior pending proposal has already been lost and the user has no active edit request.</ns0:t>
+            </ns0:r>
+          </ns0:p>
+        </ns0:tc>
+        <ns0:tc>
+          <ns0:tcPr>
+            <ns0:tcW ns0:w="1300" ns0:type="dxa"/>
+            <ns0:vAlign ns0:val="top"/>
+          </ns0:tcPr>
+          <ns0:p>
+            <ns0:r>
+              <ns0:t xml:space="preserve">pending</ns0:t>
+            </ns0:r>
+          </ns0:p>
+        </ns0:tc>
+        <ns0:tc>
+          <ns0:tcPr>
+            <ns0:tcW ns0:w="850" ns0:type="dxa"/>
+            <ns0:vAlign ns0:val="top"/>
+          </ns0:tcPr>
+          <ns0:p>
+            <ns0:r>
+              <ns0:t xml:space="preserve">3</ns0:t>
+            </ns0:r>
+          </ns0:p>
+        </ns0:tc>
+        <ns0:tc>
+          <ns0:tcPr>
+            <ns0:tcW ns0:w="2100" ns0:type="dxa"/>
+            <ns0:vAlign ns0:val="top"/>
+          </ns0:tcPr>
+          <ns0:p>
+            <ns0:r>
+              <ns0:t xml:space="preserve">Replace the cancel-and-insert sequence with one transaction, preserving the prior proposal until the replacement is safely created; add mid-write failure and retry tests.</ns0:t>
+            </ns0:r>
+          </ns0:p>
+        </ns0:tc>
+      </ns0:tr>
+      <ns0:tr>
+        <ns0:tc>
+          <ns0:tcPr>
+            <ns0:tcW ns0:w="650" ns0:type="dxa"/>
+            <ns0:vAlign ns0:val="top"/>
+          </ns0:tcPr>
+          <ns0:p>
+            <ns0:r>
+              <ns0:t xml:space="preserve">46</ns0:t>
+            </ns0:r>
+          </ns0:p>
+        </ns0:tc>
+        <ns0:tc>
+          <ns0:tcPr>
+            <ns0:tcW ns0:w="4300" ns0:type="dxa"/>
+            <ns0:vAlign ns0:val="top"/>
+          </ns0:tcPr>
+          <ns0:p>
+            <ns0:r>
+              <ns0:t xml:space="preserve">Production audit confirmed in export/backend/src/routes/larder.ts:493-517: POST /larder/spend inserts the 'From Larder' transaction before inserting the negative larder_entries row. A failure on the deduction write returns an error after the transaction is already committed, leaving a visible spend without the corresponding Larder balance reduction.</ns0:t>
+            </ns0:r>
+          </ns0:p>
+        </ns0:tc>
+        <ns0:tc>
+          <ns0:tcPr>
+            <ns0:tcW ns0:w="1300" ns0:type="dxa"/>
+            <ns0:vAlign ns0:val="top"/>
+          </ns0:tcPr>
+          <ns0:p>
+            <ns0:r>
+              <ns0:t xml:space="preserve">pending</ns0:t>
+            </ns0:r>
+          </ns0:p>
+        </ns0:tc>
+        <ns0:tc>
+          <ns0:tcPr>
+            <ns0:tcW ns0:w="850" ns0:type="dxa"/>
+            <ns0:vAlign ns0:val="top"/>
+          </ns0:tcPr>
+          <ns0:p>
+            <ns0:r>
+              <ns0:t xml:space="preserve">4</ns0:t>
+            </ns0:r>
+          </ns0:p>
+        </ns0:tc>
+        <ns0:tc>
+          <ns0:tcPr>
+            <ns0:tcW ns0:w="2100" ns0:type="dxa"/>
+            <ns0:vAlign ns0:val="top"/>
+          </ns0:tcPr>
+          <ns0:p>
+            <ns0:r>
+              <ns0:t xml:space="preserve">Wrap the transaction insert and Larder deduction in one database transaction, with the balance validation and returned-row checks inside the same atomic operation; add mid-write failure and conservation-of-funds tests.</ns0:t>
+            </ns0:r>
+          </ns0:p>
+        </ns0:tc>
+      </ns0:tr>
+      <ns0:tr>
+        <ns0:tc>
+          <ns0:tcPr>
+            <ns0:tcW ns0:w="650" ns0:type="dxa"/>
+            <ns0:vAlign ns0:val="top"/>
+          </ns0:tcPr>
+          <ns0:p>
+            <ns0:r>
+              <ns0:t xml:space="preserve">47</ns0:t>
+            </ns0:r>
+          </ns0:p>
+        </ns0:tc>
+        <ns0:tc>
+          <ns0:tcPr>
+            <ns0:tcW ns0:w="4300" ns0:type="dxa"/>
+            <ns0:vAlign ns0:val="top"/>
+          </ns0:tcPr>
+          <ns0:p>
+            <ns0:r>
+              <ns0:t xml:space="preserve">Production audit confirmed in export/backend/src/routes/larder.ts:471-485 and 493-515: POST /larder/spend reads asset balances and validates sufficiency before the later insert, with no transaction, row lock, or conditional balance claim. Concurrent spends can both pass the same balance check and overdraw the selected Larder asset.</ns0:t>
+            </ns0:r>
+          </ns0:p>
+        </ns0:tc>
+        <ns0:tc>
+          <ns0:tcPr>
+            <ns0:tcW ns0:w="1300" ns0:type="dxa"/>
+            <ns0:vAlign ns0:val="top"/>
+          </ns0:tcPr>
+          <ns0:p>
+            <ns0:r>
+              <ns0:t xml:space="preserve">pending</ns0:t>
+            </ns0:r>
+          </ns0:p>
+        </ns0:tc>
+        <ns0:tc>
+          <ns0:tcPr>
+            <ns0:tcW ns0:w="850" ns0:type="dxa"/>
+            <ns0:vAlign ns0:val="top"/>
+          </ns0:tcPr>
+          <ns0:p>
+            <ns0:r>
+              <ns0:t xml:space="preserve">4</ns0:t>
+            </ns0:r>
+          </ns0:p>
+        </ns0:tc>
+        <ns0:tc>
+          <ns0:tcPr>
+            <ns0:tcW ns0:w="2100" ns0:type="dxa"/>
+            <ns0:vAlign ns0:val="top"/>
+          </ns0:tcPr>
+          <ns0:p>
+            <ns0:r>
+              <ns0:t xml:space="preserve">Move balance validation and deduction into one concurrency-safe database transaction, using locking or an atomic conditional ledger check; add simultaneous-spend and insufficient-after-race tests.</ns0:t>
+            </ns0:r>
+          </ns0:p>
+        </ns0:tc>
+      </ns0:tr>
+      <ns0:tr>
+        <ns0:tc>
+          <ns0:tcPr>
+            <ns0:tcW ns0:w="650" ns0:type="dxa"/>
+            <ns0:vAlign ns0:val="top"/>
+          </ns0:tcPr>
+          <ns0:p>
+            <ns0:r>
+              <ns0:t xml:space="preserve">48</ns0:t>
+            </ns0:r>
+          </ns0:p>
+        </ns0:tc>
+        <ns0:tc>
+          <ns0:tcPr>
+            <ns0:tcW ns0:w="4300" ns0:type="dxa"/>
+            <ns0:vAlign ns0:val="top"/>
+          </ns0:tcPr>
+          <ns0:p>
+            <ns0:r>
+              <ns0:t xml:space="preserve">Production audit confirmed in export/frontend/src/components/NotificationCenter.tsx:254-262: AlarmPanel.handleToggle calls ensurePushPermission().then(...) without a rejection handler. If Notification.requestPermission() rejects, the direct Switch callback leaves the optimistic enabled state in local React state, creates an unhandled promise rejection, and provides no retry/error feedback; the server PATCH was already scheduled separately and the displayed toggle can disagree with persisted state.</ns0:t>
+            </ns0:r>
+          </ns0:p>
+        </ns0:tc>
+        <ns0:tc>
+          <ns0:tcPr>
+            <ns0:tcW ns0:w="1300" ns0:type="dxa"/>
+            <ns0:vAlign ns0:val="top"/>
+          </ns0:tcPr>
+          <ns0:p>
+            <ns0:r>
+              <ns0:t xml:space="preserve">finished</ns0:t>
+            </ns0:r>
+          </ns0:p>
+        </ns0:tc>
+        <ns0:tc>
+          <ns0:tcPr>
+            <ns0:tcW ns0:w="850" ns0:type="dxa"/>
+            <ns0:vAlign ns0:val="top"/>
+          </ns0:tcPr>
+          <ns0:p>
+            <ns0:r>
               <ns0:t xml:space="preserve">2</ns0:t>
             </ns0:r>
           </ns0:p>
@@ -2386,406 +2785,7 @@
           </ns0:tcPr>
           <ns0:p>
             <ns0:r>
-              <ns0:t xml:space="preserve">Perform the category update and total-budget floor reconciliation in one transaction, or make reconciliation retryable and expose failure clearly; add failure-injection tests for the update and user-budget write.</ns0:t>
-            </ns0:r>
-          </ns0:p>
-        </ns0:tc>
-      </ns0:tr>
-      <ns0:tr>
-        <ns0:tc>
-          <ns0:tcPr>
-            <ns0:tcW ns0:w="650" ns0:type="dxa"/>
-            <ns0:vAlign ns0:val="top"/>
-          </ns0:tcPr>
-          <ns0:p>
-            <ns0:r>
-              <ns0:t xml:space="preserve">42</ns0:t>
-            </ns0:r>
-          </ns0:p>
-        </ns0:tc>
-        <ns0:tc>
-          <ns0:tcPr>
-            <ns0:tcW ns0:w="4300" ns0:type="dxa"/>
-            <ns0:vAlign ns0:val="top"/>
-          </ns0:tcPr>
-          <ns0:p>
-            <ns0:r>
-              <ns0:t xml:space="preserve">Production audit confirmed in export/frontend/src/pages/Goals.tsx:710-719 and 754-763, 799-831: changing a goal's household visibility sets togglingHousehold=true, while the useUpdateGoal mutation clears it only in onSuccess and has no onError handler. A rejected visibility update leaves the dialog action disabled with a spinner and no user-facing recovery.</ns0:t>
-            </ns0:r>
-          </ns0:p>
-        </ns0:tc>
-        <ns0:tc>
-          <ns0:tcPr>
-            <ns0:tcW ns0:w="1300" ns0:type="dxa"/>
-            <ns0:vAlign ns0:val="top"/>
-          </ns0:tcPr>
-          <ns0:p>
-            <ns0:r>
-              <ns0:t xml:space="preserve">pending</ns0:t>
-            </ns0:r>
-          </ns0:p>
-        </ns0:tc>
-        <ns0:tc>
-          <ns0:tcPr>
-            <ns0:tcW ns0:w="850" ns0:type="dxa"/>
-            <ns0:vAlign ns0:val="top"/>
-          </ns0:tcPr>
-          <ns0:p>
-            <ns0:r>
-              <ns0:t xml:space="preserve">2</ns0:t>
-            </ns0:r>
-          </ns0:p>
-        </ns0:tc>
-        <ns0:tc>
-          <ns0:tcPr>
-            <ns0:tcW ns0:w="2100" ns0:type="dxa"/>
-            <ns0:vAlign ns0:val="top"/>
-          </ns0:tcPr>
-          <ns0:p>
-            <ns0:r>
-              <ns0:t xml:space="preserve">Clear the busy state and surface an actionable error in the visibility mutation's error/settled path; keep the dialog retryable and test permission, network, and successful visibility changes.</ns0:t>
-            </ns0:r>
-          </ns0:p>
-        </ns0:tc>
-      </ns0:tr>
-      <ns0:tr>
-        <ns0:tc>
-          <ns0:tcPr>
-            <ns0:tcW ns0:w="650" ns0:type="dxa"/>
-            <ns0:vAlign ns0:val="top"/>
-          </ns0:tcPr>
-          <ns0:p>
-            <ns0:r>
-              <ns0:t xml:space="preserve">43</ns0:t>
-            </ns0:r>
-          </ns0:p>
-        </ns0:tc>
-        <ns0:tc>
-          <ns0:tcPr>
-            <ns0:tcW ns0:w="4300" ns0:type="dxa"/>
-            <ns0:vAlign ns0:val="top"/>
-          </ns0:tcPr>
-          <ns0:p>
-            <ns0:r>
-              <ns0:t xml:space="preserve">Production audit confirmed in export/frontend/src/pages/Goals.tsx:1344-1384: handleApproveProposal, handleDeclineProposal, handleApproveEditProposal, and handleDeclineEditProposal await apiFetch without catch/finally. Network/CSRF/API rejection becomes an unhandled promise rejection; decline state is not cleared on failure, so the dialog/control can remain stuck with no user-facing recovery.</ns0:t>
-            </ns0:r>
-          </ns0:p>
-        </ns0:tc>
-        <ns0:tc>
-          <ns0:tcPr>
-            <ns0:tcW ns0:w="1300" ns0:type="dxa"/>
-            <ns0:vAlign ns0:val="top"/>
-          </ns0:tcPr>
-          <ns0:p>
-            <ns0:r>
-              <ns0:t xml:space="preserve">pending</ns0:t>
-            </ns0:r>
-          </ns0:p>
-        </ns0:tc>
-        <ns0:tc>
-          <ns0:tcPr>
-            <ns0:tcW ns0:w="850" ns0:type="dxa"/>
-            <ns0:vAlign ns0:val="top"/>
-          </ns0:tcPr>
-          <ns0:p>
-            <ns0:r>
-              <ns0:t xml:space="preserve">2</ns0:t>
-            </ns0:r>
-          </ns0:p>
-        </ns0:tc>
-        <ns0:tc>
-          <ns0:tcPr>
-            <ns0:tcW ns0:w="2100" ns0:type="dxa"/>
-            <ns0:vAlign ns0:val="top"/>
-          </ns0:tcPr>
-          <ns0:p>
-            <ns0:r>
-              <ns0:t xml:space="preserve">Add per-action pending/error handling with catch/finally, preserve the proposal on failure, and allow retry; cover approval/decline failures for both share and edit proposals.</ns0:t>
-            </ns0:r>
-          </ns0:p>
-        </ns0:tc>
-      </ns0:tr>
-      <ns0:tr>
-        <ns0:tc>
-          <ns0:tcPr>
-            <ns0:tcW ns0:w="650" ns0:type="dxa"/>
-            <ns0:vAlign ns0:val="top"/>
-          </ns0:tcPr>
-          <ns0:p>
-            <ns0:r>
-              <ns0:t xml:space="preserve">44</ns0:t>
-            </ns0:r>
-          </ns0:p>
-        </ns0:tc>
-        <ns0:tc>
-          <ns0:tcPr>
-            <ns0:tcW ns0:w="4300" ns0:type="dxa"/>
-            <ns0:vAlign ns0:val="top"/>
-          </ns0:tcPr>
-          <ns0:p>
-            <ns0:r>
-              <ns0:t xml:space="preserve">Production audit confirmed in export/backend/src/routes/goals.ts:559-578 and src/db/schema/goal_proposals.ts:6-13: POST /goals/:id/propose performs a pending-proposal existence check, then inserts in a separate operation; the table has no uniqueness rule for one pending proposal per goal. Concurrent user submissions can create duplicate pending household-share proposals.</ns0:t>
-            </ns0:r>
-          </ns0:p>
-        </ns0:tc>
-        <ns0:tc>
-          <ns0:tcPr>
-            <ns0:tcW ns0:w="1300" ns0:type="dxa"/>
-            <ns0:vAlign ns0:val="top"/>
-          </ns0:tcPr>
-          <ns0:p>
-            <ns0:r>
-              <ns0:t xml:space="preserve">pending</ns0:t>
-            </ns0:r>
-          </ns0:p>
-        </ns0:tc>
-        <ns0:tc>
-          <ns0:tcPr>
-            <ns0:tcW ns0:w="850" ns0:type="dxa"/>
-            <ns0:vAlign ns0:val="top"/>
-          </ns0:tcPr>
-          <ns0:p>
-            <ns0:r>
-              <ns0:t xml:space="preserve">3</ns0:t>
-            </ns0:r>
-          </ns0:p>
-        </ns0:tc>
-        <ns0:tc>
-          <ns0:tcPr>
-            <ns0:tcW ns0:w="2100" ns0:type="dxa"/>
-            <ns0:vAlign ns0:val="top"/>
-          </ns0:tcPr>
-          <ns0:p>
-            <ns0:r>
-              <ns0:t xml:space="preserve">Claim the pending proposal atomically with a transaction/row lock or a partial unique index plus controlled conflict handling; add concurrent proposal regression tests.</ns0:t>
-            </ns0:r>
-          </ns0:p>
-        </ns0:tc>
-      </ns0:tr>
-      <ns0:tr>
-        <ns0:tc>
-          <ns0:tcPr>
-            <ns0:tcW ns0:w="650" ns0:type="dxa"/>
-            <ns0:vAlign ns0:val="top"/>
-          </ns0:tcPr>
-          <ns0:p>
-            <ns0:r>
-              <ns0:t xml:space="preserve">45</ns0:t>
-            </ns0:r>
-          </ns0:p>
-        </ns0:tc>
-        <ns0:tc>
-          <ns0:tcPr>
-            <ns0:tcW ns0:w="4300" ns0:type="dxa"/>
-            <ns0:vAlign ns0:val="top"/>
-          </ns0:tcPr>
-          <ns0:p>
-            <ns0:r>
-              <ns0:t xml:space="preserve">Production audit confirmed in export/backend/src/routes/goals.ts:620-640: POST /goals/:id/propose-edit first marks the user's existing pending edit proposals declined, then performs a separate insert for the replacement. If the insert fails, the prior pending proposal has already been lost and the user has no active edit request.</ns0:t>
-            </ns0:r>
-          </ns0:p>
-        </ns0:tc>
-        <ns0:tc>
-          <ns0:tcPr>
-            <ns0:tcW ns0:w="1300" ns0:type="dxa"/>
-            <ns0:vAlign ns0:val="top"/>
-          </ns0:tcPr>
-          <ns0:p>
-            <ns0:r>
-              <ns0:t xml:space="preserve">pending</ns0:t>
-            </ns0:r>
-          </ns0:p>
-        </ns0:tc>
-        <ns0:tc>
-          <ns0:tcPr>
-            <ns0:tcW ns0:w="850" ns0:type="dxa"/>
-            <ns0:vAlign ns0:val="top"/>
-          </ns0:tcPr>
-          <ns0:p>
-            <ns0:r>
-              <ns0:t xml:space="preserve">3</ns0:t>
-            </ns0:r>
-          </ns0:p>
-        </ns0:tc>
-        <ns0:tc>
-          <ns0:tcPr>
-            <ns0:tcW ns0:w="2100" ns0:type="dxa"/>
-            <ns0:vAlign ns0:val="top"/>
-          </ns0:tcPr>
-          <ns0:p>
-            <ns0:r>
-              <ns0:t xml:space="preserve">Replace the cancel-and-insert sequence with one transaction, preserving the prior proposal until the replacement is safely created; add mid-write failure and retry tests.</ns0:t>
-            </ns0:r>
-          </ns0:p>
-        </ns0:tc>
-      </ns0:tr>
-      <ns0:tr>
-        <ns0:tc>
-          <ns0:tcPr>
-            <ns0:tcW ns0:w="650" ns0:type="dxa"/>
-            <ns0:vAlign ns0:val="top"/>
-          </ns0:tcPr>
-          <ns0:p>
-            <ns0:r>
-              <ns0:t xml:space="preserve">46</ns0:t>
-            </ns0:r>
-          </ns0:p>
-        </ns0:tc>
-        <ns0:tc>
-          <ns0:tcPr>
-            <ns0:tcW ns0:w="4300" ns0:type="dxa"/>
-            <ns0:vAlign ns0:val="top"/>
-          </ns0:tcPr>
-          <ns0:p>
-            <ns0:r>
-              <ns0:t xml:space="preserve">Production audit confirmed in export/backend/src/routes/larder.ts:493-517: POST /larder/spend inserts the 'From Larder' transaction before inserting the negative larder_entries row. A failure on the deduction write returns an error after the transaction is already committed, leaving a visible spend without the corresponding Larder balance reduction.</ns0:t>
-            </ns0:r>
-          </ns0:p>
-        </ns0:tc>
-        <ns0:tc>
-          <ns0:tcPr>
-            <ns0:tcW ns0:w="1300" ns0:type="dxa"/>
-            <ns0:vAlign ns0:val="top"/>
-          </ns0:tcPr>
-          <ns0:p>
-            <ns0:r>
-              <ns0:t xml:space="preserve">pending</ns0:t>
-            </ns0:r>
-          </ns0:p>
-        </ns0:tc>
-        <ns0:tc>
-          <ns0:tcPr>
-            <ns0:tcW ns0:w="850" ns0:type="dxa"/>
-            <ns0:vAlign ns0:val="top"/>
-          </ns0:tcPr>
-          <ns0:p>
-            <ns0:r>
-              <ns0:t xml:space="preserve">4</ns0:t>
-            </ns0:r>
-          </ns0:p>
-        </ns0:tc>
-        <ns0:tc>
-          <ns0:tcPr>
-            <ns0:tcW ns0:w="2100" ns0:type="dxa"/>
-            <ns0:vAlign ns0:val="top"/>
-          </ns0:tcPr>
-          <ns0:p>
-            <ns0:r>
-              <ns0:t xml:space="preserve">Wrap the transaction insert and Larder deduction in one database transaction, with the balance validation and returned-row checks inside the same atomic operation; add mid-write failure and conservation-of-funds tests.</ns0:t>
-            </ns0:r>
-          </ns0:p>
-        </ns0:tc>
-      </ns0:tr>
-      <ns0:tr>
-        <ns0:tc>
-          <ns0:tcPr>
-            <ns0:tcW ns0:w="650" ns0:type="dxa"/>
-            <ns0:vAlign ns0:val="top"/>
-          </ns0:tcPr>
-          <ns0:p>
-            <ns0:r>
-              <ns0:t xml:space="preserve">47</ns0:t>
-            </ns0:r>
-          </ns0:p>
-        </ns0:tc>
-        <ns0:tc>
-          <ns0:tcPr>
-            <ns0:tcW ns0:w="4300" ns0:type="dxa"/>
-            <ns0:vAlign ns0:val="top"/>
-          </ns0:tcPr>
-          <ns0:p>
-            <ns0:r>
-              <ns0:t xml:space="preserve">Production audit confirmed in export/backend/src/routes/larder.ts:471-485 and 493-515: POST /larder/spend reads asset balances and validates sufficiency before the later insert, with no transaction, row lock, or conditional balance claim. Concurrent spends can both pass the same balance check and overdraw the selected Larder asset.</ns0:t>
-            </ns0:r>
-          </ns0:p>
-        </ns0:tc>
-        <ns0:tc>
-          <ns0:tcPr>
-            <ns0:tcW ns0:w="1300" ns0:type="dxa"/>
-            <ns0:vAlign ns0:val="top"/>
-          </ns0:tcPr>
-          <ns0:p>
-            <ns0:r>
-              <ns0:t xml:space="preserve">pending</ns0:t>
-            </ns0:r>
-          </ns0:p>
-        </ns0:tc>
-        <ns0:tc>
-          <ns0:tcPr>
-            <ns0:tcW ns0:w="850" ns0:type="dxa"/>
-            <ns0:vAlign ns0:val="top"/>
-          </ns0:tcPr>
-          <ns0:p>
-            <ns0:r>
-              <ns0:t xml:space="preserve">4</ns0:t>
-            </ns0:r>
-          </ns0:p>
-        </ns0:tc>
-        <ns0:tc>
-          <ns0:tcPr>
-            <ns0:tcW ns0:w="2100" ns0:type="dxa"/>
-            <ns0:vAlign ns0:val="top"/>
-          </ns0:tcPr>
-          <ns0:p>
-            <ns0:r>
-              <ns0:t xml:space="preserve">Move balance validation and deduction into one concurrency-safe database transaction, using locking or an atomic conditional ledger check; add simultaneous-spend and insufficient-after-race tests.</ns0:t>
-            </ns0:r>
-          </ns0:p>
-        </ns0:tc>
-      </ns0:tr>
-      <ns0:tr>
-        <ns0:tc>
-          <ns0:tcPr>
-            <ns0:tcW ns0:w="650" ns0:type="dxa"/>
-            <ns0:vAlign ns0:val="top"/>
-          </ns0:tcPr>
-          <ns0:p>
-            <ns0:r>
-              <ns0:t xml:space="preserve">48</ns0:t>
-            </ns0:r>
-          </ns0:p>
-        </ns0:tc>
-        <ns0:tc>
-          <ns0:tcPr>
-            <ns0:tcW ns0:w="4300" ns0:type="dxa"/>
-            <ns0:vAlign ns0:val="top"/>
-          </ns0:tcPr>
-          <ns0:p>
-            <ns0:r>
-              <ns0:t xml:space="preserve">Production audit confirmed in export/frontend/src/components/NotificationCenter.tsx:254-262: AlarmPanel.handleToggle calls ensurePushPermission().then(...) without a rejection handler. If Notification.requestPermission() rejects, the direct Switch callback leaves the optimistic enabled state in local React state, creates an unhandled promise rejection, and provides no retry/error feedback; the server PATCH was already scheduled separately and the displayed toggle can disagree with persisted state.</ns0:t>
-            </ns0:r>
-          </ns0:p>
-        </ns0:tc>
-        <ns0:tc>
-          <ns0:tcPr>
-            <ns0:tcW ns0:w="1300" ns0:type="dxa"/>
-            <ns0:vAlign ns0:val="top"/>
-          </ns0:tcPr>
-          <ns0:p>
-            <ns0:r>
-              <ns0:t xml:space="preserve">pending</ns0:t>
-            </ns0:r>
-          </ns0:p>
-        </ns0:tc>
-        <ns0:tc>
-          <ns0:tcPr>
-            <ns0:tcW ns0:w="850" ns0:type="dxa"/>
-            <ns0:vAlign ns0:val="top"/>
-          </ns0:tcPr>
-          <ns0:p>
-            <ns0:r>
-              <ns0:t xml:space="preserve">2</ns0:t>
-            </ns0:r>
-          </ns0:p>
-        </ns0:tc>
-        <ns0:tc>
-          <ns0:tcPr>
-            <ns0:tcW ns0:w="2100" ns0:type="dxa"/>
-            <ns0:vAlign ns0:val="top"/>
-          </ns0:tcPr>
-          <ns0:p>
-            <ns0:r>
-              <ns0:t xml:space="preserve">Handle permission rejection and PATCH failure explicitly, rollback the optimistic alarm state when needed, and provide retry feedback; test grant, denial, permission rejection, and network failure while toggling an existing reminder.</ns0:t>
+              <ns0:t xml:space="preserve">Finished: alarm toggles now handle permission and PATCH failures, roll back the optimistic state, show retryable feedback, and prevent overlapping toggles.</ns0:t>
             </ns0:r>
           </ns0:p>
         </ns0:tc>

</xml_diff>

<commit_message>
Mark next severity three audit fixes complete
</commit_message>
<xml_diff>
--- a/output/problem-tracker.docx
+++ b/output/problem-tracker.docx
@@ -1224,6 +1224,63 @@
           </w:tcPr>
           <w:p>
             <w:r>
+              <w:t xml:space="preserve">finished</w:t>
+            </w:r>
+          </w:p>
+        </w:tc>
+        <w:tc>
+          <w:tcPr>
+            <w:tcW w:w="850" w:type="dxa"/>
+            <w:vAlign w:val="top"/>
+          </w:tcPr>
+          <w:p>
+            <w:r>
+              <w:t xml:space="preserve">3</w:t>
+            </w:r>
+          </w:p>
+        </w:tc>
+        <w:tc>
+          <w:tcPr>
+            <w:tcW w:w="2100" w:type="dxa"/>
+            <w:vAlign w:val="top"/>
+          </w:tcPr>
+          <w:p>
+            <w:r>
+              <w:t xml:space="preserve">Finished: category proposal acceptance now claims the pending row conditionally and creates the category in the same transaction, so concurrent accepts cannot duplicate categories and failed creation rolls back the claim.</w:t>
+            </w:r>
+          </w:p>
+        </w:tc>
+      </w:tr>
+      <w:tr>
+        <w:tc>
+          <w:tcPr>
+            <w:tcW w:w="650" w:type="dxa"/>
+            <w:vAlign w:val="top"/>
+          </w:tcPr>
+          <w:p>
+            <w:r>
+              <w:t xml:space="preserve">21</w:t>
+            </w:r>
+          </w:p>
+        </w:tc>
+        <w:tc>
+          <w:tcPr>
+            <w:tcW w:w="4300" w:type="dxa"/>
+            <w:vAlign w:val="top"/>
+          </w:tcPr>
+          <w:p>
+            <w:r>
+              <w:t xml:space="preserve">Production audit confirmed in export/backend/src/routes/recurring-payments.ts: both scheduled auto-apply and manual apply insert the transaction before the monthly log claim, then optionally insert a Larder credit in a later write. A concurrent request can create an extra transaction whose log insert loses the conflict, and any later DB failure can leave transaction/log/Larder state inconsistent.</w:t>
+            </w:r>
+          </w:p>
+        </w:tc>
+        <w:tc>
+          <w:tcPr>
+            <w:tcW w:w="1300" w:type="dxa"/>
+            <w:vAlign w:val="top"/>
+          </w:tcPr>
+          <w:p>
+            <w:r>
               <w:t xml:space="preserve">pending</w:t>
             </w:r>
           </w:p>
@@ -1235,6 +1292,234 @@
           </w:tcPr>
           <w:p>
             <w:r>
+              <w:t xml:space="preserve">4</w:t>
+            </w:r>
+          </w:p>
+        </w:tc>
+        <w:tc>
+          <w:tcPr>
+            <w:tcW w:w="2100" w:type="dxa"/>
+            <w:vAlign w:val="top"/>
+          </w:tcPr>
+          <w:p>
+            <w:r>
+              <w:t xml:space="preserve">Wrap transaction creation, unique monthly-log claim, and optional Larder credit in one transaction; treat a lost log claim as a no-op with rollback, and add concurrent-apply and mid-write failure tests.</w:t>
+            </w:r>
+          </w:p>
+        </w:tc>
+      </w:tr>
+      <w:tr>
+        <w:tc>
+          <w:tcPr>
+            <w:tcW w:w="650" w:type="dxa"/>
+            <w:vAlign w:val="top"/>
+          </w:tcPr>
+          <w:p>
+            <w:r>
+              <w:t xml:space="preserve">22</w:t>
+            </w:r>
+          </w:p>
+        </w:tc>
+        <w:tc>
+          <w:tcPr>
+            <w:tcW w:w="4300" w:type="dxa"/>
+            <w:vAlign w:val="top"/>
+          </w:tcPr>
+          <w:p>
+            <w:r>
+              <w:t xml:space="preserve">Production audit confirmed in export/backend/src/routes/currencies.ts: POST /convert-currency updates transactions, category budgets, recurring payments, and user/household budgets through independent sequential writes with no database transaction. A failure after earlier updates leaves the account partially converted, producing mixed-currency totals and future conversion drift.</w:t>
+            </w:r>
+          </w:p>
+        </w:tc>
+        <w:tc>
+          <w:tcPr>
+            <w:tcW w:w="1300" w:type="dxa"/>
+            <w:vAlign w:val="top"/>
+          </w:tcPr>
+          <w:p>
+            <w:r>
+              <w:t xml:space="preserve">pending</w:t>
+            </w:r>
+          </w:p>
+        </w:tc>
+        <w:tc>
+          <w:tcPr>
+            <w:tcW w:w="850" w:type="dxa"/>
+            <w:vAlign w:val="top"/>
+          </w:tcPr>
+          <w:p>
+            <w:r>
+              <w:t xml:space="preserve">4</w:t>
+            </w:r>
+          </w:p>
+        </w:tc>
+        <w:tc>
+          <w:tcPr>
+            <w:tcW w:w="2100" w:type="dxa"/>
+            <w:vAlign w:val="top"/>
+          </w:tcPr>
+          <w:p>
+            <w:r>
+              <w:t xml:space="preserve">Fetch and validate all rates before writing, then perform every related update in one database transaction with a clear retry/idempotency policy; add failure-injection tests at each write phase.</w:t>
+            </w:r>
+          </w:p>
+        </w:tc>
+      </w:tr>
+      <w:tr>
+        <w:tc>
+          <w:tcPr>
+            <w:tcW w:w="650" w:type="dxa"/>
+            <w:vAlign w:val="top"/>
+          </w:tcPr>
+          <w:p>
+            <w:r>
+              <w:t xml:space="preserve">23</w:t>
+            </w:r>
+          </w:p>
+        </w:tc>
+        <w:tc>
+          <w:tcPr>
+            <w:tcW w:w="4300" w:type="dxa"/>
+            <w:vAlign w:val="top"/>
+          </w:tcPr>
+          <w:p>
+            <w:r>
+              <w:t xml:space="preserve">Production audit confirmed in export/backend/src/routes/larder.ts: POST /larder/save-from-goal inserts a negative goal contribution and only afterward inserts the positive Larder entry. A failure between those writes permanently reduces goal progress without crediting the user’s Larder, breaking conservation of funds.</w:t>
+            </w:r>
+          </w:p>
+        </w:tc>
+        <w:tc>
+          <w:tcPr>
+            <w:tcW w:w="1300" w:type="dxa"/>
+            <w:vAlign w:val="top"/>
+          </w:tcPr>
+          <w:p>
+            <w:r>
+              <w:t xml:space="preserve">pending</w:t>
+            </w:r>
+          </w:p>
+        </w:tc>
+        <w:tc>
+          <w:tcPr>
+            <w:tcW w:w="850" w:type="dxa"/>
+            <w:vAlign w:val="top"/>
+          </w:tcPr>
+          <w:p>
+            <w:r>
+              <w:t xml:space="preserve">4</w:t>
+            </w:r>
+          </w:p>
+        </w:tc>
+        <w:tc>
+          <w:tcPr>
+            <w:tcW w:w="2100" w:type="dxa"/>
+            <w:vAlign w:val="top"/>
+          </w:tcPr>
+          <w:p>
+            <w:r>
+              <w:t xml:space="preserve">Move validation and both ledger writes into one database transaction with concurrency-safe contribution checks; add mid-write failure, concurrent save, and balance-conservation tests.</w:t>
+            </w:r>
+          </w:p>
+        </w:tc>
+      </w:tr>
+      <w:tr>
+        <w:tc>
+          <w:tcPr>
+            <w:tcW w:w="650" w:type="dxa"/>
+            <w:vAlign w:val="top"/>
+          </w:tcPr>
+          <w:p>
+            <w:r>
+              <w:t xml:space="preserve">24</w:t>
+            </w:r>
+          </w:p>
+        </w:tc>
+        <w:tc>
+          <w:tcPr>
+            <w:tcW w:w="4300" w:type="dxa"/>
+            <w:vAlign w:val="top"/>
+          </w:tcPr>
+          <w:p>
+            <w:r>
+              <w:t xml:space="preserve">Production audit confirmed in export/frontend/src/App.tsx: the top-level ErrorBoundary recovery button only sets hasError back to false while retaining the same child tree and component state. If the render defect is deterministic, React immediately throws again, leaving the recovery screen stuck unless the user manually refreshes the app.</w:t>
+            </w:r>
+          </w:p>
+        </w:tc>
+        <w:tc>
+          <w:tcPr>
+            <w:tcW w:w="1300" w:type="dxa"/>
+            <w:vAlign w:val="top"/>
+          </w:tcPr>
+          <w:p>
+            <w:r>
+              <w:t xml:space="preserve">finished</w:t>
+            </w:r>
+          </w:p>
+        </w:tc>
+        <w:tc>
+          <w:tcPr>
+            <w:tcW w:w="850" w:type="dxa"/>
+            <w:vAlign w:val="top"/>
+          </w:tcPr>
+          <w:p>
+            <w:r>
+              <w:t xml:space="preserve">2</w:t>
+            </w:r>
+          </w:p>
+        </w:tc>
+        <w:tc>
+          <w:tcPr>
+            <w:tcW w:w="2100" w:type="dxa"/>
+            <w:vAlign w:val="top"/>
+          </w:tcPr>
+          <w:p>
+            <w:r>
+              <w:t xml:space="preserve">Finished: Error Boundary retry now reloads the full app, guaranteeing a fresh child tree when the render failure is deterministic.</w:t>
+            </w:r>
+          </w:p>
+        </w:tc>
+      </w:tr>
+      <w:tr>
+        <w:tc>
+          <w:tcPr>
+            <w:tcW w:w="650" w:type="dxa"/>
+            <w:vAlign w:val="top"/>
+          </w:tcPr>
+          <w:p>
+            <w:r>
+              <w:t xml:space="preserve">25</w:t>
+            </w:r>
+          </w:p>
+        </w:tc>
+        <w:tc>
+          <w:tcPr>
+            <w:tcW w:w="4300" w:type="dxa"/>
+            <w:vAlign w:val="top"/>
+          </w:tcPr>
+          <w:p>
+            <w:r>
+              <w:t xml:space="preserve">Production audit confirmed in export/frontend/src/components/Onboarding.tsx: finish() swallows updateMe.mutateAsync and cache-invalidation failures, then always calls onComplete. Local onboarding state advances even when firstLoginDone, currency, language, or budget were not persisted; AuthGuard subsequently sees firstLoginDone=false and logs the user out, losing the onboarding choices.</w:t>
+            </w:r>
+          </w:p>
+        </w:tc>
+        <w:tc>
+          <w:tcPr>
+            <w:tcW w:w="1300" w:type="dxa"/>
+            <w:vAlign w:val="top"/>
+          </w:tcPr>
+          <w:p>
+            <w:r>
+              <w:t xml:space="preserve">finished</w:t>
+            </w:r>
+          </w:p>
+        </w:tc>
+        <w:tc>
+          <w:tcPr>
+            <w:tcW w:w="850" w:type="dxa"/>
+            <w:vAlign w:val="top"/>
+          </w:tcPr>
+          <w:p>
+            <w:r>
               <w:t xml:space="preserve">3</w:t>
             </w:r>
           </w:p>
@@ -1246,202 +1531,31 @@
           </w:tcPr>
           <w:p>
             <w:r>
-              <w:t xml:space="preserve">Claim the pending proposal and create the category in one transaction with a row lock or conditional status update; roll back on failure and add concurrent-accept and mid-write failure tests.</w:t>
-            </w:r>
-          </w:p>
-        </w:tc>
-      </w:tr>
-      <w:tr>
-        <w:tc>
-          <w:tcPr>
-            <w:tcW w:w="650" w:type="dxa"/>
-            <w:vAlign w:val="top"/>
-          </w:tcPr>
-          <w:p>
-            <w:r>
-              <w:t xml:space="preserve">21</w:t>
-            </w:r>
-          </w:p>
-        </w:tc>
-        <w:tc>
-          <w:tcPr>
-            <w:tcW w:w="4300" w:type="dxa"/>
-            <w:vAlign w:val="top"/>
-          </w:tcPr>
-          <w:p>
-            <w:r>
-              <w:t xml:space="preserve">Production audit confirmed in export/backend/src/routes/recurring-payments.ts: both scheduled auto-apply and manual apply insert the transaction before the monthly log claim, then optionally insert a Larder credit in a later write. A concurrent request can create an extra transaction whose log insert loses the conflict, and any later DB failure can leave transaction/log/Larder state inconsistent.</w:t>
-            </w:r>
-          </w:p>
-        </w:tc>
-        <w:tc>
-          <w:tcPr>
-            <w:tcW w:w="1300" w:type="dxa"/>
-            <w:vAlign w:val="top"/>
-          </w:tcPr>
-          <w:p>
-            <w:r>
-              <w:t xml:space="preserve">pending</w:t>
-            </w:r>
-          </w:p>
-        </w:tc>
-        <w:tc>
-          <w:tcPr>
-            <w:tcW w:w="850" w:type="dxa"/>
-            <w:vAlign w:val="top"/>
-          </w:tcPr>
-          <w:p>
-            <w:r>
-              <w:t xml:space="preserve">4</w:t>
-            </w:r>
-          </w:p>
-        </w:tc>
-        <w:tc>
-          <w:tcPr>
-            <w:tcW w:w="2100" w:type="dxa"/>
-            <w:vAlign w:val="top"/>
-          </w:tcPr>
-          <w:p>
-            <w:r>
-              <w:t xml:space="preserve">Wrap transaction creation, unique monthly-log claim, and optional Larder credit in one transaction; treat a lost log claim as a no-op with rollback, and add concurrent-apply and mid-write failure tests.</w:t>
-            </w:r>
-          </w:p>
-        </w:tc>
-      </w:tr>
-      <w:tr>
-        <w:tc>
-          <w:tcPr>
-            <w:tcW w:w="650" w:type="dxa"/>
-            <w:vAlign w:val="top"/>
-          </w:tcPr>
-          <w:p>
-            <w:r>
-              <w:t xml:space="preserve">22</w:t>
-            </w:r>
-          </w:p>
-        </w:tc>
-        <w:tc>
-          <w:tcPr>
-            <w:tcW w:w="4300" w:type="dxa"/>
-            <w:vAlign w:val="top"/>
-          </w:tcPr>
-          <w:p>
-            <w:r>
-              <w:t xml:space="preserve">Production audit confirmed in export/backend/src/routes/currencies.ts: POST /convert-currency updates transactions, category budgets, recurring payments, and user/household budgets through independent sequential writes with no database transaction. A failure after earlier updates leaves the account partially converted, producing mixed-currency totals and future conversion drift.</w:t>
-            </w:r>
-          </w:p>
-        </w:tc>
-        <w:tc>
-          <w:tcPr>
-            <w:tcW w:w="1300" w:type="dxa"/>
-            <w:vAlign w:val="top"/>
-          </w:tcPr>
-          <w:p>
-            <w:r>
-              <w:t xml:space="preserve">pending</w:t>
-            </w:r>
-          </w:p>
-        </w:tc>
-        <w:tc>
-          <w:tcPr>
-            <w:tcW w:w="850" w:type="dxa"/>
-            <w:vAlign w:val="top"/>
-          </w:tcPr>
-          <w:p>
-            <w:r>
-              <w:t xml:space="preserve">4</w:t>
-            </w:r>
-          </w:p>
-        </w:tc>
-        <w:tc>
-          <w:tcPr>
-            <w:tcW w:w="2100" w:type="dxa"/>
-            <w:vAlign w:val="top"/>
-          </w:tcPr>
-          <w:p>
-            <w:r>
-              <w:t xml:space="preserve">Fetch and validate all rates before writing, then perform every related update in one database transaction with a clear retry/idempotency policy; add failure-injection tests at each write phase.</w:t>
-            </w:r>
-          </w:p>
-        </w:tc>
-      </w:tr>
-      <w:tr>
-        <w:tc>
-          <w:tcPr>
-            <w:tcW w:w="650" w:type="dxa"/>
-            <w:vAlign w:val="top"/>
-          </w:tcPr>
-          <w:p>
-            <w:r>
-              <w:t xml:space="preserve">23</w:t>
-            </w:r>
-          </w:p>
-        </w:tc>
-        <w:tc>
-          <w:tcPr>
-            <w:tcW w:w="4300" w:type="dxa"/>
-            <w:vAlign w:val="top"/>
-          </w:tcPr>
-          <w:p>
-            <w:r>
-              <w:t xml:space="preserve">Production audit confirmed in export/backend/src/routes/larder.ts: POST /larder/save-from-goal inserts a negative goal contribution and only afterward inserts the positive Larder entry. A failure between those writes permanently reduces goal progress without crediting the user’s Larder, breaking conservation of funds.</w:t>
-            </w:r>
-          </w:p>
-        </w:tc>
-        <w:tc>
-          <w:tcPr>
-            <w:tcW w:w="1300" w:type="dxa"/>
-            <w:vAlign w:val="top"/>
-          </w:tcPr>
-          <w:p>
-            <w:r>
-              <w:t xml:space="preserve">pending</w:t>
-            </w:r>
-          </w:p>
-        </w:tc>
-        <w:tc>
-          <w:tcPr>
-            <w:tcW w:w="850" w:type="dxa"/>
-            <w:vAlign w:val="top"/>
-          </w:tcPr>
-          <w:p>
-            <w:r>
-              <w:t xml:space="preserve">4</w:t>
-            </w:r>
-          </w:p>
-        </w:tc>
-        <w:tc>
-          <w:tcPr>
-            <w:tcW w:w="2100" w:type="dxa"/>
-            <w:vAlign w:val="top"/>
-          </w:tcPr>
-          <w:p>
-            <w:r>
-              <w:t xml:space="preserve">Move validation and both ledger writes into one database transaction with concurrency-safe contribution checks; add mid-write failure, concurrent save, and balance-conservation tests.</w:t>
-            </w:r>
-          </w:p>
-        </w:tc>
-      </w:tr>
-      <w:tr>
-        <w:tc>
-          <w:tcPr>
-            <w:tcW w:w="650" w:type="dxa"/>
-            <w:vAlign w:val="top"/>
-          </w:tcPr>
-          <w:p>
-            <w:r>
-              <w:t xml:space="preserve">24</w:t>
-            </w:r>
-          </w:p>
-        </w:tc>
-        <w:tc>
-          <w:tcPr>
-            <w:tcW w:w="4300" w:type="dxa"/>
-            <w:vAlign w:val="top"/>
-          </w:tcPr>
-          <w:p>
-            <w:r>
-              <w:t xml:space="preserve">Production audit confirmed in export/frontend/src/App.tsx: the top-level ErrorBoundary recovery button only sets hasError back to false while retaining the same child tree and component state. If the render defect is deterministic, React immediately throws again, leaving the recovery screen stuck unless the user manually refreshes the app.</w:t>
+              <w:t xml:space="preserve">Finished: onboarding now completes only after the profile update and cache invalidation succeed; persistence failures keep the selected values and show retryable feedback.</w:t>
+            </w:r>
+          </w:p>
+        </w:tc>
+      </w:tr>
+      <w:tr>
+        <w:tc>
+          <w:tcPr>
+            <w:tcW w:w="650" w:type="dxa"/>
+            <w:vAlign w:val="top"/>
+          </w:tcPr>
+          <w:p>
+            <w:r>
+              <w:t xml:space="preserve">26</w:t>
+            </w:r>
+          </w:p>
+        </w:tc>
+        <w:tc>
+          <w:tcPr>
+            <w:tcW w:w="4300" w:type="dxa"/>
+            <w:vAlign w:val="top"/>
+          </w:tcPr>
+          <w:p>
+            <w:r>
+              <w:t xml:space="preserve">Production audit confirmed in export/frontend/src/pages/Dashboard.tsx and src/hooks/useLiveActivity.ts: Dashboard passes prefs.currency (an ISO code such as USD, EUR, or PLN) into the native Live Activity field named currencySymbol. The app formatter explicitly maps these codes to $, €, and zł, so supported native Live Activity displays can show the wrong currency text.</w:t>
             </w:r>
           </w:p>
         </w:tc>
@@ -1474,42 +1588,99 @@
           </w:tcPr>
           <w:p>
             <w:r>
-              <w:t xml:space="preserve">Finished: Error Boundary retry now reloads the full app, guaranteeing a fresh child tree when the render failure is deterministic.</w:t>
-            </w:r>
-          </w:p>
-        </w:tc>
-      </w:tr>
-      <w:tr>
-        <w:tc>
-          <w:tcPr>
-            <w:tcW w:w="650" w:type="dxa"/>
-            <w:vAlign w:val="top"/>
-          </w:tcPr>
-          <w:p>
-            <w:r>
-              <w:t xml:space="preserve">25</w:t>
-            </w:r>
-          </w:p>
-        </w:tc>
-        <w:tc>
-          <w:tcPr>
-            <w:tcW w:w="4300" w:type="dxa"/>
-            <w:vAlign w:val="top"/>
-          </w:tcPr>
-          <w:p>
-            <w:r>
-              <w:t xml:space="preserve">Production audit confirmed in export/frontend/src/components/Onboarding.tsx: finish() swallows updateMe.mutateAsync and cache-invalidation failures, then always calls onComplete. Local onboarding state advances even when firstLoginDone, currency, language, or budget were not persisted; AuthGuard subsequently sees firstLoginDone=false and logs the user out, losing the onboarding choices.</w:t>
-            </w:r>
-          </w:p>
-        </w:tc>
-        <w:tc>
-          <w:tcPr>
-            <w:tcW w:w="1300" w:type="dxa"/>
-            <w:vAlign w:val="top"/>
-          </w:tcPr>
-          <w:p>
-            <w:r>
-              <w:t xml:space="preserve">pending</w:t>
+              <w:t xml:space="preserve">Finished: Dashboard maps ISO currency codes through currencySymbol() before sending the Live Activity payload.</w:t>
+            </w:r>
+          </w:p>
+        </w:tc>
+      </w:tr>
+      <w:tr>
+        <w:tc>
+          <w:tcPr>
+            <w:tcW w:w="650" w:type="dxa"/>
+            <w:vAlign w:val="top"/>
+          </w:tcPr>
+          <w:p>
+            <w:r>
+              <w:t xml:space="preserve">27</w:t>
+            </w:r>
+          </w:p>
+        </w:tc>
+        <w:tc>
+          <w:tcPr>
+            <w:tcW w:w="4300" w:type="dxa"/>
+            <w:vAlign w:val="top"/>
+          </w:tcPr>
+          <w:p>
+            <w:r>
+              <w:t xml:space="preserve">Production audit confirmed in export/frontend/src/sw.ts:158-160: the service worker background-sync replay fetches CSRF tokens from the hard-coded root path /api/csrf-token. When the deployed frontend is served under a non-root base path, queued offline mutations use base-prefixed endpoints but CSRF acquisition goes to the wrong route, so replay remains pending and never completes.</w:t>
+            </w:r>
+          </w:p>
+        </w:tc>
+        <w:tc>
+          <w:tcPr>
+            <w:tcW w:w="1300" w:type="dxa"/>
+            <w:vAlign w:val="top"/>
+          </w:tcPr>
+          <w:p>
+            <w:r>
+              <w:t xml:space="preserve">finished</w:t>
+            </w:r>
+          </w:p>
+        </w:tc>
+        <w:tc>
+          <w:tcPr>
+            <w:tcW w:w="850" w:type="dxa"/>
+            <w:vAlign w:val="top"/>
+          </w:tcPr>
+          <w:p>
+            <w:r>
+              <w:t xml:space="preserve">2</w:t>
+            </w:r>
+          </w:p>
+        </w:tc>
+        <w:tc>
+          <w:tcPr>
+            <w:tcW w:w="2100" w:type="dxa"/>
+            <w:vAlign w:val="top"/>
+          </w:tcPr>
+          <w:p>
+            <w:r>
+              <w:t xml:space="preserve">Finished: service-worker CSRF replay resolves api/csrf-token against registration scope, preserving deployed base paths.</w:t>
+            </w:r>
+          </w:p>
+        </w:tc>
+      </w:tr>
+      <w:tr>
+        <w:tc>
+          <w:tcPr>
+            <w:tcW w:w="650" w:type="dxa"/>
+            <w:vAlign w:val="top"/>
+          </w:tcPr>
+          <w:p>
+            <w:r>
+              <w:t xml:space="preserve">29</w:t>
+            </w:r>
+          </w:p>
+        </w:tc>
+        <w:tc>
+          <w:tcPr>
+            <w:tcW w:w="4300" w:type="dxa"/>
+            <w:vAlign w:val="top"/>
+          </w:tcPr>
+          <w:p>
+            <w:r>
+              <w:t xml:space="preserve">Production audit confirmed in export/frontend/src/hooks/usePullToRefresh.ts:86-109 and export/frontend/src/components/Layout.tsx:170-184: releasing a committed pull-to-refresh gesture awaits queryClient.refetchQueries through Promise.all without a catch. If any active query refetch rejects, the touchend/touchcancel handler rejects after its finally cleanup; the browser records an unhandled promise rejection and the user receives no refresh failure feedback.</w:t>
+            </w:r>
+          </w:p>
+        </w:tc>
+        <w:tc>
+          <w:tcPr>
+            <w:tcW w:w="1300" w:type="dxa"/>
+            <w:vAlign w:val="top"/>
+          </w:tcPr>
+          <w:p>
+            <w:r>
+              <w:t xml:space="preserve">finished</w:t>
             </w:r>
           </w:p>
         </w:tc>
@@ -1531,178 +1702,7 @@
           </w:tcPr>
           <w:p>
             <w:r>
-              <w:t xml:space="preserve">Only complete onboarding after the server update succeeds; on failure keep the step open, show retryable feedback, and preserve entered values. Add API-failure, retry, and successful-completion tests.</w:t>
-            </w:r>
-          </w:p>
-        </w:tc>
-      </w:tr>
-      <w:tr>
-        <w:tc>
-          <w:tcPr>
-            <w:tcW w:w="650" w:type="dxa"/>
-            <w:vAlign w:val="top"/>
-          </w:tcPr>
-          <w:p>
-            <w:r>
-              <w:t xml:space="preserve">26</w:t>
-            </w:r>
-          </w:p>
-        </w:tc>
-        <w:tc>
-          <w:tcPr>
-            <w:tcW w:w="4300" w:type="dxa"/>
-            <w:vAlign w:val="top"/>
-          </w:tcPr>
-          <w:p>
-            <w:r>
-              <w:t xml:space="preserve">Production audit confirmed in export/frontend/src/pages/Dashboard.tsx and src/hooks/useLiveActivity.ts: Dashboard passes prefs.currency (an ISO code such as USD, EUR, or PLN) into the native Live Activity field named currencySymbol. The app formatter explicitly maps these codes to $, €, and zł, so supported native Live Activity displays can show the wrong currency text.</w:t>
-            </w:r>
-          </w:p>
-        </w:tc>
-        <w:tc>
-          <w:tcPr>
-            <w:tcW w:w="1300" w:type="dxa"/>
-            <w:vAlign w:val="top"/>
-          </w:tcPr>
-          <w:p>
-            <w:r>
-              <w:t xml:space="preserve">finished</w:t>
-            </w:r>
-          </w:p>
-        </w:tc>
-        <w:tc>
-          <w:tcPr>
-            <w:tcW w:w="850" w:type="dxa"/>
-            <w:vAlign w:val="top"/>
-          </w:tcPr>
-          <w:p>
-            <w:r>
-              <w:t xml:space="preserve">2</w:t>
-            </w:r>
-          </w:p>
-        </w:tc>
-        <w:tc>
-          <w:tcPr>
-            <w:tcW w:w="2100" w:type="dxa"/>
-            <w:vAlign w:val="top"/>
-          </w:tcPr>
-          <w:p>
-            <w:r>
-              <w:t xml:space="preserve">Finished: Dashboard maps ISO currency codes through currencySymbol() before sending the Live Activity payload.</w:t>
-            </w:r>
-          </w:p>
-        </w:tc>
-      </w:tr>
-      <w:tr>
-        <w:tc>
-          <w:tcPr>
-            <w:tcW w:w="650" w:type="dxa"/>
-            <w:vAlign w:val="top"/>
-          </w:tcPr>
-          <w:p>
-            <w:r>
-              <w:t xml:space="preserve">27</w:t>
-            </w:r>
-          </w:p>
-        </w:tc>
-        <w:tc>
-          <w:tcPr>
-            <w:tcW w:w="4300" w:type="dxa"/>
-            <w:vAlign w:val="top"/>
-          </w:tcPr>
-          <w:p>
-            <w:r>
-              <w:t xml:space="preserve">Production audit confirmed in export/frontend/src/sw.ts:158-160: the service worker background-sync replay fetches CSRF tokens from the hard-coded root path /api/csrf-token. When the deployed frontend is served under a non-root base path, queued offline mutations use base-prefixed endpoints but CSRF acquisition goes to the wrong route, so replay remains pending and never completes.</w:t>
-            </w:r>
-          </w:p>
-        </w:tc>
-        <w:tc>
-          <w:tcPr>
-            <w:tcW w:w="1300" w:type="dxa"/>
-            <w:vAlign w:val="top"/>
-          </w:tcPr>
-          <w:p>
-            <w:r>
-              <w:t xml:space="preserve">finished</w:t>
-            </w:r>
-          </w:p>
-        </w:tc>
-        <w:tc>
-          <w:tcPr>
-            <w:tcW w:w="850" w:type="dxa"/>
-            <w:vAlign w:val="top"/>
-          </w:tcPr>
-          <w:p>
-            <w:r>
-              <w:t xml:space="preserve">2</w:t>
-            </w:r>
-          </w:p>
-        </w:tc>
-        <w:tc>
-          <w:tcPr>
-            <w:tcW w:w="2100" w:type="dxa"/>
-            <w:vAlign w:val="top"/>
-          </w:tcPr>
-          <w:p>
-            <w:r>
-              <w:t xml:space="preserve">Finished: service-worker CSRF replay resolves api/csrf-token against registration scope, preserving deployed base paths.</w:t>
-            </w:r>
-          </w:p>
-        </w:tc>
-      </w:tr>
-      <w:tr>
-        <w:tc>
-          <w:tcPr>
-            <w:tcW w:w="650" w:type="dxa"/>
-            <w:vAlign w:val="top"/>
-          </w:tcPr>
-          <w:p>
-            <w:r>
-              <w:t xml:space="preserve">29</w:t>
-            </w:r>
-          </w:p>
-        </w:tc>
-        <w:tc>
-          <w:tcPr>
-            <w:tcW w:w="4300" w:type="dxa"/>
-            <w:vAlign w:val="top"/>
-          </w:tcPr>
-          <w:p>
-            <w:r>
-              <w:t xml:space="preserve">Production audit confirmed in export/frontend/src/hooks/usePullToRefresh.ts:86-109 and export/frontend/src/components/Layout.tsx:170-184: releasing a committed pull-to-refresh gesture awaits queryClient.refetchQueries through Promise.all without a catch. If any active query refetch rejects, the touchend/touchcancel handler rejects after its finally cleanup; the browser records an unhandled promise rejection and the user receives no refresh failure feedback.</w:t>
-            </w:r>
-          </w:p>
-        </w:tc>
-        <w:tc>
-          <w:tcPr>
-            <w:tcW w:w="1300" w:type="dxa"/>
-            <w:vAlign w:val="top"/>
-          </w:tcPr>
-          <w:p>
-            <w:r>
-              <w:t xml:space="preserve">pending</w:t>
-            </w:r>
-          </w:p>
-        </w:tc>
-        <w:tc>
-          <w:tcPr>
-            <w:tcW w:w="850" w:type="dxa"/>
-            <w:vAlign w:val="top"/>
-          </w:tcPr>
-          <w:p>
-            <w:r>
-              <w:t xml:space="preserve">3</w:t>
-            </w:r>
-          </w:p>
-        </w:tc>
-        <w:tc>
-          <w:tcPr>
-            <w:tcW w:w="2100" w:type="dxa"/>
-            <w:vAlign w:val="top"/>
-          </w:tcPr>
-          <w:p>
-            <w:r>
-              <w:t xml:space="preserve">Catch refresh failures inside the gesture handler or make the refresh callback non-rejecting, show retryable feedback, and retain the existing finally reset; test a failed active-query refetch through both touchend and touchcancel.</w:t>
+              <w:t xml:space="preserve">Finished: pull-to-refresh now catches refetch failures in both the gesture hook and refresh callback, resets the cooldown for retry, and shows failure feedback without unhandled rejections.</w:t>
             </w:r>
           </w:p>
         </w:tc>

</xml_diff>

<commit_message>
Fix next severity three audit issues
</commit_message>
<xml_diff>
--- a/output/problem-tracker.docx
+++ b/output/problem-tracker.docx
@@ -2535,6 +2535,120 @@
           </w:tcPr>
           <w:p>
             <w:r>
+              <w:t>finished</w:t>
+            </w:r>
+          </w:p>
+        </w:tc>
+        <w:tc>
+          <w:tcPr>
+            <w:tcW w:w="850" w:type="dxa"/>
+            <w:vAlign w:val="top"/>
+          </w:tcPr>
+          <w:p>
+            <w:r>
+              <w:t xml:space="preserve">3</w:t>
+            </w:r>
+          </w:p>
+        </w:tc>
+        <w:tc>
+          <w:tcPr>
+            <w:tcW w:w="2100" w:type="dxa"/>
+            <w:vAlign w:val="top"/>
+          </w:tcPr>
+          <w:p>
+            <w:r>
+              <w:t>Finished: a partial unique index now enforces one pending proposal per goal, and concurrent conflicts return 409.</w:t>
+            </w:r>
+          </w:p>
+        </w:tc>
+      </w:tr>
+      <w:tr>
+        <w:tc>
+          <w:tcPr>
+            <w:tcW w:w="650" w:type="dxa"/>
+            <w:vAlign w:val="top"/>
+          </w:tcPr>
+          <w:p>
+            <w:r>
+              <w:t xml:space="preserve">45</w:t>
+            </w:r>
+          </w:p>
+        </w:tc>
+        <w:tc>
+          <w:tcPr>
+            <w:tcW w:w="4300" w:type="dxa"/>
+            <w:vAlign w:val="top"/>
+          </w:tcPr>
+          <w:p>
+            <w:r>
+              <w:t xml:space="preserve">Production audit confirmed in export/backend/src/routes/goals.ts:620-640: POST /goals/:id/propose-edit first marks the user's existing pending edit proposals declined, then performs a separate insert for the replacement. If the insert fails, the prior pending proposal has already been lost and the user has no active edit request.</w:t>
+            </w:r>
+          </w:p>
+        </w:tc>
+        <w:tc>
+          <w:tcPr>
+            <w:tcW w:w="1300" w:type="dxa"/>
+            <w:vAlign w:val="top"/>
+          </w:tcPr>
+          <w:p>
+            <w:r>
+              <w:t>finished</w:t>
+            </w:r>
+          </w:p>
+        </w:tc>
+        <w:tc>
+          <w:tcPr>
+            <w:tcW w:w="850" w:type="dxa"/>
+            <w:vAlign w:val="top"/>
+          </w:tcPr>
+          <w:p>
+            <w:r>
+              <w:t xml:space="preserve">3</w:t>
+            </w:r>
+          </w:p>
+        </w:tc>
+        <w:tc>
+          <w:tcPr>
+            <w:tcW w:w="2100" w:type="dxa"/>
+            <w:vAlign w:val="top"/>
+          </w:tcPr>
+          <w:p>
+            <w:r>
+              <w:t>Finished: goal-edit replacement now locks the goal row and rolls back the prior-proposal cancellation if insertion fails.</w:t>
+            </w:r>
+          </w:p>
+        </w:tc>
+      </w:tr>
+      <w:tr>
+        <w:tc>
+          <w:tcPr>
+            <w:tcW w:w="650" w:type="dxa"/>
+            <w:vAlign w:val="top"/>
+          </w:tcPr>
+          <w:p>
+            <w:r>
+              <w:t xml:space="preserve">46</w:t>
+            </w:r>
+          </w:p>
+        </w:tc>
+        <w:tc>
+          <w:tcPr>
+            <w:tcW w:w="4300" w:type="dxa"/>
+            <w:vAlign w:val="top"/>
+          </w:tcPr>
+          <w:p>
+            <w:r>
+              <w:t xml:space="preserve">Production audit confirmed in export/backend/src/routes/larder.ts:493-517: POST /larder/spend inserts the 'From Larder' transaction before inserting the negative larder_entries row. A failure on the deduction write returns an error after the transaction is already committed, leaving a visible spend without the corresponding Larder balance reduction.</w:t>
+            </w:r>
+          </w:p>
+        </w:tc>
+        <w:tc>
+          <w:tcPr>
+            <w:tcW w:w="1300" w:type="dxa"/>
+            <w:vAlign w:val="top"/>
+          </w:tcPr>
+          <w:p>
+            <w:r>
               <w:t xml:space="preserve">pending</w:t>
             </w:r>
           </w:p>
@@ -2546,6 +2660,177 @@
           </w:tcPr>
           <w:p>
             <w:r>
+              <w:t xml:space="preserve">4</w:t>
+            </w:r>
+          </w:p>
+        </w:tc>
+        <w:tc>
+          <w:tcPr>
+            <w:tcW w:w="2100" w:type="dxa"/>
+            <w:vAlign w:val="top"/>
+          </w:tcPr>
+          <w:p>
+            <w:r>
+              <w:t xml:space="preserve">Wrap the transaction insert and Larder deduction in one database transaction, with the balance validation and returned-row checks inside the same atomic operation; add mid-write failure and conservation-of-funds tests.</w:t>
+            </w:r>
+          </w:p>
+        </w:tc>
+      </w:tr>
+      <w:tr>
+        <w:tc>
+          <w:tcPr>
+            <w:tcW w:w="650" w:type="dxa"/>
+            <w:vAlign w:val="top"/>
+          </w:tcPr>
+          <w:p>
+            <w:r>
+              <w:t xml:space="preserve">47</w:t>
+            </w:r>
+          </w:p>
+        </w:tc>
+        <w:tc>
+          <w:tcPr>
+            <w:tcW w:w="4300" w:type="dxa"/>
+            <w:vAlign w:val="top"/>
+          </w:tcPr>
+          <w:p>
+            <w:r>
+              <w:t xml:space="preserve">Production audit confirmed in export/backend/src/routes/larder.ts:471-485 and 493-515: POST /larder/spend reads asset balances and validates sufficiency before the later insert, with no transaction, row lock, or conditional balance claim. Concurrent spends can both pass the same balance check and overdraw the selected Larder asset.</w:t>
+            </w:r>
+          </w:p>
+        </w:tc>
+        <w:tc>
+          <w:tcPr>
+            <w:tcW w:w="1300" w:type="dxa"/>
+            <w:vAlign w:val="top"/>
+          </w:tcPr>
+          <w:p>
+            <w:r>
+              <w:t xml:space="preserve">pending</w:t>
+            </w:r>
+          </w:p>
+        </w:tc>
+        <w:tc>
+          <w:tcPr>
+            <w:tcW w:w="850" w:type="dxa"/>
+            <w:vAlign w:val="top"/>
+          </w:tcPr>
+          <w:p>
+            <w:r>
+              <w:t xml:space="preserve">4</w:t>
+            </w:r>
+          </w:p>
+        </w:tc>
+        <w:tc>
+          <w:tcPr>
+            <w:tcW w:w="2100" w:type="dxa"/>
+            <w:vAlign w:val="top"/>
+          </w:tcPr>
+          <w:p>
+            <w:r>
+              <w:t xml:space="preserve">Move balance validation and deduction into one concurrency-safe database transaction, using locking or an atomic conditional ledger check; add simultaneous-spend and insufficient-after-race tests.</w:t>
+            </w:r>
+          </w:p>
+        </w:tc>
+      </w:tr>
+      <w:tr>
+        <w:tc>
+          <w:tcPr>
+            <w:tcW w:w="650" w:type="dxa"/>
+            <w:vAlign w:val="top"/>
+          </w:tcPr>
+          <w:p>
+            <w:r>
+              <w:t xml:space="preserve">48</w:t>
+            </w:r>
+          </w:p>
+        </w:tc>
+        <w:tc>
+          <w:tcPr>
+            <w:tcW w:w="4300" w:type="dxa"/>
+            <w:vAlign w:val="top"/>
+          </w:tcPr>
+          <w:p>
+            <w:r>
+              <w:t xml:space="preserve">Production audit confirmed in export/frontend/src/components/NotificationCenter.tsx:254-262: AlarmPanel.handleToggle calls ensurePushPermission().then(...) without a rejection handler. If Notification.requestPermission() rejects, the direct Switch callback leaves the optimistic enabled state in local React state, creates an unhandled promise rejection, and provides no retry/error feedback; the server PATCH was already scheduled separately and the displayed toggle can disagree with persisted state.</w:t>
+            </w:r>
+          </w:p>
+        </w:tc>
+        <w:tc>
+          <w:tcPr>
+            <w:tcW w:w="1300" w:type="dxa"/>
+            <w:vAlign w:val="top"/>
+          </w:tcPr>
+          <w:p>
+            <w:r>
+              <w:t xml:space="preserve">finished</w:t>
+            </w:r>
+          </w:p>
+        </w:tc>
+        <w:tc>
+          <w:tcPr>
+            <w:tcW w:w="850" w:type="dxa"/>
+            <w:vAlign w:val="top"/>
+          </w:tcPr>
+          <w:p>
+            <w:r>
+              <w:t xml:space="preserve">2</w:t>
+            </w:r>
+          </w:p>
+        </w:tc>
+        <w:tc>
+          <w:tcPr>
+            <w:tcW w:w="2100" w:type="dxa"/>
+            <w:vAlign w:val="top"/>
+          </w:tcPr>
+          <w:p>
+            <w:r>
+              <w:t xml:space="preserve">Finished: alarm toggles now handle permission and PATCH failures, roll back the optimistic state, show retryable feedback, and prevent overlapping toggles.</w:t>
+            </w:r>
+          </w:p>
+        </w:tc>
+      </w:tr>
+      <w:tr>
+        <w:tc>
+          <w:tcPr>
+            <w:tcW w:w="650" w:type="dxa"/>
+            <w:vAlign w:val="top"/>
+          </w:tcPr>
+          <w:p>
+            <w:r>
+              <w:t xml:space="preserve">49</w:t>
+            </w:r>
+          </w:p>
+        </w:tc>
+        <w:tc>
+          <w:tcPr>
+            <w:tcW w:w="4300" w:type="dxa"/>
+            <w:vAlign w:val="top"/>
+          </w:tcPr>
+          <w:p>
+            <w:r>
+              <w:t xml:space="preserve">Production audit confirmed in export/backend/src/routes/recurring-payments.ts:241-261 and export/backend/src/routes/household-recurring-payments.ts:261-279: deleting a recurring payment first deletes all recurring_payment_logs rows and only then deletes the recurring payment definition, with no database transaction. If the second delete fails, the definition remains but its applied-month history is gone; the next list/auto-apply or manual apply can create a duplicate transaction for the same month. The reverse partial outcome is also possible if future schema constraints change the ordering.</w:t>
+            </w:r>
+          </w:p>
+        </w:tc>
+        <w:tc>
+          <w:tcPr>
+            <w:tcW w:w="1300" w:type="dxa"/>
+            <w:vAlign w:val="top"/>
+          </w:tcPr>
+          <w:p>
+            <w:r>
+              <w:t>finished</w:t>
+            </w:r>
+          </w:p>
+        </w:tc>
+        <w:tc>
+          <w:tcPr>
+            <w:tcW w:w="850" w:type="dxa"/>
+            <w:vAlign w:val="top"/>
+          </w:tcPr>
+          <w:p>
+            <w:r>
               <w:t xml:space="preserve">3</w:t>
             </w:r>
           </w:p>
@@ -2557,292 +2842,7 @@
           </w:tcPr>
           <w:p>
             <w:r>
-              <w:t xml:space="preserve">Claim the pending proposal atomically with a transaction/row lock or a partial unique index plus controlled conflict handling; add concurrent proposal regression tests.</w:t>
-            </w:r>
-          </w:p>
-        </w:tc>
-      </w:tr>
-      <w:tr>
-        <w:tc>
-          <w:tcPr>
-            <w:tcW w:w="650" w:type="dxa"/>
-            <w:vAlign w:val="top"/>
-          </w:tcPr>
-          <w:p>
-            <w:r>
-              <w:t xml:space="preserve">45</w:t>
-            </w:r>
-          </w:p>
-        </w:tc>
-        <w:tc>
-          <w:tcPr>
-            <w:tcW w:w="4300" w:type="dxa"/>
-            <w:vAlign w:val="top"/>
-          </w:tcPr>
-          <w:p>
-            <w:r>
-              <w:t xml:space="preserve">Production audit confirmed in export/backend/src/routes/goals.ts:620-640: POST /goals/:id/propose-edit first marks the user's existing pending edit proposals declined, then performs a separate insert for the replacement. If the insert fails, the prior pending proposal has already been lost and the user has no active edit request.</w:t>
-            </w:r>
-          </w:p>
-        </w:tc>
-        <w:tc>
-          <w:tcPr>
-            <w:tcW w:w="1300" w:type="dxa"/>
-            <w:vAlign w:val="top"/>
-          </w:tcPr>
-          <w:p>
-            <w:r>
-              <w:t xml:space="preserve">pending</w:t>
-            </w:r>
-          </w:p>
-        </w:tc>
-        <w:tc>
-          <w:tcPr>
-            <w:tcW w:w="850" w:type="dxa"/>
-            <w:vAlign w:val="top"/>
-          </w:tcPr>
-          <w:p>
-            <w:r>
-              <w:t xml:space="preserve">3</w:t>
-            </w:r>
-          </w:p>
-        </w:tc>
-        <w:tc>
-          <w:tcPr>
-            <w:tcW w:w="2100" w:type="dxa"/>
-            <w:vAlign w:val="top"/>
-          </w:tcPr>
-          <w:p>
-            <w:r>
-              <w:t xml:space="preserve">Replace the cancel-and-insert sequence with one transaction, preserving the prior proposal until the replacement is safely created; add mid-write failure and retry tests.</w:t>
-            </w:r>
-          </w:p>
-        </w:tc>
-      </w:tr>
-      <w:tr>
-        <w:tc>
-          <w:tcPr>
-            <w:tcW w:w="650" w:type="dxa"/>
-            <w:vAlign w:val="top"/>
-          </w:tcPr>
-          <w:p>
-            <w:r>
-              <w:t xml:space="preserve">46</w:t>
-            </w:r>
-          </w:p>
-        </w:tc>
-        <w:tc>
-          <w:tcPr>
-            <w:tcW w:w="4300" w:type="dxa"/>
-            <w:vAlign w:val="top"/>
-          </w:tcPr>
-          <w:p>
-            <w:r>
-              <w:t xml:space="preserve">Production audit confirmed in export/backend/src/routes/larder.ts:493-517: POST /larder/spend inserts the 'From Larder' transaction before inserting the negative larder_entries row. A failure on the deduction write returns an error after the transaction is already committed, leaving a visible spend without the corresponding Larder balance reduction.</w:t>
-            </w:r>
-          </w:p>
-        </w:tc>
-        <w:tc>
-          <w:tcPr>
-            <w:tcW w:w="1300" w:type="dxa"/>
-            <w:vAlign w:val="top"/>
-          </w:tcPr>
-          <w:p>
-            <w:r>
-              <w:t xml:space="preserve">pending</w:t>
-            </w:r>
-          </w:p>
-        </w:tc>
-        <w:tc>
-          <w:tcPr>
-            <w:tcW w:w="850" w:type="dxa"/>
-            <w:vAlign w:val="top"/>
-          </w:tcPr>
-          <w:p>
-            <w:r>
-              <w:t xml:space="preserve">4</w:t>
-            </w:r>
-          </w:p>
-        </w:tc>
-        <w:tc>
-          <w:tcPr>
-            <w:tcW w:w="2100" w:type="dxa"/>
-            <w:vAlign w:val="top"/>
-          </w:tcPr>
-          <w:p>
-            <w:r>
-              <w:t xml:space="preserve">Wrap the transaction insert and Larder deduction in one database transaction, with the balance validation and returned-row checks inside the same atomic operation; add mid-write failure and conservation-of-funds tests.</w:t>
-            </w:r>
-          </w:p>
-        </w:tc>
-      </w:tr>
-      <w:tr>
-        <w:tc>
-          <w:tcPr>
-            <w:tcW w:w="650" w:type="dxa"/>
-            <w:vAlign w:val="top"/>
-          </w:tcPr>
-          <w:p>
-            <w:r>
-              <w:t xml:space="preserve">47</w:t>
-            </w:r>
-          </w:p>
-        </w:tc>
-        <w:tc>
-          <w:tcPr>
-            <w:tcW w:w="4300" w:type="dxa"/>
-            <w:vAlign w:val="top"/>
-          </w:tcPr>
-          <w:p>
-            <w:r>
-              <w:t xml:space="preserve">Production audit confirmed in export/backend/src/routes/larder.ts:471-485 and 493-515: POST /larder/spend reads asset balances and validates sufficiency before the later insert, with no transaction, row lock, or conditional balance claim. Concurrent spends can both pass the same balance check and overdraw the selected Larder asset.</w:t>
-            </w:r>
-          </w:p>
-        </w:tc>
-        <w:tc>
-          <w:tcPr>
-            <w:tcW w:w="1300" w:type="dxa"/>
-            <w:vAlign w:val="top"/>
-          </w:tcPr>
-          <w:p>
-            <w:r>
-              <w:t xml:space="preserve">pending</w:t>
-            </w:r>
-          </w:p>
-        </w:tc>
-        <w:tc>
-          <w:tcPr>
-            <w:tcW w:w="850" w:type="dxa"/>
-            <w:vAlign w:val="top"/>
-          </w:tcPr>
-          <w:p>
-            <w:r>
-              <w:t xml:space="preserve">4</w:t>
-            </w:r>
-          </w:p>
-        </w:tc>
-        <w:tc>
-          <w:tcPr>
-            <w:tcW w:w="2100" w:type="dxa"/>
-            <w:vAlign w:val="top"/>
-          </w:tcPr>
-          <w:p>
-            <w:r>
-              <w:t xml:space="preserve">Move balance validation and deduction into one concurrency-safe database transaction, using locking or an atomic conditional ledger check; add simultaneous-spend and insufficient-after-race tests.</w:t>
-            </w:r>
-          </w:p>
-        </w:tc>
-      </w:tr>
-      <w:tr>
-        <w:tc>
-          <w:tcPr>
-            <w:tcW w:w="650" w:type="dxa"/>
-            <w:vAlign w:val="top"/>
-          </w:tcPr>
-          <w:p>
-            <w:r>
-              <w:t xml:space="preserve">48</w:t>
-            </w:r>
-          </w:p>
-        </w:tc>
-        <w:tc>
-          <w:tcPr>
-            <w:tcW w:w="4300" w:type="dxa"/>
-            <w:vAlign w:val="top"/>
-          </w:tcPr>
-          <w:p>
-            <w:r>
-              <w:t xml:space="preserve">Production audit confirmed in export/frontend/src/components/NotificationCenter.tsx:254-262: AlarmPanel.handleToggle calls ensurePushPermission().then(...) without a rejection handler. If Notification.requestPermission() rejects, the direct Switch callback leaves the optimistic enabled state in local React state, creates an unhandled promise rejection, and provides no retry/error feedback; the server PATCH was already scheduled separately and the displayed toggle can disagree with persisted state.</w:t>
-            </w:r>
-          </w:p>
-        </w:tc>
-        <w:tc>
-          <w:tcPr>
-            <w:tcW w:w="1300" w:type="dxa"/>
-            <w:vAlign w:val="top"/>
-          </w:tcPr>
-          <w:p>
-            <w:r>
-              <w:t xml:space="preserve">finished</w:t>
-            </w:r>
-          </w:p>
-        </w:tc>
-        <w:tc>
-          <w:tcPr>
-            <w:tcW w:w="850" w:type="dxa"/>
-            <w:vAlign w:val="top"/>
-          </w:tcPr>
-          <w:p>
-            <w:r>
-              <w:t xml:space="preserve">2</w:t>
-            </w:r>
-          </w:p>
-        </w:tc>
-        <w:tc>
-          <w:tcPr>
-            <w:tcW w:w="2100" w:type="dxa"/>
-            <w:vAlign w:val="top"/>
-          </w:tcPr>
-          <w:p>
-            <w:r>
-              <w:t xml:space="preserve">Finished: alarm toggles now handle permission and PATCH failures, roll back the optimistic state, show retryable feedback, and prevent overlapping toggles.</w:t>
-            </w:r>
-          </w:p>
-        </w:tc>
-      </w:tr>
-      <w:tr>
-        <w:tc>
-          <w:tcPr>
-            <w:tcW w:w="650" w:type="dxa"/>
-            <w:vAlign w:val="top"/>
-          </w:tcPr>
-          <w:p>
-            <w:r>
-              <w:t xml:space="preserve">49</w:t>
-            </w:r>
-          </w:p>
-        </w:tc>
-        <w:tc>
-          <w:tcPr>
-            <w:tcW w:w="4300" w:type="dxa"/>
-            <w:vAlign w:val="top"/>
-          </w:tcPr>
-          <w:p>
-            <w:r>
-              <w:t xml:space="preserve">Production audit confirmed in export/backend/src/routes/recurring-payments.ts:241-261 and export/backend/src/routes/household-recurring-payments.ts:261-279: deleting a recurring payment first deletes all recurring_payment_logs rows and only then deletes the recurring payment definition, with no database transaction. If the second delete fails, the definition remains but its applied-month history is gone; the next list/auto-apply or manual apply can create a duplicate transaction for the same month. The reverse partial outcome is also possible if future schema constraints change the ordering.</w:t>
-            </w:r>
-          </w:p>
-        </w:tc>
-        <w:tc>
-          <w:tcPr>
-            <w:tcW w:w="1300" w:type="dxa"/>
-            <w:vAlign w:val="top"/>
-          </w:tcPr>
-          <w:p>
-            <w:r>
-              <w:t xml:space="preserve">pending</w:t>
-            </w:r>
-          </w:p>
-        </w:tc>
-        <w:tc>
-          <w:tcPr>
-            <w:tcW w:w="850" w:type="dxa"/>
-            <w:vAlign w:val="top"/>
-          </w:tcPr>
-          <w:p>
-            <w:r>
-              <w:t xml:space="preserve">3</w:t>
-            </w:r>
-          </w:p>
-        </w:tc>
-        <w:tc>
-          <w:tcPr>
-            <w:tcW w:w="2100" w:type="dxa"/>
-            <w:vAlign w:val="top"/>
-          </w:tcPr>
-          <w:p>
-            <w:r>
-              <w:t xml:space="preserve">Delete the recurring-payment definition and its logs atomically in a transaction, preserve existing applied transactions, and add failure-injection plus delete-then-reload/reapply regression tests for personal and household payments.</w:t>
+              <w:t>Finished: personal and household recurring-payment definitions and logs are deleted atomically in transactions.</w:t>
             </w:r>
           </w:p>
         </w:tc>

</xml_diff>

<commit_message>
Resolve next severity three audit issues
</commit_message>
<xml_diff>
--- a/output/problem-tracker.docx
+++ b/output/problem-tracker.docx
@@ -1737,6 +1737,120 @@
           </w:tcPr>
           <w:p>
             <w:r>
+              <w:t xml:space="preserve">finished</w:t>
+            </w:r>
+          </w:p>
+        </w:tc>
+        <w:tc>
+          <w:tcPr>
+            <w:tcW w:w="850" w:type="dxa"/>
+            <w:vAlign w:val="top"/>
+          </w:tcPr>
+          <w:p>
+            <w:r>
+              <w:t xml:space="preserve">3</w:t>
+            </w:r>
+          </w:p>
+        </w:tc>
+        <w:tc>
+          <w:tcPr>
+            <w:tcW w:w="2100" w:type="dxa"/>
+            <w:vAlign w:val="top"/>
+          </w:tcPr>
+          <w:p>
+            <w:r>
+              <w:t xml:space="preserve">Add database uniqueness for the nullable category/month rule using an appropriate partial index, make creation conditional/transaction-safe, and map unique violations to 409; add concurrent no-transaction and transaction-backed regression tests.</w:t>
+            </w:r>
+          </w:p>
+        </w:tc>
+      </w:tr>
+      <w:tr>
+        <w:tc>
+          <w:tcPr>
+            <w:tcW w:w="650" w:type="dxa"/>
+            <w:vAlign w:val="top"/>
+          </w:tcPr>
+          <w:p>
+            <w:r>
+              <w:t xml:space="preserve">31</w:t>
+            </w:r>
+          </w:p>
+        </w:tc>
+        <w:tc>
+          <w:tcPr>
+            <w:tcW w:w="4300" w:type="dxa"/>
+            <w:vAlign w:val="top"/>
+          </w:tcPr>
+          <w:p>
+            <w:r>
+              <w:t xml:space="preserve">Production audit confirmed in export/backend/src/routes/budget-stretches.ts:203-231: PATCH /budget-stretches/:id authorizes with a SELECT, then updates by id alone and immediately calls formatStretch(updated). If the row is deleted between those statements, the UPDATE returns no row and formatStretch receives undefined, dereferences s.id, and throws; the client receives a 500 rather than a controlled not-found/conflict response.</w:t>
+            </w:r>
+          </w:p>
+        </w:tc>
+        <w:tc>
+          <w:tcPr>
+            <w:tcW w:w="1300" w:type="dxa"/>
+            <w:vAlign w:val="top"/>
+          </w:tcPr>
+          <w:p>
+            <w:r>
+              <w:t xml:space="preserve">finished</w:t>
+            </w:r>
+          </w:p>
+        </w:tc>
+        <w:tc>
+          <w:tcPr>
+            <w:tcW w:w="850" w:type="dxa"/>
+            <w:vAlign w:val="top"/>
+          </w:tcPr>
+          <w:p>
+            <w:r>
+              <w:t xml:space="preserve">2</w:t>
+            </w:r>
+          </w:p>
+        </w:tc>
+        <w:tc>
+          <w:tcPr>
+            <w:tcW w:w="2100" w:type="dxa"/>
+            <w:vAlign w:val="top"/>
+          </w:tcPr>
+          <w:p>
+            <w:r>
+              <w:t xml:space="preserve">Finished: PATCH now updates with ownership in the WHERE clause and returns 404 when the row disappears before the update, avoiding formatStretch(undefined).</w:t>
+            </w:r>
+          </w:p>
+        </w:tc>
+      </w:tr>
+      <w:tr>
+        <w:tc>
+          <w:tcPr>
+            <w:tcW w:w="650" w:type="dxa"/>
+            <w:vAlign w:val="top"/>
+          </w:tcPr>
+          <w:p>
+            <w:r>
+              <w:t xml:space="preserve">32</w:t>
+            </w:r>
+          </w:p>
+        </w:tc>
+        <w:tc>
+          <w:tcPr>
+            <w:tcW w:w="4300" w:type="dxa"/>
+            <w:vAlign w:val="top"/>
+          </w:tcPr>
+          <w:p>
+            <w:r>
+              <w:t xml:space="preserve">Production audit confirmed in export/frontend/src/pages/HomeSpending.tsx:851-927, 1488-1510, and 1515-1558: creating or editing a transaction with a goal/Larder dedication runs syncGoalContribution after the transaction mutation. The helper deletes all linked goal contributions and prior transaction-dedication Larder entries before creating the replacement. If any later fetch, delete, conversion, or create request fails, the transaction remains saved but the prior dedication has already been removed; the edit dialog is already closed and the async callback has no rollback or user-facing recovery.</w:t>
+            </w:r>
+          </w:p>
+        </w:tc>
+        <w:tc>
+          <w:tcPr>
+            <w:tcW w:w="1300" w:type="dxa"/>
+            <w:vAlign w:val="top"/>
+          </w:tcPr>
+          <w:p>
+            <w:r>
               <w:t xml:space="preserve">pending</w:t>
             </w:r>
           </w:p>
@@ -1748,6 +1862,348 @@
           </w:tcPr>
           <w:p>
             <w:r>
+              <w:t xml:space="preserve">4</w:t>
+            </w:r>
+          </w:p>
+        </w:tc>
+        <w:tc>
+          <w:tcPr>
+            <w:tcW w:w="2100" w:type="dxa"/>
+            <w:vAlign w:val="top"/>
+          </w:tcPr>
+          <w:p>
+            <w:r>
+              <w:t xml:space="preserve">Move dedication replacement into an atomic backend operation or implement a durable compensating workflow that creates/validates the replacement before deleting the old records; keep the editor open or show a retryable error until synchronization succeeds, and test failures at every delete/create step.</w:t>
+            </w:r>
+          </w:p>
+        </w:tc>
+      </w:tr>
+      <w:tr>
+        <w:tc>
+          <w:tcPr>
+            <w:tcW w:w="650" w:type="dxa"/>
+            <w:vAlign w:val="top"/>
+          </w:tcPr>
+          <w:p>
+            <w:r>
+              <w:t xml:space="preserve">33</w:t>
+            </w:r>
+          </w:p>
+        </w:tc>
+        <w:tc>
+          <w:tcPr>
+            <w:tcW w:w="4300" w:type="dxa"/>
+            <w:vAlign w:val="top"/>
+          </w:tcPr>
+          <w:p>
+            <w:r>
+              <w:t xml:space="preserve">Production audit confirmed in export/frontend/src/components/Layout.tsx: the profile-open effect calls fetchRates().then(setRates) without a rejection handler. If rates fail while the user opens the profile sheet, the request produces an unhandled promise rejection and leaves the currency options silently unavailable with no retry/error state.</w:t>
+            </w:r>
+          </w:p>
+        </w:tc>
+        <w:tc>
+          <w:tcPr>
+            <w:tcW w:w="1300" w:type="dxa"/>
+            <w:vAlign w:val="top"/>
+          </w:tcPr>
+          <w:p>
+            <w:r>
+              <w:t xml:space="preserve">solved</w:t>
+            </w:r>
+          </w:p>
+        </w:tc>
+        <w:tc>
+          <w:tcPr>
+            <w:tcW w:w="850" w:type="dxa"/>
+            <w:vAlign w:val="top"/>
+          </w:tcPr>
+          <w:p>
+            <w:r>
+              <w:t xml:space="preserve">1</w:t>
+            </w:r>
+          </w:p>
+        </w:tc>
+        <w:tc>
+          <w:tcPr>
+            <w:tcW w:w="2100" w:type="dxa"/>
+            <w:vAlign w:val="top"/>
+          </w:tcPr>
+          <w:p>
+            <w:r>
+              <w:t xml:space="preserve">Add a catch that records a recoverable rates error or leaves the existing empty state intentionally; verify profile opening under offline and rejected-rates responses without an unhandled rejection.</w:t>
+            </w:r>
+          </w:p>
+        </w:tc>
+      </w:tr>
+      <w:tr>
+        <w:tc>
+          <w:tcPr>
+            <w:tcW w:w="650" w:type="dxa"/>
+            <w:vAlign w:val="top"/>
+          </w:tcPr>
+          <w:p>
+            <w:r>
+              <w:t xml:space="preserve">34</w:t>
+            </w:r>
+          </w:p>
+        </w:tc>
+        <w:tc>
+          <w:tcPr>
+            <w:tcW w:w="4300" w:type="dxa"/>
+            <w:vAlign w:val="top"/>
+          </w:tcPr>
+          <w:p>
+            <w:r>
+              <w:t xml:space="preserve">Production audit confirmed in export/frontend/src/components/NotificationCenter.tsx: AlarmPanel.handleDelete removes the alarm from local state before awaiting alarmFetch(..., DELETE), but the button invokes it without catch handling. A network rejection becomes an unhandled promise rejection and the reminder disappears until the panel is reopened, even though the server delete may have failed.</w:t>
+            </w:r>
+          </w:p>
+        </w:tc>
+        <w:tc>
+          <w:tcPr>
+            <w:tcW w:w="1300" w:type="dxa"/>
+            <w:vAlign w:val="top"/>
+          </w:tcPr>
+          <w:p>
+            <w:r>
+              <w:t xml:space="preserve">finished</w:t>
+            </w:r>
+          </w:p>
+        </w:tc>
+        <w:tc>
+          <w:tcPr>
+            <w:tcW w:w="850" w:type="dxa"/>
+            <w:vAlign w:val="top"/>
+          </w:tcPr>
+          <w:p>
+            <w:r>
+              <w:t xml:space="preserve">2</w:t>
+            </w:r>
+          </w:p>
+        </w:tc>
+        <w:tc>
+          <w:tcPr>
+            <w:tcW w:w="2100" w:type="dxa"/>
+            <w:vAlign w:val="top"/>
+          </w:tcPr>
+          <w:p>
+            <w:r>
+              <w:t xml:space="preserve">Finished: alarm deletion now treats non-OK responses and network failures as errors, restores the removed alarm, and shows retryable feedback.</w:t>
+            </w:r>
+          </w:p>
+        </w:tc>
+      </w:tr>
+      <w:tr>
+        <w:tc>
+          <w:tcPr>
+            <w:tcW w:w="650" w:type="dxa"/>
+            <w:vAlign w:val="top"/>
+          </w:tcPr>
+          <w:p>
+            <w:r>
+              <w:t xml:space="preserve">35</w:t>
+            </w:r>
+          </w:p>
+        </w:tc>
+        <w:tc>
+          <w:tcPr>
+            <w:tcW w:w="4300" w:type="dxa"/>
+            <w:vAlign w:val="top"/>
+          </w:tcPr>
+          <w:p>
+            <w:r>
+              <w:t xml:space="preserve">Production audit confirmed in export/frontend/src/components/NotificationCenter.tsx: AlarmPanel.handleAdd awaits ensurePushPermission() and alarmFetch(..., POST) without catch/finally, while the Add button uses the async handler directly. A rejected permission request or network failure becomes an unhandled promise rejection and the user receives no failure or retry feedback.</w:t>
+            </w:r>
+          </w:p>
+        </w:tc>
+        <w:tc>
+          <w:tcPr>
+            <w:tcW w:w="1300" w:type="dxa"/>
+            <w:vAlign w:val="top"/>
+          </w:tcPr>
+          <w:p>
+            <w:r>
+              <w:t xml:space="preserve">finished</w:t>
+            </w:r>
+          </w:p>
+        </w:tc>
+        <w:tc>
+          <w:tcPr>
+            <w:tcW w:w="850" w:type="dxa"/>
+            <w:vAlign w:val="top"/>
+          </w:tcPr>
+          <w:p>
+            <w:r>
+              <w:t xml:space="preserve">2</w:t>
+            </w:r>
+          </w:p>
+        </w:tc>
+        <w:tc>
+          <w:tcPr>
+            <w:tcW w:w="2100" w:type="dxa"/>
+            <w:vAlign w:val="top"/>
+          </w:tcPr>
+          <w:p>
+            <w:r>
+              <w:t xml:space="preserve">Finished: alarm creation now catches permission/API failures, releases its busy state, and keeps the Add action retryable with feedback.</w:t>
+            </w:r>
+          </w:p>
+        </w:tc>
+      </w:tr>
+      <w:tr>
+        <w:tc>
+          <w:tcPr>
+            <w:tcW w:w="650" w:type="dxa"/>
+            <w:vAlign w:val="top"/>
+          </w:tcPr>
+          <w:p>
+            <w:r>
+              <w:t xml:space="preserve">36</w:t>
+            </w:r>
+          </w:p>
+        </w:tc>
+        <w:tc>
+          <w:tcPr>
+            <w:tcW w:w="4300" w:type="dxa"/>
+            <w:vAlign w:val="top"/>
+          </w:tcPr>
+          <w:p>
+            <w:r>
+              <w:t xml:space="preserve">Production audit confirmed in export/frontend/src/components/NotificationCenter.tsx: handleSmartToggle awaits ensurePermission(), whose Notification.requestPermission() call can reject, but handleSmartToggle has no catch and is used directly by the smart-alert controls. Permission API failure becomes an unhandled promise rejection and the toggle gives no recovery feedback.</w:t>
+            </w:r>
+          </w:p>
+        </w:tc>
+        <w:tc>
+          <w:tcPr>
+            <w:tcW w:w="1300" w:type="dxa"/>
+            <w:vAlign w:val="top"/>
+          </w:tcPr>
+          <w:p>
+            <w:r>
+              <w:t xml:space="preserve">solved</w:t>
+            </w:r>
+          </w:p>
+        </w:tc>
+        <w:tc>
+          <w:tcPr>
+            <w:tcW w:w="850" w:type="dxa"/>
+            <w:vAlign w:val="top"/>
+          </w:tcPr>
+          <w:p>
+            <w:r>
+              <w:t xml:space="preserve">1</w:t>
+            </w:r>
+          </w:p>
+        </w:tc>
+        <w:tc>
+          <w:tcPr>
+            <w:tcW w:w="2100" w:type="dxa"/>
+            <w:vAlign w:val="top"/>
+          </w:tcPr>
+          <w:p>
+            <w:r>
+              <w:t xml:space="preserve">Catch permission failures in the smart-alert toggle, preserve the prior preference, and show the existing notification-permission error; cover permission rejection and denied/granted paths.</w:t>
+            </w:r>
+          </w:p>
+        </w:tc>
+      </w:tr>
+      <w:tr>
+        <w:tc>
+          <w:tcPr>
+            <w:tcW w:w="650" w:type="dxa"/>
+            <w:vAlign w:val="top"/>
+          </w:tcPr>
+          <w:p>
+            <w:r>
+              <w:t xml:space="preserve">37</w:t>
+            </w:r>
+          </w:p>
+        </w:tc>
+        <w:tc>
+          <w:tcPr>
+            <w:tcW w:w="4300" w:type="dxa"/>
+            <w:vAlign w:val="top"/>
+          </w:tcPr>
+          <w:p>
+            <w:r>
+              <w:t xml:space="preserve">Production audit confirmed in export/frontend/src/components/NotificationCenter.tsx: handlePreview sets previewing=true and awaits triggerBadgerNotification() before scheduling the reset timeout. triggerBadgerNotification can reject when haptic/audio setup throws; no catch/finally handles that rejection, so the click produces an unhandled promise rejection and previewing can remain true indefinitely, disabling the preview control.</w:t>
+            </w:r>
+          </w:p>
+        </w:tc>
+        <w:tc>
+          <w:tcPr>
+            <w:tcW w:w="1300" w:type="dxa"/>
+            <w:vAlign w:val="top"/>
+          </w:tcPr>
+          <w:p>
+            <w:r>
+              <w:t xml:space="preserve">finished</w:t>
+            </w:r>
+          </w:p>
+        </w:tc>
+        <w:tc>
+          <w:tcPr>
+            <w:tcW w:w="850" w:type="dxa"/>
+            <w:vAlign w:val="top"/>
+          </w:tcPr>
+          <w:p>
+            <w:r>
+              <w:t xml:space="preserve">2</w:t>
+            </w:r>
+          </w:p>
+        </w:tc>
+        <w:tc>
+          <w:tcPr>
+            <w:tcW w:w="2100" w:type="dxa"/>
+            <w:vAlign w:val="top"/>
+          </w:tcPr>
+          <w:p>
+            <w:r>
+              <w:t xml:space="preserve">Finished: notification preview now catches media/haptic failures and always releases preview state so the control remains retryable.</w:t>
+            </w:r>
+          </w:p>
+        </w:tc>
+      </w:tr>
+      <w:tr>
+        <w:tc>
+          <w:tcPr>
+            <w:tcW w:w="650" w:type="dxa"/>
+            <w:vAlign w:val="top"/>
+          </w:tcPr>
+          <w:p>
+            <w:r>
+              <w:t xml:space="preserve">38</w:t>
+            </w:r>
+          </w:p>
+        </w:tc>
+        <w:tc>
+          <w:tcPr>
+            <w:tcW w:w="4300" w:type="dxa"/>
+            <w:vAlign w:val="top"/>
+          </w:tcPr>
+          <w:p>
+            <w:r>
+              <w:t xml:space="preserve">Production audit confirmed in export/backend/src/routes/notifications.ts and src/db/schema/notifications.ts: POST /notifications/alarms counts a user's rows, checks MAX_ALARMS_PER_USER, then inserts without a transaction or database-enforced cap. Concurrent Add Reminder requests can both pass the check and create more than the documented ten alarms.</w:t>
+            </w:r>
+          </w:p>
+        </w:tc>
+        <w:tc>
+          <w:tcPr>
+            <w:tcW w:w="1300" w:type="dxa"/>
+            <w:vAlign w:val="top"/>
+          </w:tcPr>
+          <w:p>
+            <w:r>
+              <w:t xml:space="preserve">finished</w:t>
+            </w:r>
+          </w:p>
+        </w:tc>
+        <w:tc>
+          <w:tcPr>
+            <w:tcW w:w="850" w:type="dxa"/>
+            <w:vAlign w:val="top"/>
+          </w:tcPr>
+          <w:p>
+            <w:r>
               <w:t xml:space="preserve">3</w:t>
             </w:r>
           </w:p>
@@ -1759,31 +2215,31 @@
           </w:tcPr>
           <w:p>
             <w:r>
-              <w:t xml:space="preserve">Add database uniqueness for the nullable category/month rule using an appropriate partial index, make creation conditional/transaction-safe, and map unique violations to 409; add concurrent no-transaction and transaction-backed regression tests.</w:t>
-            </w:r>
-          </w:p>
-        </w:tc>
-      </w:tr>
-      <w:tr>
-        <w:tc>
-          <w:tcPr>
-            <w:tcW w:w="650" w:type="dxa"/>
-            <w:vAlign w:val="top"/>
-          </w:tcPr>
-          <w:p>
-            <w:r>
-              <w:t xml:space="preserve">31</w:t>
-            </w:r>
-          </w:p>
-        </w:tc>
-        <w:tc>
-          <w:tcPr>
-            <w:tcW w:w="4300" w:type="dxa"/>
-            <w:vAlign w:val="top"/>
-          </w:tcPr>
-          <w:p>
-            <w:r>
-              <w:t xml:space="preserve">Production audit confirmed in export/backend/src/routes/budget-stretches.ts:203-231: PATCH /budget-stretches/:id authorizes with a SELECT, then updates by id alone and immediately calls formatStretch(updated). If the row is deleted between those statements, the UPDATE returns no row and formatStretch receives undefined, dereferences s.id, and throws; the client receives a 500 rather than a controlled not-found/conflict response.</w:t>
+              <w:t xml:space="preserve">Enforce the per-user cap atomically with a transaction/locking strategy or an equivalent database invariant, and add concurrent-create tests proving the limit cannot be exceeded.</w:t>
+            </w:r>
+          </w:p>
+        </w:tc>
+      </w:tr>
+      <w:tr>
+        <w:tc>
+          <w:tcPr>
+            <w:tcW w:w="650" w:type="dxa"/>
+            <w:vAlign w:val="top"/>
+          </w:tcPr>
+          <w:p>
+            <w:r>
+              <w:t xml:space="preserve">39</w:t>
+            </w:r>
+          </w:p>
+        </w:tc>
+        <w:tc>
+          <w:tcPr>
+            <w:tcW w:w="4300" w:type="dxa"/>
+            <w:vAlign w:val="top"/>
+          </w:tcPr>
+          <w:p>
+            <w:r>
+              <w:t xml:space="preserve">Production audit confirmed in export/backend/src/routes/notifications.ts: POST /notifications/push-subscribe deletes every other subscription for the user, then performs a separate upsert for the new endpoint. A database failure between those writes removes previously working push subscriptions without restoring them; concurrent replacements can also race.</w:t>
             </w:r>
           </w:p>
         </w:tc>
@@ -1795,462 +2251,6 @@
           <w:p>
             <w:r>
               <w:t xml:space="preserve">finished</w:t>
-            </w:r>
-          </w:p>
-        </w:tc>
-        <w:tc>
-          <w:tcPr>
-            <w:tcW w:w="850" w:type="dxa"/>
-            <w:vAlign w:val="top"/>
-          </w:tcPr>
-          <w:p>
-            <w:r>
-              <w:t xml:space="preserve">2</w:t>
-            </w:r>
-          </w:p>
-        </w:tc>
-        <w:tc>
-          <w:tcPr>
-            <w:tcW w:w="2100" w:type="dxa"/>
-            <w:vAlign w:val="top"/>
-          </w:tcPr>
-          <w:p>
-            <w:r>
-              <w:t xml:space="preserve">Finished: PATCH now updates with ownership in the WHERE clause and returns 404 when the row disappears before the update, avoiding formatStretch(undefined).</w:t>
-            </w:r>
-          </w:p>
-        </w:tc>
-      </w:tr>
-      <w:tr>
-        <w:tc>
-          <w:tcPr>
-            <w:tcW w:w="650" w:type="dxa"/>
-            <w:vAlign w:val="top"/>
-          </w:tcPr>
-          <w:p>
-            <w:r>
-              <w:t xml:space="preserve">32</w:t>
-            </w:r>
-          </w:p>
-        </w:tc>
-        <w:tc>
-          <w:tcPr>
-            <w:tcW w:w="4300" w:type="dxa"/>
-            <w:vAlign w:val="top"/>
-          </w:tcPr>
-          <w:p>
-            <w:r>
-              <w:t xml:space="preserve">Production audit confirmed in export/frontend/src/pages/HomeSpending.tsx:851-927, 1488-1510, and 1515-1558: creating or editing a transaction with a goal/Larder dedication runs syncGoalContribution after the transaction mutation. The helper deletes all linked goal contributions and prior transaction-dedication Larder entries before creating the replacement. If any later fetch, delete, conversion, or create request fails, the transaction remains saved but the prior dedication has already been removed; the edit dialog is already closed and the async callback has no rollback or user-facing recovery.</w:t>
-            </w:r>
-          </w:p>
-        </w:tc>
-        <w:tc>
-          <w:tcPr>
-            <w:tcW w:w="1300" w:type="dxa"/>
-            <w:vAlign w:val="top"/>
-          </w:tcPr>
-          <w:p>
-            <w:r>
-              <w:t xml:space="preserve">pending</w:t>
-            </w:r>
-          </w:p>
-        </w:tc>
-        <w:tc>
-          <w:tcPr>
-            <w:tcW w:w="850" w:type="dxa"/>
-            <w:vAlign w:val="top"/>
-          </w:tcPr>
-          <w:p>
-            <w:r>
-              <w:t xml:space="preserve">4</w:t>
-            </w:r>
-          </w:p>
-        </w:tc>
-        <w:tc>
-          <w:tcPr>
-            <w:tcW w:w="2100" w:type="dxa"/>
-            <w:vAlign w:val="top"/>
-          </w:tcPr>
-          <w:p>
-            <w:r>
-              <w:t xml:space="preserve">Move dedication replacement into an atomic backend operation or implement a durable compensating workflow that creates/validates the replacement before deleting the old records; keep the editor open or show a retryable error until synchronization succeeds, and test failures at every delete/create step.</w:t>
-            </w:r>
-          </w:p>
-        </w:tc>
-      </w:tr>
-      <w:tr>
-        <w:tc>
-          <w:tcPr>
-            <w:tcW w:w="650" w:type="dxa"/>
-            <w:vAlign w:val="top"/>
-          </w:tcPr>
-          <w:p>
-            <w:r>
-              <w:t xml:space="preserve">33</w:t>
-            </w:r>
-          </w:p>
-        </w:tc>
-        <w:tc>
-          <w:tcPr>
-            <w:tcW w:w="4300" w:type="dxa"/>
-            <w:vAlign w:val="top"/>
-          </w:tcPr>
-          <w:p>
-            <w:r>
-              <w:t xml:space="preserve">Production audit confirmed in export/frontend/src/components/Layout.tsx: the profile-open effect calls fetchRates().then(setRates) without a rejection handler. If rates fail while the user opens the profile sheet, the request produces an unhandled promise rejection and leaves the currency options silently unavailable with no retry/error state.</w:t>
-            </w:r>
-          </w:p>
-        </w:tc>
-        <w:tc>
-          <w:tcPr>
-            <w:tcW w:w="1300" w:type="dxa"/>
-            <w:vAlign w:val="top"/>
-          </w:tcPr>
-          <w:p>
-            <w:r>
-              <w:t xml:space="preserve">solved</w:t>
-            </w:r>
-          </w:p>
-        </w:tc>
-        <w:tc>
-          <w:tcPr>
-            <w:tcW w:w="850" w:type="dxa"/>
-            <w:vAlign w:val="top"/>
-          </w:tcPr>
-          <w:p>
-            <w:r>
-              <w:t xml:space="preserve">1</w:t>
-            </w:r>
-          </w:p>
-        </w:tc>
-        <w:tc>
-          <w:tcPr>
-            <w:tcW w:w="2100" w:type="dxa"/>
-            <w:vAlign w:val="top"/>
-          </w:tcPr>
-          <w:p>
-            <w:r>
-              <w:t xml:space="preserve">Add a catch that records a recoverable rates error or leaves the existing empty state intentionally; verify profile opening under offline and rejected-rates responses without an unhandled rejection.</w:t>
-            </w:r>
-          </w:p>
-        </w:tc>
-      </w:tr>
-      <w:tr>
-        <w:tc>
-          <w:tcPr>
-            <w:tcW w:w="650" w:type="dxa"/>
-            <w:vAlign w:val="top"/>
-          </w:tcPr>
-          <w:p>
-            <w:r>
-              <w:t xml:space="preserve">34</w:t>
-            </w:r>
-          </w:p>
-        </w:tc>
-        <w:tc>
-          <w:tcPr>
-            <w:tcW w:w="4300" w:type="dxa"/>
-            <w:vAlign w:val="top"/>
-          </w:tcPr>
-          <w:p>
-            <w:r>
-              <w:t xml:space="preserve">Production audit confirmed in export/frontend/src/components/NotificationCenter.tsx: AlarmPanel.handleDelete removes the alarm from local state before awaiting alarmFetch(..., DELETE), but the button invokes it without catch handling. A network rejection becomes an unhandled promise rejection and the reminder disappears until the panel is reopened, even though the server delete may have failed.</w:t>
-            </w:r>
-          </w:p>
-        </w:tc>
-        <w:tc>
-          <w:tcPr>
-            <w:tcW w:w="1300" w:type="dxa"/>
-            <w:vAlign w:val="top"/>
-          </w:tcPr>
-          <w:p>
-            <w:r>
-              <w:t xml:space="preserve">finished</w:t>
-            </w:r>
-          </w:p>
-        </w:tc>
-        <w:tc>
-          <w:tcPr>
-            <w:tcW w:w="850" w:type="dxa"/>
-            <w:vAlign w:val="top"/>
-          </w:tcPr>
-          <w:p>
-            <w:r>
-              <w:t xml:space="preserve">2</w:t>
-            </w:r>
-          </w:p>
-        </w:tc>
-        <w:tc>
-          <w:tcPr>
-            <w:tcW w:w="2100" w:type="dxa"/>
-            <w:vAlign w:val="top"/>
-          </w:tcPr>
-          <w:p>
-            <w:r>
-              <w:t xml:space="preserve">Finished: alarm deletion now treats non-OK responses and network failures as errors, restores the removed alarm, and shows retryable feedback.</w:t>
-            </w:r>
-          </w:p>
-        </w:tc>
-      </w:tr>
-      <w:tr>
-        <w:tc>
-          <w:tcPr>
-            <w:tcW w:w="650" w:type="dxa"/>
-            <w:vAlign w:val="top"/>
-          </w:tcPr>
-          <w:p>
-            <w:r>
-              <w:t xml:space="preserve">35</w:t>
-            </w:r>
-          </w:p>
-        </w:tc>
-        <w:tc>
-          <w:tcPr>
-            <w:tcW w:w="4300" w:type="dxa"/>
-            <w:vAlign w:val="top"/>
-          </w:tcPr>
-          <w:p>
-            <w:r>
-              <w:t xml:space="preserve">Production audit confirmed in export/frontend/src/components/NotificationCenter.tsx: AlarmPanel.handleAdd awaits ensurePushPermission() and alarmFetch(..., POST) without catch/finally, while the Add button uses the async handler directly. A rejected permission request or network failure becomes an unhandled promise rejection and the user receives no failure or retry feedback.</w:t>
-            </w:r>
-          </w:p>
-        </w:tc>
-        <w:tc>
-          <w:tcPr>
-            <w:tcW w:w="1300" w:type="dxa"/>
-            <w:vAlign w:val="top"/>
-          </w:tcPr>
-          <w:p>
-            <w:r>
-              <w:t xml:space="preserve">finished</w:t>
-            </w:r>
-          </w:p>
-        </w:tc>
-        <w:tc>
-          <w:tcPr>
-            <w:tcW w:w="850" w:type="dxa"/>
-            <w:vAlign w:val="top"/>
-          </w:tcPr>
-          <w:p>
-            <w:r>
-              <w:t xml:space="preserve">2</w:t>
-            </w:r>
-          </w:p>
-        </w:tc>
-        <w:tc>
-          <w:tcPr>
-            <w:tcW w:w="2100" w:type="dxa"/>
-            <w:vAlign w:val="top"/>
-          </w:tcPr>
-          <w:p>
-            <w:r>
-              <w:t xml:space="preserve">Finished: alarm creation now catches permission/API failures, releases its busy state, and keeps the Add action retryable with feedback.</w:t>
-            </w:r>
-          </w:p>
-        </w:tc>
-      </w:tr>
-      <w:tr>
-        <w:tc>
-          <w:tcPr>
-            <w:tcW w:w="650" w:type="dxa"/>
-            <w:vAlign w:val="top"/>
-          </w:tcPr>
-          <w:p>
-            <w:r>
-              <w:t xml:space="preserve">36</w:t>
-            </w:r>
-          </w:p>
-        </w:tc>
-        <w:tc>
-          <w:tcPr>
-            <w:tcW w:w="4300" w:type="dxa"/>
-            <w:vAlign w:val="top"/>
-          </w:tcPr>
-          <w:p>
-            <w:r>
-              <w:t xml:space="preserve">Production audit confirmed in export/frontend/src/components/NotificationCenter.tsx: handleSmartToggle awaits ensurePermission(), whose Notification.requestPermission() call can reject, but handleSmartToggle has no catch and is used directly by the smart-alert controls. Permission API failure becomes an unhandled promise rejection and the toggle gives no recovery feedback.</w:t>
-            </w:r>
-          </w:p>
-        </w:tc>
-        <w:tc>
-          <w:tcPr>
-            <w:tcW w:w="1300" w:type="dxa"/>
-            <w:vAlign w:val="top"/>
-          </w:tcPr>
-          <w:p>
-            <w:r>
-              <w:t xml:space="preserve">solved</w:t>
-            </w:r>
-          </w:p>
-        </w:tc>
-        <w:tc>
-          <w:tcPr>
-            <w:tcW w:w="850" w:type="dxa"/>
-            <w:vAlign w:val="top"/>
-          </w:tcPr>
-          <w:p>
-            <w:r>
-              <w:t xml:space="preserve">1</w:t>
-            </w:r>
-          </w:p>
-        </w:tc>
-        <w:tc>
-          <w:tcPr>
-            <w:tcW w:w="2100" w:type="dxa"/>
-            <w:vAlign w:val="top"/>
-          </w:tcPr>
-          <w:p>
-            <w:r>
-              <w:t xml:space="preserve">Catch permission failures in the smart-alert toggle, preserve the prior preference, and show the existing notification-permission error; cover permission rejection and denied/granted paths.</w:t>
-            </w:r>
-          </w:p>
-        </w:tc>
-      </w:tr>
-      <w:tr>
-        <w:tc>
-          <w:tcPr>
-            <w:tcW w:w="650" w:type="dxa"/>
-            <w:vAlign w:val="top"/>
-          </w:tcPr>
-          <w:p>
-            <w:r>
-              <w:t xml:space="preserve">37</w:t>
-            </w:r>
-          </w:p>
-        </w:tc>
-        <w:tc>
-          <w:tcPr>
-            <w:tcW w:w="4300" w:type="dxa"/>
-            <w:vAlign w:val="top"/>
-          </w:tcPr>
-          <w:p>
-            <w:r>
-              <w:t xml:space="preserve">Production audit confirmed in export/frontend/src/components/NotificationCenter.tsx: handlePreview sets previewing=true and awaits triggerBadgerNotification() before scheduling the reset timeout. triggerBadgerNotification can reject when haptic/audio setup throws; no catch/finally handles that rejection, so the click produces an unhandled promise rejection and previewing can remain true indefinitely, disabling the preview control.</w:t>
-            </w:r>
-          </w:p>
-        </w:tc>
-        <w:tc>
-          <w:tcPr>
-            <w:tcW w:w="1300" w:type="dxa"/>
-            <w:vAlign w:val="top"/>
-          </w:tcPr>
-          <w:p>
-            <w:r>
-              <w:t xml:space="preserve">finished</w:t>
-            </w:r>
-          </w:p>
-        </w:tc>
-        <w:tc>
-          <w:tcPr>
-            <w:tcW w:w="850" w:type="dxa"/>
-            <w:vAlign w:val="top"/>
-          </w:tcPr>
-          <w:p>
-            <w:r>
-              <w:t xml:space="preserve">2</w:t>
-            </w:r>
-          </w:p>
-        </w:tc>
-        <w:tc>
-          <w:tcPr>
-            <w:tcW w:w="2100" w:type="dxa"/>
-            <w:vAlign w:val="top"/>
-          </w:tcPr>
-          <w:p>
-            <w:r>
-              <w:t xml:space="preserve">Finished: notification preview now catches media/haptic failures and always releases preview state so the control remains retryable.</w:t>
-            </w:r>
-          </w:p>
-        </w:tc>
-      </w:tr>
-      <w:tr>
-        <w:tc>
-          <w:tcPr>
-            <w:tcW w:w="650" w:type="dxa"/>
-            <w:vAlign w:val="top"/>
-          </w:tcPr>
-          <w:p>
-            <w:r>
-              <w:t xml:space="preserve">38</w:t>
-            </w:r>
-          </w:p>
-        </w:tc>
-        <w:tc>
-          <w:tcPr>
-            <w:tcW w:w="4300" w:type="dxa"/>
-            <w:vAlign w:val="top"/>
-          </w:tcPr>
-          <w:p>
-            <w:r>
-              <w:t xml:space="preserve">Production audit confirmed in export/backend/src/routes/notifications.ts and src/db/schema/notifications.ts: POST /notifications/alarms counts a user's rows, checks MAX_ALARMS_PER_USER, then inserts without a transaction or database-enforced cap. Concurrent Add Reminder requests can both pass the check and create more than the documented ten alarms.</w:t>
-            </w:r>
-          </w:p>
-        </w:tc>
-        <w:tc>
-          <w:tcPr>
-            <w:tcW w:w="1300" w:type="dxa"/>
-            <w:vAlign w:val="top"/>
-          </w:tcPr>
-          <w:p>
-            <w:r>
-              <w:t xml:space="preserve">pending</w:t>
-            </w:r>
-          </w:p>
-        </w:tc>
-        <w:tc>
-          <w:tcPr>
-            <w:tcW w:w="850" w:type="dxa"/>
-            <w:vAlign w:val="top"/>
-          </w:tcPr>
-          <w:p>
-            <w:r>
-              <w:t xml:space="preserve">3</w:t>
-            </w:r>
-          </w:p>
-        </w:tc>
-        <w:tc>
-          <w:tcPr>
-            <w:tcW w:w="2100" w:type="dxa"/>
-            <w:vAlign w:val="top"/>
-          </w:tcPr>
-          <w:p>
-            <w:r>
-              <w:t xml:space="preserve">Enforce the per-user cap atomically with a transaction/locking strategy or an equivalent database invariant, and add concurrent-create tests proving the limit cannot be exceeded.</w:t>
-            </w:r>
-          </w:p>
-        </w:tc>
-      </w:tr>
-      <w:tr>
-        <w:tc>
-          <w:tcPr>
-            <w:tcW w:w="650" w:type="dxa"/>
-            <w:vAlign w:val="top"/>
-          </w:tcPr>
-          <w:p>
-            <w:r>
-              <w:t xml:space="preserve">39</w:t>
-            </w:r>
-          </w:p>
-        </w:tc>
-        <w:tc>
-          <w:tcPr>
-            <w:tcW w:w="4300" w:type="dxa"/>
-            <w:vAlign w:val="top"/>
-          </w:tcPr>
-          <w:p>
-            <w:r>
-              <w:t xml:space="preserve">Production audit confirmed in export/backend/src/routes/notifications.ts: POST /notifications/push-subscribe deletes every other subscription for the user, then performs a separate upsert for the new endpoint. A database failure between those writes removes previously working push subscriptions without restoring them; concurrent replacements can also race.</w:t>
-            </w:r>
-          </w:p>
-        </w:tc>
-        <w:tc>
-          <w:tcPr>
-            <w:tcW w:w="1300" w:type="dxa"/>
-            <w:vAlign w:val="top"/>
-          </w:tcPr>
-          <w:p>
-            <w:r>
-              <w:t xml:space="preserve">pending</w:t>
             </w:r>
           </w:p>
         </w:tc>

</xml_diff>

<commit_message>
Mark next severity three audit issues finished
</commit_message>
<xml_diff>
--- a/output/problem-tracker.docx
+++ b/output/problem-tracker.docx
@@ -3048,7 +3048,7 @@
           </w:tcPr>
           <w:p>
             <w:r>
-              <w:t xml:space="preserve">pending</w:t>
+              <w:t xml:space="preserve">finished</w:t>
             </w:r>
           </w:p>
         </w:tc>
@@ -3070,7 +3070,7 @@
           </w:tcPr>
           <w:p>
             <w:r>
-              <w:t xml:space="preserve">Consume the reset token with an atomic conditional UPDATE/transaction that requires the still-present token and expiry, return success only when one request claims it, and add concurrent reset-link tests.</w:t>
+              <w:t xml:space="preserve">Finished: reset-pin now atomically claims the still-valid token, so only one concurrent request can update the PIN.</w:t>
             </w:r>
           </w:p>
         </w:tc>
@@ -3105,7 +3105,7 @@
           </w:tcPr>
           <w:p>
             <w:r>
-              <w:t xml:space="preserve">pending</w:t>
+              <w:t xml:space="preserve">finished</w:t>
             </w:r>
           </w:p>
         </w:tc>
@@ -3127,7 +3127,7 @@
           </w:tcPr>
           <w:p>
             <w:r>
-              <w:t xml:space="preserve">Require an idempotency key or deterministic source-event fingerprint for Apple webhook writes, claim it atomically before insertion, and add retry/lost-response tests that prove one purchase creates one transaction.</w:t>
+              <w:t xml:space="preserve">Finished: Apple webhook now requires an Idempotency-Key and atomically deduplicates retries per user.</w:t>
             </w:r>
           </w:p>
         </w:tc>
@@ -3162,7 +3162,7 @@
           </w:tcPr>
           <w:p>
             <w:r>
-              <w:t xml:space="preserve">pending</w:t>
+              <w:t xml:space="preserve">finished</w:t>
             </w:r>
           </w:p>
         </w:tc>
@@ -3184,7 +3184,7 @@
           </w:tcPr>
           <w:p>
             <w:r>
-              <w:t xml:space="preserve">When transactionId is provided, require ownership by the caller (or an explicitly permitted household rule), reject missing/deleted/foreign transactions, and add cross-user and household authorization tests.</w:t>
+              <w:t xml:space="preserve">Finished: goal contributions now validate linked transaction ownership or same-household authorization before insertion.</w:t>
             </w:r>
           </w:p>
         </w:tc>

</xml_diff>

<commit_message>
Add shared request timeouts
</commit_message>
<xml_diff>
--- a/output/problem-tracker.docx
+++ b/output/problem-tracker.docx
@@ -357,7 +357,7 @@
           </w:tcPr>
           <w:p>
             <w:r>
-              <w:t xml:space="preserve">pending</w:t>
+              <w:t xml:space="preserve">finished</w:t>
             </w:r>
           </w:p>
         </w:tc>
@@ -379,7 +379,7 @@
           </w:tcPr>
           <w:p>
             <w:r>
-              <w:t xml:space="preserve">Design one shared timeout/cancellation policy for interactive requests and queue replay, preserving upload-specific limits; test network hangs, retries, and loading-state release.</w:t>
+              <w:t xml:space="preserve">Finished: shared API and offline replay requests now abort after 15 seconds, while receipt uploads retain a 60-second limit and caller cancellation.</w:t>
             </w:r>
           </w:p>
         </w:tc>

</xml_diff>

<commit_message>
Make Great Larder transfers atomic
</commit_message>
<xml_diff>
--- a/output/problem-tracker.docx
+++ b/output/problem-tracker.docx
@@ -1098,7 +1098,7 @@
           </w:tcPr>
           <w:p>
             <w:r>
-              <w:t xml:space="preserve">pending</w:t>
+              <w:t xml:space="preserve">finished</w:t>
             </w:r>
           </w:p>
         </w:tc>
@@ -1120,7 +1120,7 @@
           </w:tcPr>
           <w:p>
             <w:r>
-              <w:t xml:space="preserve">Perform the balance validation and both ledger inserts in one database transaction with concurrency-safe locking/conditional checks; test mid-transaction failure and simultaneous sends.</w:t>
+              <w:t xml:space="preserve">Finished: Great Larder transfers now lock the sender balance and commit the personal debit plus household credit atomically.</w:t>
             </w:r>
           </w:p>
         </w:tc>

</xml_diff>

<commit_message>
Secure goal contribution deletion
</commit_message>
<xml_diff>
--- a/output/problem-tracker.docx
+++ b/output/problem-tracker.docx
@@ -1155,7 +1155,7 @@
           </w:tcPr>
           <w:p>
             <w:r>
-              <w:t xml:space="preserve">pending</w:t>
+              <w:t xml:space="preserve">finished</w:t>
             </w:r>
           </w:p>
         </w:tc>
@@ -1177,7 +1177,7 @@
           </w:tcPr>
           <w:p>
             <w:r>
-              <w:t xml:space="preserve">Require an ownership or explicit household-authorization predicate in the delete query, and perform deletion plus goal-state/activity recalculation in one authorized transaction; add cross-user and household authorization tests.</w:t>
+              <w:t xml:space="preserve">Finished: goal-contribution deletion now requires contributor ownership or current household membership, and deletion plus goal-state/activity recalculation is atomic.</w:t>
             </w:r>
           </w:p>
         </w:tc>

</xml_diff>

<commit_message>
Atomically apply recurring payments
</commit_message>
<xml_diff>
--- a/output/problem-tracker.docx
+++ b/output/problem-tracker.docx
@@ -1281,7 +1281,7 @@
           </w:tcPr>
           <w:p>
             <w:r>
-              <w:t xml:space="preserve">pending</w:t>
+              <w:t xml:space="preserve">finished</w:t>
             </w:r>
           </w:p>
         </w:tc>
@@ -1303,7 +1303,7 @@
           </w:tcPr>
           <w:p>
             <w:r>
-              <w:t xml:space="preserve">Wrap transaction creation, unique monthly-log claim, and optional Larder credit in one transaction; treat a lost log claim as a no-op with rollback, and add concurrent-apply and mid-write failure tests.</w:t>
+              <w:t xml:space="preserve">Finished: personal and household recurring-payment application now claims the monthly log and writes the transaction plus optional Larder credit in one atomic transaction; concurrent losers are no-ops and failures roll back all writes.</w:t>
             </w:r>
           </w:p>
         </w:tc>

</xml_diff>

<commit_message>
Make currency conversion atomic
</commit_message>
<xml_diff>
--- a/output/problem-tracker.docx
+++ b/output/problem-tracker.docx
@@ -1338,7 +1338,7 @@
           </w:tcPr>
           <w:p>
             <w:r>
-              <w:t xml:space="preserve">pending</w:t>
+              <w:t xml:space="preserve">finished</w:t>
             </w:r>
           </w:p>
         </w:tc>
@@ -1360,7 +1360,7 @@
           </w:tcPr>
           <w:p>
             <w:r>
-              <w:t xml:space="preserve">Fetch and validate all rates before writing, then perform every related update in one database transaction with a clear retry/idempotency policy; add failure-injection tests at each write phase.</w:t>
+              <w:t xml:space="preserve">Finished: currency conversion now validates rates before any writes and updates all related transaction, category, recurring-payment, user, and household budget records inside one atomic transaction. Conversion retries are idempotent after commit, and failed transactions roll back together.</w:t>
             </w:r>
           </w:p>
         </w:tc>

</xml_diff>

<commit_message>
Make goal saves atomic
</commit_message>
<xml_diff>
--- a/output/problem-tracker.docx
+++ b/output/problem-tracker.docx
@@ -1395,7 +1395,7 @@
           </w:tcPr>
           <w:p>
             <w:r>
-              <w:t xml:space="preserve">pending</w:t>
+              <w:t xml:space="preserve">finished</w:t>
             </w:r>
           </w:p>
         </w:tc>
@@ -1417,7 +1417,7 @@
           </w:tcPr>
           <w:p>
             <w:r>
-              <w:t xml:space="preserve">Move validation and both ledger writes into one database transaction with concurrency-safe contribution checks; add mid-write failure, concurrent save, and balance-conservation tests.</w:t>
+              <w:t xml:space="preserve">Finished: save-from-goal now locks the goal and validates the remaining contributor balance inside one transaction, then writes the negative goal contribution and positive Larder credit atomically. Failed writes roll back together, competing saves serialize safely, and regression tests cover failure, concurrency, and conservation.</w:t>
             </w:r>
           </w:p>
         </w:tc>

</xml_diff>

<commit_message>
Update API schemas and refactor HomeSpending page logic
Replit-Commit-Author: Agent
</commit_message>
<xml_diff>
--- a/output/problem-tracker.docx
+++ b/output/problem-tracker.docx
@@ -3333,7 +3333,7 @@
           </w:tcPr>
           <w:p>
             <w:r>
-              <w:t xml:space="preserve">pending</w:t>
+              <w:t xml:space="preserve">finished</w:t>
             </w:r>
           </w:p>
         </w:tc>
@@ -3355,7 +3355,7 @@
           </w:tcPr>
           <w:p>
             <w:r>
-              <w:t xml:space="preserve">Make Great Larder fund/spend transaction and ledger writes atomic, validate category ownership, and claim the selected bucket/currency balance under a transaction/row lock or equivalent conditional update; add failure and concurrent-spend tests.</w:t>
+              <w:t xml:space="preserve">Finished: Great Larder fund/spend now write the transaction and ledger entry in one database transaction; category IDs are validated against the caller; spending locks the household row while checking the selected bucket/currency balance, preventing concurrent overdrafts. Added rollback, category-ownership, and concurrent-spend regression tests.</w:t>
             </w:r>
           </w:p>
         </w:tc>

</xml_diff>

<commit_message>
Finish atomic transaction dedication flow
</commit_message>
<xml_diff>
--- a/output/problem-tracker.docx
+++ b/output/problem-tracker.docx
@@ -1840,18 +1840,18 @@
           </w:tcPr>
           <w:p>
             <w:r>
-              <w:t xml:space="preserve">Production audit confirmed in export/frontend/src/pages/HomeSpending.tsx:851-927, 1488-1510, and 1515-1558: creating or editing a transaction with a goal/Larder dedication runs syncGoalContribution after the transaction mutation. The helper deletes all linked goal contributions and prior transaction-dedication Larder entries before creating the replacement. If any later fetch, delete, conversion, or create request fails, the transaction remains saved but the prior dedication has already been removed; the edit dialog is already closed and the async callback has no rollback or user-facing recovery.</w:t>
-            </w:r>
-          </w:p>
-        </w:tc>
-        <w:tc>
-          <w:tcPr>
-            <w:tcW w:w="1300" w:type="dxa"/>
-            <w:vAlign w:val="top"/>
-          </w:tcPr>
-          <w:p>
-            <w:r>
-              <w:t xml:space="preserve">pending</w:t>
+              <w:t xml:space="preserve">finished</w:t>
+            </w:r>
+          </w:p>
+        </w:tc>
+        <w:tc>
+          <w:tcPr>
+            <w:tcW w:w="1300" w:type="dxa"/>
+            <w:vAlign w:val="top"/>
+          </w:tcPr>
+          <w:p>
+            <w:r>
+              <w:t xml:space="preserve">finished</w:t>
             </w:r>
           </w:p>
         </w:tc>
@@ -1873,7 +1873,7 @@
           </w:tcPr>
           <w:p>
             <w:r>
-              <w:t xml:space="preserve">Move dedication replacement into an atomic backend operation or implement a durable compensating workflow that creates/validates the replacement before deleting the old records; keep the editor open or show a retryable error until synchronization succeeds, and test failures at every delete/create step.</w:t>
+              <w:t xml:space="preserve">Finished: transaction creation and edits now send goal/Larder allocation in the same atomic backend transaction as the transaction write; replacement failures roll back, and the editor remains open for retry. The frontend allocation path now compiles and passes production build checks.</w:t>
             </w:r>
           </w:p>
         </w:tc>

</xml_diff>

<commit_message>
Make personal Larder spending atomic
</commit_message>
<xml_diff>
--- a/output/problem-tracker.docx
+++ b/output/problem-tracker.docx
@@ -2649,7 +2649,7 @@
           </w:tcPr>
           <w:p>
             <w:r>
-              <w:t xml:space="preserve">pending</w:t>
+              <w:t xml:space="preserve">finished</w:t>
             </w:r>
           </w:p>
         </w:tc>
@@ -2671,7 +2671,7 @@
           </w:tcPr>
           <w:p>
             <w:r>
-              <w:t xml:space="preserve">Wrap the transaction insert and Larder deduction in one database transaction, with the balance validation and returned-row checks inside the same atomic operation; add mid-write failure and conservation-of-funds tests.</w:t>
+              <w:t xml:space="preserve">Finished: personal Larder spending now validates the selected asset and writes the From Larder transaction plus deduction in one atomic database transaction; missing returned rows and deduction failures roll back the complete operation. Added regression coverage for success and mid-write failure.</w:t>
             </w:r>
           </w:p>
         </w:tc>

</xml_diff>

<commit_message>
Prevent concurrent personal Larder overdrafts
</commit_message>
<xml_diff>
--- a/output/problem-tracker.docx
+++ b/output/problem-tracker.docx
@@ -2706,7 +2706,7 @@
           </w:tcPr>
           <w:p>
             <w:r>
-              <w:t xml:space="preserve">pending</w:t>
+              <w:t xml:space="preserve">finished</w:t>
             </w:r>
           </w:p>
         </w:tc>
@@ -2728,7 +2728,7 @@
           </w:tcPr>
           <w:p>
             <w:r>
-              <w:t xml:space="preserve">Move balance validation and deduction into one concurrency-safe database transaction, using locking or an atomic conditional ledger check; add simultaneous-spend and insufficient-after-race tests.</w:t>
+              <w:t xml:space="preserve">Finished: personal Larder spends now lock the stable user row before reading balances, so concurrent requests serialize and re-check the selected asset after the earlier spend commits. Added simultaneous-spend and insufficient-after-race regression tests.</w:t>
             </w:r>
           </w:p>
         </w:tc>

</xml_diff>

<commit_message>
Make household deletion atomic
</commit_message>
<xml_diff>
--- a/output/problem-tracker.docx
+++ b/output/problem-tracker.docx
@@ -2877,7 +2877,7 @@
           </w:tcPr>
           <w:p>
             <w:r>
-              <w:t xml:space="preserve">pending</w:t>
+              <w:t xml:space="preserve">finished</w:t>
             </w:r>
           </w:p>
         </w:tc>
@@ -2899,7 +2899,7 @@
           </w:tcPr>
           <w:p>
             <w:r>
-              <w:t xml:space="preserve">Wrap household deletion and all dependent cleanup in one transaction, use set-based updates where possible, and add failure-injection tests for each write boundary plus a retry/idempotency test.</w:t>
+              <w:t xml:space="preserve">Finished: household deletion now locks and revalidates the head membership, clears all member household links and household category links with set-based updates, removes memberships, and deletes the household inside one database transaction. Added failure-injection coverage for every cleanup write and retry coverage after a failed attempt.</w:t>
             </w:r>
           </w:p>
         </w:tc>

</xml_diff>

<commit_message>
Make account deletion scheduling atomic
</commit_message>
<xml_diff>
--- a/output/problem-tracker.docx
+++ b/output/problem-tracker.docx
@@ -2991,7 +2991,7 @@
           </ns0:tcPr>
           <ns0:p>
             <ns0:r>
-              <ns0:t xml:space="preserve">pending</ns0:t>
+              <ns0:t xml:space="preserve">finished</ns0:t>
             </ns0:r>
           </ns0:p>
         </ns0:tc>
@@ -3013,7 +3013,7 @@
           </ns0:tcPr>
           <ns0:p>
             <ns0:r>
-              <ns0:t xml:space="preserve">Make account-deletion scheduling and all required household state changes one atomic transaction; move best-effort notifications/push delivery after commit, and add failure-injection tests proving no head transfer survives a failed deletion request.</ns0:t>
+              <ns0:t xml:space="preserve">Finished: account-deletion scheduling now commits together with any household head transfer and recurring-payment ownership change; notification-center and push delivery run after commit as best-effort work. Added failure-injection, retry, and notification-failure regression coverage.</ns0:t>
             </ns0:r>
           </ns0:p>
         </ns0:tc>

</xml_diff>

<commit_message>
Update frontend and backend logic and add problem tracker assets
Replit-Commit-Author: Agent
</commit_message>
<xml_diff>
--- a/output/problem-tracker.docx
+++ b/output/problem-tracker.docx
@@ -3470,6 +3470,348 @@
           <w:p>
             <w:r>
               <w:t xml:space="preserve">Finished: Larder dedication now authorizes personal goals by owner and household goals by household membership before any deduction.</w:t>
+            </w:r>
+          </w:p>
+        </w:tc>
+      </w:tr>
+      <w:tr>
+        <w:tc>
+          <w:tcPr>
+            <w:tcW w:w="650" w:type="dxa"/>
+            <w:vAlign w:val="top"/>
+          </w:tcPr>
+          <w:p>
+            <w:r>
+              <w:t xml:space="preserve">61</w:t>
+            </w:r>
+          </w:p>
+        </w:tc>
+        <w:tc>
+          <w:tcPr>
+            <w:tcW w:w="4300" w:type="dxa"/>
+            <w:vAlign w:val="top"/>
+          </w:tcPr>
+          <w:p>
+            <w:r>
+              <w:t xml:space="preserve">Production audit confirmed duplicate transaction creation in export/frontend/src/pages/HomeSpending.tsx:1515-1550 and export/frontend/src/pages/Transactions.tsx:885-925. Add Transaction submission awaits buildAtomicAllocation or fetchRates before calling create.mutate, while the form remains enabled because create.isPending is still false. A rapid double-tap or repeated submit queues multiple identical POST /transactions requests; when goal/Larder allocation is selected, the same financial allocation can be applied more than once. This can create duplicate transaction records and duplicate goal/Larder effects.</w:t>
+            </w:r>
+          </w:p>
+        </w:tc>
+        <w:tc>
+          <w:tcPr>
+            <w:tcW w:w="1300" w:type="dxa"/>
+            <w:vAlign w:val="top"/>
+          </w:tcPr>
+          <w:p>
+            <w:r>
+              <w:t xml:space="preserve">pending</w:t>
+            </w:r>
+          </w:p>
+        </w:tc>
+        <w:tc>
+          <w:tcPr>
+            <w:tcW w:w="850" w:type="dxa"/>
+            <w:vAlign w:val="top"/>
+          </w:tcPr>
+          <w:p>
+            <w:r>
+              <w:t xml:space="preserve">3</w:t>
+            </w:r>
+          </w:p>
+        </w:tc>
+        <w:tc>
+          <w:tcPr>
+            <w:tcW w:w="2100" w:type="dxa"/>
+            <w:vAlign w:val="top"/>
+          </w:tcPr>
+          <w:p>
+            <w:r>
+              <w:t xml:space="preserve">Add a synchronous submission guard/ref that covers the entire async preparation phase, disable the form immediately, and release it on preparation or mutation failure/success; add rapid-repeat regression tests for both HomeSpending and Transactions flows.</w:t>
+            </w:r>
+          </w:p>
+        </w:tc>
+      </w:tr>
+      <w:tr>
+        <w:tc>
+          <w:tcPr>
+            <w:tcW w:w="650" w:type="dxa"/>
+            <w:vAlign w:val="top"/>
+          </w:tcPr>
+          <w:p>
+            <w:r>
+              <w:t xml:space="preserve">62</w:t>
+            </w:r>
+          </w:p>
+        </w:tc>
+        <w:tc>
+          <w:tcPr>
+            <w:tcW w:w="4300" w:type="dxa"/>
+            <w:vAlign w:val="top"/>
+          </w:tcPr>
+          <w:p>
+            <w:r>
+              <w:t xml:space="preserve">Production audit confirmed duplicate transaction edit submissions in export/frontend/src/pages/HomeSpending.tsx:1553-1601 and the edit dialog at 2493-2505. handleUpdate awaits buildAtomicAllocation before update.mutate; update.isPending therefore remains false and the form stays enabled during preparation. Home Spending has no synchronous saving ref, so a rapid repeated submit can send multiple PATCH requests for the same transaction. Each request is atomic, but the requests race as last-write-wins and repeat allocation replacement work, leaving the editor/cache dependent on whichever response finishes last. The Transactions page has a separate synchronous guard and is not affected by this finding.</w:t>
+            </w:r>
+          </w:p>
+        </w:tc>
+        <w:tc>
+          <w:tcPr>
+            <w:tcW w:w="1300" w:type="dxa"/>
+            <w:vAlign w:val="top"/>
+          </w:tcPr>
+          <w:p>
+            <w:r>
+              <w:t xml:space="preserve">pending</w:t>
+            </w:r>
+          </w:p>
+        </w:tc>
+        <w:tc>
+          <w:tcPr>
+            <w:tcW w:w="850" w:type="dxa"/>
+            <w:vAlign w:val="top"/>
+          </w:tcPr>
+          <w:p>
+            <w:r>
+              <w:t xml:space="preserve">2</w:t>
+            </w:r>
+          </w:p>
+        </w:tc>
+        <w:tc>
+          <w:tcPr>
+            <w:tcW w:w="2100" w:type="dxa"/>
+            <w:vAlign w:val="top"/>
+          </w:tcPr>
+          <w:p>
+            <w:r>
+              <w:t xml:space="preserve">Add a synchronous edit-submission guard covering allocation preparation, disable the Home Spending editor immediately, and release it on preparation or mutation completion/failure; add a rapid-repeat edit regression test.</w:t>
+            </w:r>
+          </w:p>
+        </w:tc>
+      </w:tr>
+      <w:tr>
+        <w:tc>
+          <w:tcPr>
+            <w:tcW w:w="650" w:type="dxa"/>
+            <w:vAlign w:val="top"/>
+          </w:tcPr>
+          <w:p>
+            <w:r>
+              <w:t xml:space="preserve">63</w:t>
+            </w:r>
+          </w:p>
+        </w:tc>
+        <w:tc>
+          <w:tcPr>
+            <w:tcW w:w="4300" w:type="dxa"/>
+            <w:vAlign w:val="top"/>
+          </w:tcPr>
+          <w:p>
+            <w:r>
+              <w:t xml:space="preserve">Production audit confirmed concurrent split acceptance loses part of the issuer deduction in export/backend/src/routes/splits.ts:210-248 and 270-307. Each accept request reads the original transaction and calculates newIssuerAmt before its transaction. The transaction conditionally claims only that recipient split row; it does not lock/re-read the parent transaction before updating it. If two recipients accept separate rows concurrently, both can calculate from the same issuer amount (for example, both set 500 minus 100 to 400), both recipient transactions are credited, but the issuer is debited only once instead of twice. The split-row guard prevents duplicate acceptance of one row but not this sibling race.</w:t>
+            </w:r>
+          </w:p>
+        </w:tc>
+        <w:tc>
+          <w:tcPr>
+            <w:tcW w:w="1300" w:type="dxa"/>
+            <w:vAlign w:val="top"/>
+          </w:tcPr>
+          <w:p>
+            <w:r>
+              <w:t xml:space="preserve">pending</w:t>
+            </w:r>
+          </w:p>
+        </w:tc>
+        <w:tc>
+          <w:tcPr>
+            <w:tcW w:w="850" w:type="dxa"/>
+            <w:vAlign w:val="top"/>
+          </w:tcPr>
+          <w:p>
+            <w:r>
+              <w:t xml:space="preserve">3</w:t>
+            </w:r>
+          </w:p>
+        </w:tc>
+        <w:tc>
+          <w:tcPr>
+            <w:tcW w:w="2100" w:type="dxa"/>
+            <w:vAlign w:val="top"/>
+          </w:tcPr>
+          <w:p>
+            <w:r>
+              <w:t xml:space="preserve">Lock and re-read the parent transaction inside the acceptance transaction, derive the new issuer amount from the current row, and update/delete it conditionally; add concurrent sibling-accept tests covering partial and 100% total splits.</w:t>
+            </w:r>
+          </w:p>
+        </w:tc>
+      </w:tr>
+      <w:tr>
+        <w:tc>
+          <w:tcPr>
+            <w:tcW w:w="650" w:type="dxa"/>
+            <w:vAlign w:val="top"/>
+          </w:tcPr>
+          <w:p>
+            <w:r>
+              <w:t xml:space="preserve">64</w:t>
+            </w:r>
+          </w:p>
+        </w:tc>
+        <w:tc>
+          <w:tcPr>
+            <w:tcW w:w="4300" w:type="dxa"/>
+            <w:vAlign w:val="top"/>
+          </w:tcPr>
+          <w:p>
+            <w:r>
+              <w:t xml:space="preserve">Production audit confirmed post-response rejection in export/backend/src/routes/splits.ts:378-399 and 469-490. Split accept and decline send a successful JSON response, then await getUnreadNotificationCount() without a catch. If the notification-count query fails after the split action has committed, Express receives a rejected async handler after headers are sent, logs an unhandled request error, and cannot provide a meaningful response; the user has already been told the action succeeded. The push promise is caught, but the badge-count lookup is not.</w:t>
+            </w:r>
+          </w:p>
+        </w:tc>
+        <w:tc>
+          <w:tcPr>
+            <w:tcW w:w="1300" w:type="dxa"/>
+            <w:vAlign w:val="top"/>
+          </w:tcPr>
+          <w:p>
+            <w:r>
+              <w:t xml:space="preserve">pending</w:t>
+            </w:r>
+          </w:p>
+        </w:tc>
+        <w:tc>
+          <w:tcPr>
+            <w:tcW w:w="850" w:type="dxa"/>
+            <w:vAlign w:val="top"/>
+          </w:tcPr>
+          <w:p>
+            <w:r>
+              <w:t xml:space="preserve">1</w:t>
+            </w:r>
+          </w:p>
+        </w:tc>
+        <w:tc>
+          <w:tcPr>
+            <w:tcW w:w="2100" w:type="dxa"/>
+            <w:vAlign w:val="top"/>
+          </w:tcPr>
+          <w:p>
+            <w:r>
+              <w:t xml:space="preserve">Wrap the post-response badge lookup in a catch or move it to explicitly best-effort background work; keep push delivery non-blocking and add a notification-count failure regression test for accept and decline.</w:t>
+            </w:r>
+          </w:p>
+        </w:tc>
+      </w:tr>
+      <w:tr>
+        <w:tc>
+          <w:tcPr>
+            <w:tcW w:w="650" w:type="dxa"/>
+            <w:vAlign w:val="top"/>
+          </w:tcPr>
+          <w:p>
+            <w:r>
+              <w:t xml:space="preserve">65</w:t>
+            </w:r>
+          </w:p>
+        </w:tc>
+        <w:tc>
+          <w:tcPr>
+            <w:tcW w:w="4300" w:type="dxa"/>
+            <w:vAlign w:val="top"/>
+          </w:tcPr>
+          <w:p>
+            <w:r>
+              <w:t xml:space="preserve">Production audit confirmed an unnecessary rate-service dependency in export/backend/src/routes/splits.ts:55-69 and 221-255. The incoming-split list fetches exchange rates whenever pending rows exist, and split acceptance awaits fetchRates before determining whether issuerCurrency and recipientCurrency are equal. In same-currency cases computeRecipientAmount returns the raw amount and no rate is needed, but all providers are still tried sequentially (up to roughly 20 seconds with the configured 5-second provider timeouts). During that time the pending list or accept action is blocked; a rate outage makes a normal same-currency household action feel frozen even though conversion is unnecessary.</w:t>
+            </w:r>
+          </w:p>
+        </w:tc>
+        <w:tc>
+          <w:tcPr>
+            <w:tcW w:w="1300" w:type="dxa"/>
+            <w:vAlign w:val="top"/>
+          </w:tcPr>
+          <w:p>
+            <w:r>
+              <w:t xml:space="preserve">pending</w:t>
+            </w:r>
+          </w:p>
+        </w:tc>
+        <w:tc>
+          <w:tcPr>
+            <w:tcW w:w="850" w:type="dxa"/>
+            <w:vAlign w:val="top"/>
+          </w:tcPr>
+          <w:p>
+            <w:r>
+              <w:t xml:space="preserve">2</w:t>
+            </w:r>
+          </w:p>
+        </w:tc>
+        <w:tc>
+          <w:tcPr>
+            <w:tcW w:w="2100" w:type="dxa"/>
+            <w:vAlign w:val="top"/>
+          </w:tcPr>
+          <w:p>
+            <w:r>
+              <w:t xml:space="preserve">Determine whether conversion is needed before fetching rates; skip the external call for same-currency rows and only fetch for cross-currency rows, with a bounded fallback policy for the remaining cases. Add same-currency outage/timeout tests for list and accept.</w:t>
+            </w:r>
+          </w:p>
+        </w:tc>
+      </w:tr>
+      <w:tr>
+        <w:tc>
+          <w:tcPr>
+            <w:tcW w:w="650" w:type="dxa"/>
+            <w:vAlign w:val="top"/>
+          </w:tcPr>
+          <w:p>
+            <w:r>
+              <w:t xml:space="preserve">66</w:t>
+            </w:r>
+          </w:p>
+        </w:tc>
+        <w:tc>
+          <w:tcPr>
+            <w:tcW w:w="4300" w:type="dxa"/>
+            <w:vAlign w:val="top"/>
+          </w:tcPr>
+          <w:p>
+            <w:r>
+              <w:t xml:space="preserve">Production audit confirmed transaction deletion leaves receipt files orphaned in export/backend/src/routes/transactions.ts:986-1013. DELETE /transactions/:id removes goal contributions, recurring-payment logs, and the transaction row inside a database transaction, but it never selects or deletes transactionReceiptsTable rows explicitly for object cleanup and never calls ObjectStorageService.deleteObjectEntity for canonical receipt URLs or legacy receiptImage/receiptImages URLs. The foreign-key cascade removes receipt metadata, while uploaded Supabase objects remain indefinitely. Deleting the transaction therefore does not fully delete attached user data and can accumulate inaccessible storage objects.</w:t>
+            </w:r>
+          </w:p>
+        </w:tc>
+        <w:tc>
+          <w:tcPr>
+            <w:tcW w:w="1300" w:type="dxa"/>
+            <w:vAlign w:val="top"/>
+          </w:tcPr>
+          <w:p>
+            <w:r>
+              <w:t xml:space="preserve">pending</w:t>
+            </w:r>
+          </w:p>
+        </w:tc>
+        <w:tc>
+          <w:tcPr>
+            <w:tcW w:w="850" w:type="dxa"/>
+            <w:vAlign w:val="top"/>
+          </w:tcPr>
+          <w:p>
+            <w:r>
+              <w:t xml:space="preserve">2</w:t>
+            </w:r>
+          </w:p>
+        </w:tc>
+        <w:tc>
+          <w:tcPr>
+            <w:tcW w:w="2100" w:type="dxa"/>
+            <w:vAlign w:val="top"/>
+          </w:tcPr>
+          <w:p>
+            <w:r>
+              <w:t xml:space="preserve">Collect canonical and legacy receipt URLs before the transaction, delete database rows atomically with the transaction, and perform best-effort object cleanup after commit with retry/observability; add deletion tests for canonical, legacy, and missing-storage cases.</w:t>
             </w:r>
           </w:p>
         </w:tc>

</xml_diff>